<commit_message>
Refine neural network implementation
</commit_message>
<xml_diff>
--- a/Курсовая.docx
+++ b/Курсовая.docx
@@ -1,6 +1,6 @@
 
 <file path=word/document.xml><?xml version="1.0" encoding="utf-8"?>
-<w:document xmlns:wpc="http://schemas.microsoft.com/office/word/2010/wordprocessingCanvas" xmlns:cx="http://schemas.microsoft.com/office/drawing/2014/chartex" xmlns:cx1="http://schemas.microsoft.com/office/drawing/2015/9/8/chartex" xmlns:cx2="http://schemas.microsoft.com/office/drawing/2015/10/21/chartex" xmlns:cx3="http://schemas.microsoft.com/office/drawing/2016/5/9/chartex" xmlns:cx4="http://schemas.microsoft.com/office/drawing/2016/5/10/chartex" xmlns:cx5="http://schemas.microsoft.com/office/drawing/2016/5/11/chartex" xmlns:cx6="http://schemas.microsoft.com/office/drawing/2016/5/12/chartex" xmlns:cx7="http://schemas.microsoft.com/office/drawing/2016/5/13/chartex" xmlns:cx8="http://schemas.microsoft.com/office/drawing/2016/5/14/chartex" xmlns:mc="http://schemas.openxmlformats.org/markup-compatibility/2006" xmlns:aink="http://schemas.microsoft.com/office/drawing/2016/ink" xmlns:am3d="http://schemas.microsoft.com/office/drawing/2017/model3d" xmlns:o="urn:schemas-microsoft-com:office:office" xmlns:oel="http://schemas.microsoft.com/office/2019/extlst" xmlns:r="http://schemas.openxmlformats.org/officeDocument/2006/relationships" xmlns:m="http://schemas.openxmlformats.org/officeDocument/2006/math" xmlns:v="urn:schemas-microsoft-com:vml" xmlns:wp14="http://schemas.microsoft.com/office/word/2010/wordprocessingDrawing" xmlns:wp="http://schemas.openxmlformats.org/drawingml/2006/wordprocessingDrawing" xmlns:w10="urn:schemas-microsoft-com:office:word" xmlns:w="http://schemas.openxmlformats.org/wordprocessingml/2006/main" xmlns:w14="http://schemas.microsoft.com/office/word/2010/wordml" xmlns:w15="http://schemas.microsoft.com/office/word/2012/wordml" xmlns:w16cex="http://schemas.microsoft.com/office/word/2018/wordml/cex" xmlns:w16cid="http://schemas.microsoft.com/office/word/2016/wordml/cid" xmlns:w16="http://schemas.microsoft.com/office/word/2018/wordml" xmlns:w16sdtdh="http://schemas.microsoft.com/office/word/2020/wordml/sdtdatahash" xmlns:w16se="http://schemas.microsoft.com/office/word/2015/wordml/symex" xmlns:wpg="http://schemas.microsoft.com/office/word/2010/wordprocessingGroup" xmlns:wpi="http://schemas.microsoft.com/office/word/2010/wordprocessingInk" xmlns:wne="http://schemas.microsoft.com/office/word/2006/wordml" xmlns:wps="http://schemas.microsoft.com/office/word/2010/wordprocessingShape" mc:Ignorable="w14 w15 w16se w16cid w16 w16cex w16sdtdh wp14">
+<w:document xmlns:wpc="http://schemas.microsoft.com/office/word/2010/wordprocessingCanvas" xmlns:mc="http://schemas.openxmlformats.org/markup-compatibility/2006" xmlns:o="urn:schemas-microsoft-com:office:office" xmlns:r="http://schemas.openxmlformats.org/officeDocument/2006/relationships" xmlns:m="http://schemas.openxmlformats.org/officeDocument/2006/math" xmlns:v="urn:schemas-microsoft-com:vml" xmlns:wp14="http://schemas.microsoft.com/office/word/2010/wordprocessingDrawing" xmlns:wp="http://schemas.openxmlformats.org/drawingml/2006/wordprocessingDrawing" xmlns:w10="urn:schemas-microsoft-com:office:word" xmlns:w="http://schemas.openxmlformats.org/wordprocessingml/2006/main" xmlns:w14="http://schemas.microsoft.com/office/word/2010/wordml" xmlns:w15="http://schemas.microsoft.com/office/word/2012/wordml" xmlns:wpg="http://schemas.microsoft.com/office/word/2010/wordprocessingGroup" xmlns:wpi="http://schemas.microsoft.com/office/word/2010/wordprocessingInk" xmlns:wne="http://schemas.microsoft.com/office/word/2006/wordml" xmlns:wps="http://schemas.microsoft.com/office/word/2010/wordprocessingShape" mc:Ignorable="w14 w15 wp14">
   <w:body>
     <w:p>
       <w:pPr>
@@ -771,7 +771,6 @@
           <w:rFonts w:ascii="Times New Roman" w:hAnsi="Times New Roman" w:cs="Times New Roman"/>
           <w:sz w:val="28"/>
           <w:szCs w:val="28"/>
-          <w:lang w:val="en-US"/>
         </w:rPr>
       </w:pPr>
       <w:r>
@@ -787,7 +786,6 @@
           <w:rFonts w:ascii="Times New Roman" w:hAnsi="Times New Roman" w:cs="Times New Roman"/>
           <w:sz w:val="28"/>
           <w:szCs w:val="28"/>
-          <w:lang w:val="en-US"/>
         </w:rPr>
         <w:t>«___»</w:t>
       </w:r>
@@ -796,7 +794,6 @@
           <w:rFonts w:ascii="Times New Roman" w:hAnsi="Times New Roman" w:cs="Times New Roman"/>
           <w:sz w:val="28"/>
           <w:szCs w:val="28"/>
-          <w:lang w:val="en-US"/>
         </w:rPr>
         <w:t xml:space="preserve"> </w:t>
       </w:r>
@@ -805,7 +802,6 @@
           <w:rFonts w:ascii="Times New Roman" w:hAnsi="Times New Roman" w:cs="Times New Roman"/>
           <w:sz w:val="28"/>
           <w:szCs w:val="28"/>
-          <w:lang w:val="en-US"/>
         </w:rPr>
         <w:t>___________20</w:t>
       </w:r>
@@ -814,7 +810,6 @@
           <w:rFonts w:ascii="Times New Roman" w:hAnsi="Times New Roman" w:cs="Times New Roman"/>
           <w:sz w:val="28"/>
           <w:szCs w:val="28"/>
-          <w:lang w:val="en-US"/>
         </w:rPr>
         <w:t>22</w:t>
       </w:r>
@@ -831,7 +826,6 @@
           <w:rFonts w:ascii="Times New Roman" w:hAnsi="Times New Roman" w:cs="Times New Roman"/>
           <w:sz w:val="28"/>
           <w:szCs w:val="28"/>
-          <w:lang w:val="en-US"/>
         </w:rPr>
         <w:t>.</w:t>
       </w:r>
@@ -845,7 +839,6 @@
           <w:rFonts w:ascii="Times New Roman" w:hAnsi="Times New Roman" w:cs="Times New Roman"/>
           <w:sz w:val="28"/>
           <w:szCs w:val="28"/>
-          <w:lang w:val="en-US"/>
         </w:rPr>
       </w:pPr>
     </w:p>
@@ -858,7 +851,6 @@
           <w:rFonts w:ascii="Times New Roman" w:hAnsi="Times New Roman" w:cs="Times New Roman"/>
           <w:sz w:val="28"/>
           <w:szCs w:val="28"/>
-          <w:lang w:val="en-US"/>
         </w:rPr>
       </w:pPr>
     </w:p>
@@ -871,7 +863,6 @@
           <w:rFonts w:ascii="Times New Roman" w:hAnsi="Times New Roman" w:cs="Times New Roman"/>
           <w:sz w:val="28"/>
           <w:szCs w:val="28"/>
-          <w:lang w:val="en-US"/>
         </w:rPr>
       </w:pPr>
       <w:r>
@@ -887,7 +878,6 @@
           <w:rFonts w:ascii="Times New Roman" w:hAnsi="Times New Roman" w:cs="Times New Roman"/>
           <w:sz w:val="28"/>
           <w:szCs w:val="28"/>
-          <w:lang w:val="en-US"/>
         </w:rPr>
         <w:t xml:space="preserve"> 2022</w:t>
       </w:r>
@@ -924,12 +914,12 @@
       <w:sdtContent>
         <w:p>
           <w:pPr>
-            <w:pStyle w:val="TOCHeading"/>
+            <w:pStyle w:val="a3"/>
             <w:rPr>
               <w:rFonts w:cstheme="majorHAnsi"/>
               <w:b/>
               <w:bCs/>
-              <w:color w:val="242424" w:themeColor="text1" w:themeShade="80"/>
+              <w:color w:val="000000" w:themeColor="text1" w:themeShade="80"/>
             </w:rPr>
           </w:pPr>
           <w:r>
@@ -937,14 +927,14 @@
               <w:rFonts w:cstheme="majorHAnsi"/>
               <w:b/>
               <w:bCs/>
-              <w:color w:val="242424" w:themeColor="text1" w:themeShade="80"/>
+              <w:color w:val="000000" w:themeColor="text1" w:themeShade="80"/>
             </w:rPr>
             <w:t>Содержание</w:t>
           </w:r>
         </w:p>
         <w:p>
           <w:pPr>
-            <w:pStyle w:val="TOC1"/>
+            <w:pStyle w:val="11"/>
             <w:rPr>
               <w:rFonts w:asciiTheme="majorHAnsi" w:hAnsiTheme="majorHAnsi" w:cstheme="majorHAnsi"/>
               <w:b w:val="0"/>
@@ -994,7 +984,7 @@
         </w:p>
         <w:p>
           <w:pPr>
-            <w:pStyle w:val="TOC1"/>
+            <w:pStyle w:val="11"/>
             <w:rPr>
               <w:rFonts w:asciiTheme="majorHAnsi" w:hAnsiTheme="majorHAnsi" w:cstheme="majorHAnsi"/>
               <w:b w:val="0"/>
@@ -1044,7 +1034,7 @@
         </w:p>
         <w:p>
           <w:pPr>
-            <w:pStyle w:val="TOC2"/>
+            <w:pStyle w:val="2"/>
             <w:rPr>
               <w:rFonts w:asciiTheme="majorHAnsi" w:hAnsiTheme="majorHAnsi" w:cstheme="majorHAnsi"/>
               <w:b w:val="0"/>
@@ -1086,7 +1076,7 @@
         </w:p>
         <w:p>
           <w:pPr>
-            <w:pStyle w:val="TOC2"/>
+            <w:pStyle w:val="2"/>
             <w:rPr>
               <w:rFonts w:asciiTheme="majorHAnsi" w:hAnsiTheme="majorHAnsi" w:cstheme="majorHAnsi"/>
               <w:b w:val="0"/>
@@ -1103,17 +1093,7 @@
               <w:sz w:val="28"/>
               <w:szCs w:val="28"/>
             </w:rPr>
-            <w:t>Выбор методов и алгоритмов. Варианты активационных функций</w:t>
-          </w:r>
-          <w:r>
-            <w:rPr>
-              <w:rFonts w:asciiTheme="majorHAnsi" w:hAnsiTheme="majorHAnsi" w:cstheme="majorHAnsi"/>
-              <w:b w:val="0"/>
-              <w:bCs w:val="0"/>
-              <w:sz w:val="28"/>
-              <w:szCs w:val="28"/>
-            </w:rPr>
-            <w:t xml:space="preserve"> </w:t>
+            <w:t xml:space="preserve">Выбор методов и алгоритмов. Варианты активационных функций </w:t>
           </w:r>
           <w:r>
             <w:rPr>
@@ -1138,7 +1118,7 @@
         </w:p>
         <w:p>
           <w:pPr>
-            <w:pStyle w:val="TOC2"/>
+            <w:pStyle w:val="2"/>
             <w:rPr>
               <w:rFonts w:asciiTheme="majorHAnsi" w:hAnsiTheme="majorHAnsi" w:cstheme="majorHAnsi"/>
               <w:b w:val="0"/>
@@ -1155,17 +1135,7 @@
               <w:sz w:val="28"/>
               <w:szCs w:val="28"/>
             </w:rPr>
-            <w:t>Активационная функция</w:t>
-          </w:r>
-          <w:r>
-            <w:rPr>
-              <w:rFonts w:asciiTheme="majorHAnsi" w:hAnsiTheme="majorHAnsi" w:cstheme="majorHAnsi"/>
-              <w:b w:val="0"/>
-              <w:bCs w:val="0"/>
-              <w:sz w:val="28"/>
-              <w:szCs w:val="28"/>
-            </w:rPr>
-            <w:t xml:space="preserve"> </w:t>
+            <w:t xml:space="preserve">Активационная функция </w:t>
           </w:r>
           <w:r>
             <w:rPr>
@@ -1208,7 +1178,7 @@
         </w:p>
         <w:p>
           <w:pPr>
-            <w:pStyle w:val="TOC3"/>
+            <w:pStyle w:val="31"/>
             <w:ind w:left="0"/>
             <w:rPr>
               <w:lang w:val="en-US"/>
@@ -1570,7 +1540,6 @@
         <w:spacing w:after="0"/>
         <w:contextualSpacing/>
         <w:rPr>
-          <w:b/>
           <w:bCs/>
           <w:lang w:val="en-US"/>
         </w:rPr>
@@ -1578,100 +1547,14 @@
     </w:p>
     <w:p>
       <w:pPr>
-        <w:spacing w:after="0"/>
-        <w:contextualSpacing/>
-        <w:rPr>
+        <w:pStyle w:val="1"/>
+        <w:spacing w:before="0"/>
+        <w:contextualSpacing/>
+        <w:jc w:val="center"/>
+        <w:rPr>
+          <w:rFonts w:ascii="Times New Roman" w:hAnsi="Times New Roman" w:cs="Times New Roman"/>
           <w:b/>
-          <w:bCs/>
-          <w:lang w:val="en-US"/>
-        </w:rPr>
-      </w:pPr>
-    </w:p>
-    <w:p>
-      <w:pPr>
-        <w:spacing w:after="0"/>
-        <w:contextualSpacing/>
-        <w:rPr>
-          <w:b/>
-          <w:bCs/>
-          <w:lang w:val="en-US"/>
-        </w:rPr>
-      </w:pPr>
-    </w:p>
-    <w:p>
-      <w:pPr>
-        <w:spacing w:after="0"/>
-        <w:contextualSpacing/>
-        <w:rPr>
-          <w:b/>
-          <w:bCs/>
-          <w:lang w:val="en-US"/>
-        </w:rPr>
-      </w:pPr>
-    </w:p>
-    <w:p>
-      <w:pPr>
-        <w:spacing w:after="0"/>
-        <w:contextualSpacing/>
-        <w:rPr>
-          <w:b/>
-          <w:bCs/>
-          <w:lang w:val="en-US"/>
-        </w:rPr>
-      </w:pPr>
-    </w:p>
-    <w:p>
-      <w:pPr>
-        <w:spacing w:after="0"/>
-        <w:contextualSpacing/>
-        <w:rPr>
-          <w:b/>
-          <w:bCs/>
-          <w:lang w:val="en-US"/>
-        </w:rPr>
-      </w:pPr>
-    </w:p>
-    <w:p>
-      <w:pPr>
-        <w:spacing w:after="0"/>
-        <w:contextualSpacing/>
-        <w:rPr>
-          <w:b/>
-          <w:bCs/>
-          <w:lang w:val="en-US"/>
-        </w:rPr>
-      </w:pPr>
-    </w:p>
-    <w:p>
-      <w:pPr>
-        <w:spacing w:after="0"/>
-        <w:contextualSpacing/>
-        <w:rPr>
-          <w:bCs/>
-          <w:lang w:val="en-US"/>
-        </w:rPr>
-      </w:pPr>
-    </w:p>
-    <w:p>
-      <w:pPr>
-        <w:spacing w:after="0"/>
-        <w:contextualSpacing/>
-        <w:rPr>
-          <w:bCs/>
-          <w:lang w:val="en-US"/>
-        </w:rPr>
-      </w:pPr>
-    </w:p>
-    <w:p>
-      <w:pPr>
-        <w:pStyle w:val="Heading1"/>
-        <w:spacing w:before="0"/>
-        <w:contextualSpacing/>
-        <w:jc w:val="center"/>
-        <w:rPr>
-          <w:rFonts w:ascii="Times New Roman" w:hAnsi="Times New Roman" w:cs="Times New Roman"/>
-          <w:b/>
-          <w:color w:val="171719" w:themeColor="background1" w:themeShade="1A"/>
+          <w:color w:val="1A1A1A" w:themeColor="background1" w:themeShade="1A"/>
         </w:rPr>
       </w:pPr>
       <w:bookmarkStart w:id="0" w:name="_Toc121431332"/>
@@ -1680,8 +1563,9 @@
         <w:rPr>
           <w:rFonts w:ascii="Times New Roman" w:hAnsi="Times New Roman" w:cs="Times New Roman"/>
           <w:b/>
-          <w:color w:val="171719" w:themeColor="background1" w:themeShade="1A"/>
-        </w:rPr>
+          <w:color w:val="1A1A1A" w:themeColor="background1" w:themeShade="1A"/>
+        </w:rPr>
+        <w:lastRenderedPageBreak/>
         <w:t>Введение</w:t>
       </w:r>
       <w:bookmarkEnd w:id="0"/>
@@ -1979,7 +1863,7 @@
     </w:p>
     <w:p>
       <w:pPr>
-        <w:pStyle w:val="ListParagraph"/>
+        <w:pStyle w:val="a7"/>
         <w:numPr>
           <w:ilvl w:val="0"/>
           <w:numId w:val="5"/>
@@ -2011,7 +1895,7 @@
     </w:p>
     <w:p>
       <w:pPr>
-        <w:pStyle w:val="ListParagraph"/>
+        <w:pStyle w:val="a7"/>
         <w:numPr>
           <w:ilvl w:val="0"/>
           <w:numId w:val="5"/>
@@ -2035,7 +1919,7 @@
     </w:p>
     <w:p>
       <w:pPr>
-        <w:pStyle w:val="ListParagraph"/>
+        <w:pStyle w:val="a7"/>
         <w:numPr>
           <w:ilvl w:val="0"/>
           <w:numId w:val="5"/>
@@ -2059,7 +1943,7 @@
     </w:p>
     <w:p>
       <w:pPr>
-        <w:pStyle w:val="ListParagraph"/>
+        <w:pStyle w:val="a7"/>
         <w:numPr>
           <w:ilvl w:val="0"/>
           <w:numId w:val="5"/>
@@ -2078,7 +1962,6 @@
           <w:sz w:val="28"/>
           <w:szCs w:val="28"/>
         </w:rPr>
-        <w:lastRenderedPageBreak/>
         <w:t xml:space="preserve">Обученной сети подаётся на вход курс за сегодня, вчера, позавчера и получается ответ на завтра. </w:t>
       </w:r>
     </w:p>
@@ -2100,7 +1983,16 @@
           <w:sz w:val="28"/>
           <w:szCs w:val="28"/>
         </w:rPr>
-        <w:t>В этом случае сеть выведет зависимость одного параметра от трёх предыдущих. Если желательно учитывать ещё какой-то параметр (например, общий индекс по отрасли), то его надо добавить, как вход (и включить в примеры), переобучить сеть и получить новые результаты. Для наиболее точного обучения стоит использовать метод ОРО, как наиболее предсказуемый и несложный в реализации.</w:t>
+        <w:t xml:space="preserve">В этом случае сеть выведет зависимость одного параметра от трёх предыдущих. Если желательно учитывать ещё какой-то параметр (например, общий индекс по отрасли), то его надо добавить, как вход (и включить в примеры), переобучить сеть и получить новые результаты. Для </w:t>
+      </w:r>
+      <w:r>
+        <w:rPr>
+          <w:rFonts w:ascii="Times New Roman" w:hAnsi="Times New Roman" w:cs="Times New Roman"/>
+          <w:sz w:val="28"/>
+          <w:szCs w:val="28"/>
+        </w:rPr>
+        <w:lastRenderedPageBreak/>
+        <w:t>наиболее точного обучения стоит использовать метод ОРО, как наиболее предсказуемый и несложный в реализации.</w:t>
       </w:r>
     </w:p>
     <w:p>
@@ -2187,7 +2079,7 @@
     </w:p>
     <w:p>
       <w:pPr>
-        <w:pStyle w:val="ListParagraph"/>
+        <w:pStyle w:val="a7"/>
         <w:numPr>
           <w:ilvl w:val="0"/>
           <w:numId w:val="4"/>
@@ -2211,7 +2103,7 @@
     </w:p>
     <w:p>
       <w:pPr>
-        <w:pStyle w:val="ListParagraph"/>
+        <w:pStyle w:val="a7"/>
         <w:numPr>
           <w:ilvl w:val="0"/>
           <w:numId w:val="4"/>
@@ -2235,7 +2127,7 @@
     </w:p>
     <w:p>
       <w:pPr>
-        <w:pStyle w:val="ListParagraph"/>
+        <w:pStyle w:val="a7"/>
         <w:numPr>
           <w:ilvl w:val="0"/>
           <w:numId w:val="4"/>
@@ -2446,7 +2338,62 @@
     </w:p>
     <w:p>
       <w:pPr>
-        <w:pStyle w:val="Heading1"/>
+        <w:spacing w:after="0" w:line="300" w:lineRule="auto"/>
+        <w:contextualSpacing/>
+        <w:rPr>
+          <w:rFonts w:ascii="Times New Roman" w:hAnsi="Times New Roman" w:cs="Times New Roman"/>
+          <w:sz w:val="28"/>
+          <w:szCs w:val="28"/>
+        </w:rPr>
+      </w:pPr>
+    </w:p>
+    <w:p>
+      <w:pPr>
+        <w:spacing w:after="0" w:line="300" w:lineRule="auto"/>
+        <w:contextualSpacing/>
+        <w:rPr>
+          <w:rFonts w:ascii="Times New Roman" w:hAnsi="Times New Roman" w:cs="Times New Roman"/>
+          <w:sz w:val="28"/>
+          <w:szCs w:val="28"/>
+        </w:rPr>
+      </w:pPr>
+    </w:p>
+    <w:p>
+      <w:pPr>
+        <w:spacing w:after="0" w:line="300" w:lineRule="auto"/>
+        <w:contextualSpacing/>
+        <w:rPr>
+          <w:rFonts w:ascii="Times New Roman" w:hAnsi="Times New Roman" w:cs="Times New Roman"/>
+          <w:sz w:val="28"/>
+          <w:szCs w:val="28"/>
+        </w:rPr>
+      </w:pPr>
+    </w:p>
+    <w:p>
+      <w:pPr>
+        <w:spacing w:after="0" w:line="300" w:lineRule="auto"/>
+        <w:contextualSpacing/>
+        <w:rPr>
+          <w:rFonts w:ascii="Times New Roman" w:hAnsi="Times New Roman" w:cs="Times New Roman"/>
+          <w:sz w:val="28"/>
+          <w:szCs w:val="28"/>
+        </w:rPr>
+      </w:pPr>
+    </w:p>
+    <w:p>
+      <w:pPr>
+        <w:spacing w:after="0" w:line="300" w:lineRule="auto"/>
+        <w:contextualSpacing/>
+        <w:rPr>
+          <w:rFonts w:ascii="Times New Roman" w:hAnsi="Times New Roman" w:cs="Times New Roman"/>
+          <w:sz w:val="28"/>
+          <w:szCs w:val="28"/>
+        </w:rPr>
+      </w:pPr>
+    </w:p>
+    <w:p>
+      <w:pPr>
+        <w:pStyle w:val="1"/>
         <w:numPr>
           <w:ilvl w:val="0"/>
           <w:numId w:val="9"/>
@@ -2457,7 +2404,7 @@
         <w:rPr>
           <w:rFonts w:ascii="Times New Roman" w:hAnsi="Times New Roman" w:cs="Times New Roman"/>
           <w:b/>
-          <w:color w:val="171719" w:themeColor="background1" w:themeShade="1A"/>
+          <w:color w:val="1A1A1A" w:themeColor="background1" w:themeShade="1A"/>
         </w:rPr>
       </w:pPr>
       <w:bookmarkStart w:id="2" w:name="_Toc121930368"/>
@@ -2465,7 +2412,7 @@
         <w:rPr>
           <w:rFonts w:ascii="Times New Roman" w:hAnsi="Times New Roman" w:cs="Times New Roman"/>
           <w:b/>
-          <w:color w:val="171719" w:themeColor="background1" w:themeShade="1A"/>
+          <w:color w:val="1A1A1A" w:themeColor="background1" w:themeShade="1A"/>
         </w:rPr>
         <w:lastRenderedPageBreak/>
         <w:t>Теоре</w:t>
@@ -2474,7 +2421,7 @@
         <w:rPr>
           <w:rFonts w:ascii="Times New Roman" w:hAnsi="Times New Roman" w:cs="Times New Roman"/>
           <w:b/>
-          <w:color w:val="171719" w:themeColor="background1" w:themeShade="1A"/>
+          <w:color w:val="1A1A1A" w:themeColor="background1" w:themeShade="1A"/>
         </w:rPr>
         <w:t>тическая основа курсовой работы</w:t>
       </w:r>
@@ -2487,7 +2434,7 @@
         <w:rPr>
           <w:rFonts w:ascii="Times New Roman" w:hAnsi="Times New Roman" w:cs="Times New Roman"/>
           <w:b/>
-          <w:color w:val="171719" w:themeColor="background1" w:themeShade="1A"/>
+          <w:color w:val="1A1A1A" w:themeColor="background1" w:themeShade="1A"/>
           <w:sz w:val="28"/>
         </w:rPr>
       </w:pPr>
@@ -2495,7 +2442,7 @@
         <w:rPr>
           <w:rFonts w:ascii="Times New Roman" w:hAnsi="Times New Roman" w:cs="Times New Roman"/>
           <w:b/>
-          <w:color w:val="171719" w:themeColor="background1" w:themeShade="1A"/>
+          <w:color w:val="1A1A1A" w:themeColor="background1" w:themeShade="1A"/>
           <w:sz w:val="28"/>
         </w:rPr>
         <w:t xml:space="preserve">1.1 </w:t>
@@ -2504,7 +2451,7 @@
         <w:rPr>
           <w:rFonts w:ascii="Times New Roman" w:hAnsi="Times New Roman" w:cs="Times New Roman"/>
           <w:b/>
-          <w:color w:val="171719" w:themeColor="background1" w:themeShade="1A"/>
+          <w:color w:val="1A1A1A" w:themeColor="background1" w:themeShade="1A"/>
           <w:sz w:val="28"/>
         </w:rPr>
         <w:t>Теория о всех вариантов алгоритмов: нейросети</w:t>
@@ -2512,34 +2459,34 @@
     </w:p>
     <w:p>
       <w:pPr>
-        <w:pStyle w:val="ListParagraph"/>
+        <w:pStyle w:val="a7"/>
         <w:spacing w:after="0"/>
         <w:ind w:left="0"/>
         <w:jc w:val="both"/>
         <w:rPr>
           <w:rFonts w:ascii="Times New Roman" w:hAnsi="Times New Roman" w:cs="Times New Roman"/>
           <w:b/>
-          <w:color w:val="171719" w:themeColor="background1" w:themeShade="1A"/>
-          <w:sz w:val="28"/>
-        </w:rPr>
-      </w:pPr>
-    </w:p>
-    <w:p>
-      <w:pPr>
-        <w:pStyle w:val="ListParagraph"/>
+          <w:color w:val="1A1A1A" w:themeColor="background1" w:themeShade="1A"/>
+          <w:sz w:val="28"/>
+        </w:rPr>
+      </w:pPr>
+    </w:p>
+    <w:p>
+      <w:pPr>
+        <w:pStyle w:val="a7"/>
         <w:spacing w:after="0" w:line="300" w:lineRule="auto"/>
         <w:ind w:left="0" w:firstLine="708"/>
         <w:jc w:val="both"/>
         <w:rPr>
           <w:rFonts w:ascii="Times New Roman" w:hAnsi="Times New Roman" w:cs="Times New Roman"/>
-          <w:color w:val="171719" w:themeColor="background1" w:themeShade="1A"/>
-          <w:sz w:val="28"/>
-        </w:rPr>
-      </w:pPr>
-      <w:r>
-        <w:rPr>
-          <w:rFonts w:ascii="Times New Roman" w:hAnsi="Times New Roman" w:cs="Times New Roman"/>
-          <w:color w:val="171719" w:themeColor="background1" w:themeShade="1A"/>
+          <w:color w:val="1A1A1A" w:themeColor="background1" w:themeShade="1A"/>
+          <w:sz w:val="28"/>
+        </w:rPr>
+      </w:pPr>
+      <w:r>
+        <w:rPr>
+          <w:rFonts w:ascii="Times New Roman" w:hAnsi="Times New Roman" w:cs="Times New Roman"/>
+          <w:color w:val="1A1A1A" w:themeColor="background1" w:themeShade="1A"/>
           <w:sz w:val="28"/>
         </w:rPr>
         <w:t>Нейронная сеть</w:t>
@@ -2547,7 +2494,7 @@
       <w:r>
         <w:rPr>
           <w:rFonts w:ascii="Times New Roman" w:hAnsi="Times New Roman" w:cs="Times New Roman"/>
-          <w:color w:val="171719" w:themeColor="background1" w:themeShade="1A"/>
+          <w:color w:val="1A1A1A" w:themeColor="background1" w:themeShade="1A"/>
           <w:sz w:val="28"/>
         </w:rPr>
         <w:t xml:space="preserve"> (также искусственная нейронная сеть, ИНС) — математическая модель, а также её программное или аппаратное воплощение, построенная по принципу организации и функционирования биологических нейронных сетей — сетей нервных клеток живого организма. Это понятие возникло при изучении процессов, протекающих в мозге, и при попытке смоделировать эти процессы. Первой такой </w:t>
@@ -2555,7 +2502,7 @@
       <w:r>
         <w:rPr>
           <w:rFonts w:ascii="Times New Roman" w:hAnsi="Times New Roman" w:cs="Times New Roman"/>
-          <w:color w:val="171719" w:themeColor="background1" w:themeShade="1A"/>
+          <w:color w:val="1A1A1A" w:themeColor="background1" w:themeShade="1A"/>
           <w:sz w:val="28"/>
         </w:rPr>
         <w:t>попыткой были нейронные сети У.</w:t>
@@ -2563,7 +2510,7 @@
       <w:r>
         <w:rPr>
           <w:rFonts w:ascii="Times New Roman" w:hAnsi="Times New Roman" w:cs="Times New Roman"/>
-          <w:color w:val="171719" w:themeColor="background1" w:themeShade="1A"/>
+          <w:color w:val="1A1A1A" w:themeColor="background1" w:themeShade="1A"/>
           <w:sz w:val="28"/>
         </w:rPr>
         <w:t xml:space="preserve"> Маккалока и У. Питтса. После разработки алгоритмов обучения получаемые модели стали использовать в практических целях: в задачах прогнозирования, для распознавания образов, в задачах управления и др.</w:t>
@@ -2571,23 +2518,21 @@
     </w:p>
     <w:p>
       <w:pPr>
-        <w:pStyle w:val="ListParagraph"/>
+        <w:pStyle w:val="a7"/>
         <w:spacing w:after="0" w:line="300" w:lineRule="auto"/>
         <w:ind w:left="0" w:firstLine="708"/>
         <w:jc w:val="both"/>
         <w:rPr>
           <w:rFonts w:ascii="Times New Roman" w:hAnsi="Times New Roman" w:cs="Times New Roman"/>
-          <w:color w:val="171719" w:themeColor="background1" w:themeShade="1A"/>
-          <w:sz w:val="28"/>
-          <w:lang w:val="en-RU"/>
-        </w:rPr>
-      </w:pPr>
-      <w:r>
-        <w:rPr>
-          <w:rFonts w:ascii="Times New Roman" w:hAnsi="Times New Roman" w:cs="Times New Roman"/>
-          <w:color w:val="171719" w:themeColor="background1" w:themeShade="1A"/>
-          <w:sz w:val="28"/>
-          <w:lang w:val="en-RU"/>
+          <w:color w:val="1A1A1A" w:themeColor="background1" w:themeShade="1A"/>
+          <w:sz w:val="28"/>
+        </w:rPr>
+      </w:pPr>
+      <w:r>
+        <w:rPr>
+          <w:rFonts w:ascii="Times New Roman" w:hAnsi="Times New Roman" w:cs="Times New Roman"/>
+          <w:color w:val="1A1A1A" w:themeColor="background1" w:themeShade="1A"/>
+          <w:sz w:val="28"/>
         </w:rPr>
         <w:t>В качестве образов могут выступать различные по своей природе объекты: символы текста, изображения, образцы звуков и т. д. При обучении сети предлагаются различные образцы образов с указанием того, к какому классу они относятся. Образец, как правило, представляется как вектор значений признаков. При этом совокупность всех признаков должна </w:t>
       </w:r>
@@ -2596,90 +2541,84 @@
           <w:rFonts w:ascii="Times New Roman" w:hAnsi="Times New Roman" w:cs="Times New Roman"/>
           <w:i/>
           <w:iCs/>
-          <w:color w:val="171719" w:themeColor="background1" w:themeShade="1A"/>
-          <w:sz w:val="28"/>
-          <w:lang w:val="en-RU"/>
+          <w:color w:val="1A1A1A" w:themeColor="background1" w:themeShade="1A"/>
+          <w:sz w:val="28"/>
         </w:rPr>
         <w:t>однозначно определять класс</w:t>
       </w:r>
       <w:r>
         <w:rPr>
           <w:rFonts w:ascii="Times New Roman" w:hAnsi="Times New Roman" w:cs="Times New Roman"/>
-          <w:color w:val="171719" w:themeColor="background1" w:themeShade="1A"/>
-          <w:sz w:val="28"/>
-          <w:lang w:val="en-RU"/>
+          <w:color w:val="1A1A1A" w:themeColor="background1" w:themeShade="1A"/>
+          <w:sz w:val="28"/>
         </w:rPr>
         <w:t>, к которому относится образец. В случае, если признаков недостаточно, сеть может соотнести один и тот же образец с несколькими классами, что неверно. По окончании обучения сети ей можно предъявлять неизвестные ранее образы и получать ответ о принадлежности к определённому классу.</w:t>
       </w:r>
     </w:p>
     <w:p>
       <w:pPr>
-        <w:pStyle w:val="ListParagraph"/>
+        <w:pStyle w:val="a7"/>
         <w:spacing w:after="0" w:line="300" w:lineRule="auto"/>
         <w:ind w:left="0" w:firstLine="708"/>
         <w:jc w:val="both"/>
         <w:rPr>
           <w:rFonts w:ascii="Times New Roman" w:hAnsi="Times New Roman" w:cs="Times New Roman"/>
-          <w:color w:val="171719" w:themeColor="background1" w:themeShade="1A"/>
-          <w:sz w:val="28"/>
-          <w:lang w:val="en-RU"/>
-        </w:rPr>
-      </w:pPr>
-      <w:r>
-        <w:rPr>
-          <w:rFonts w:ascii="Times New Roman" w:hAnsi="Times New Roman" w:cs="Times New Roman"/>
-          <w:color w:val="171719" w:themeColor="background1" w:themeShade="1A"/>
-          <w:sz w:val="28"/>
-          <w:lang w:val="en-RU"/>
+          <w:color w:val="1A1A1A" w:themeColor="background1" w:themeShade="1A"/>
+          <w:sz w:val="28"/>
+        </w:rPr>
+      </w:pPr>
+      <w:r>
+        <w:rPr>
+          <w:rFonts w:ascii="Times New Roman" w:hAnsi="Times New Roman" w:cs="Times New Roman"/>
+          <w:color w:val="1A1A1A" w:themeColor="background1" w:themeShade="1A"/>
+          <w:sz w:val="28"/>
         </w:rPr>
         <w:t>Топология такой сети характеризуется тем, что количество нейронов в выходном слое, как правило, равно количеству определяемых классов. При этом устанавливается соответствие между выходом нейронной сети и классом, который он представляет. Когда сети предъявляется некий образ, на одном из её выходов должен появиться признак того, что образ принадлежит этому классу. В то же время на других выходах должен быть признак того, что образ данному классу не принадлежит. Если на двух или более выходах есть признак принадлежности к классу, считается, что сеть «не уверена» в своём ответе.</w:t>
       </w:r>
     </w:p>
     <w:p>
       <w:pPr>
-        <w:pStyle w:val="ListParagraph"/>
+        <w:pStyle w:val="a7"/>
         <w:spacing w:after="0" w:line="300" w:lineRule="auto"/>
         <w:ind w:left="0" w:firstLine="708"/>
         <w:jc w:val="both"/>
         <w:rPr>
           <w:rFonts w:ascii="Times New Roman" w:hAnsi="Times New Roman" w:cs="Times New Roman"/>
-          <w:color w:val="171719" w:themeColor="background1" w:themeShade="1A"/>
-          <w:sz w:val="28"/>
-          <w:lang w:val="en-RU"/>
-        </w:rPr>
-      </w:pPr>
-    </w:p>
-    <w:p>
-      <w:pPr>
-        <w:pStyle w:val="ListParagraph"/>
+          <w:color w:val="1A1A1A" w:themeColor="background1" w:themeShade="1A"/>
+          <w:sz w:val="28"/>
+        </w:rPr>
+      </w:pPr>
+    </w:p>
+    <w:p>
+      <w:pPr>
+        <w:pStyle w:val="a7"/>
         <w:spacing w:after="0" w:line="300" w:lineRule="auto"/>
         <w:ind w:left="0" w:firstLine="708"/>
         <w:jc w:val="both"/>
         <w:rPr>
           <w:rFonts w:ascii="Times New Roman" w:hAnsi="Times New Roman" w:cs="Times New Roman"/>
-          <w:color w:val="171719" w:themeColor="background1" w:themeShade="1A"/>
-          <w:sz w:val="28"/>
-          <w:lang w:val="en-RU"/>
-        </w:rPr>
-      </w:pPr>
-    </w:p>
-    <w:p>
-      <w:pPr>
-        <w:pStyle w:val="ListParagraph"/>
+          <w:color w:val="1A1A1A" w:themeColor="background1" w:themeShade="1A"/>
+          <w:sz w:val="28"/>
+        </w:rPr>
+      </w:pPr>
+    </w:p>
+    <w:p>
+      <w:pPr>
+        <w:pStyle w:val="a7"/>
         <w:spacing w:after="0"/>
         <w:ind w:left="0"/>
         <w:jc w:val="both"/>
         <w:rPr>
           <w:rFonts w:ascii="Times New Roman" w:hAnsi="Times New Roman" w:cs="Times New Roman"/>
           <w:b/>
-          <w:color w:val="171719" w:themeColor="background1" w:themeShade="1A"/>
-          <w:sz w:val="28"/>
-        </w:rPr>
-      </w:pPr>
-    </w:p>
-    <w:p>
-      <w:pPr>
-        <w:pStyle w:val="ListParagraph"/>
+          <w:color w:val="1A1A1A" w:themeColor="background1" w:themeShade="1A"/>
+          <w:sz w:val="28"/>
+        </w:rPr>
+      </w:pPr>
+    </w:p>
+    <w:p>
+      <w:pPr>
+        <w:pStyle w:val="a7"/>
         <w:numPr>
           <w:ilvl w:val="1"/>
           <w:numId w:val="12"/>
@@ -2689,7 +2628,7 @@
         <w:rPr>
           <w:rFonts w:ascii="Times New Roman" w:hAnsi="Times New Roman" w:cs="Times New Roman"/>
           <w:b/>
-          <w:color w:val="171719" w:themeColor="background1" w:themeShade="1A"/>
+          <w:color w:val="1A1A1A" w:themeColor="background1" w:themeShade="1A"/>
           <w:sz w:val="28"/>
         </w:rPr>
       </w:pPr>
@@ -2697,7 +2636,7 @@
         <w:rPr>
           <w:rFonts w:ascii="Times New Roman" w:hAnsi="Times New Roman" w:cs="Times New Roman"/>
           <w:b/>
-          <w:color w:val="171719" w:themeColor="background1" w:themeShade="1A"/>
+          <w:color w:val="1A1A1A" w:themeColor="background1" w:themeShade="1A"/>
           <w:sz w:val="28"/>
         </w:rPr>
         <w:lastRenderedPageBreak/>
@@ -2707,7 +2646,7 @@
         <w:rPr>
           <w:rFonts w:ascii="Times New Roman" w:hAnsi="Times New Roman" w:cs="Times New Roman"/>
           <w:b/>
-          <w:color w:val="171719" w:themeColor="background1" w:themeShade="1A"/>
+          <w:color w:val="1A1A1A" w:themeColor="background1" w:themeShade="1A"/>
           <w:sz w:val="28"/>
         </w:rPr>
         <w:t xml:space="preserve">Выбор методов и </w:t>
@@ -2716,7 +2655,7 @@
         <w:rPr>
           <w:rFonts w:ascii="Times New Roman" w:hAnsi="Times New Roman" w:cs="Times New Roman"/>
           <w:b/>
-          <w:color w:val="171719" w:themeColor="background1" w:themeShade="1A"/>
+          <w:color w:val="1A1A1A" w:themeColor="background1" w:themeShade="1A"/>
           <w:sz w:val="28"/>
         </w:rPr>
         <w:t>алгоритмов. Варианты активационных функций.</w:t>
@@ -2724,21 +2663,21 @@
     </w:p>
     <w:p>
       <w:pPr>
-        <w:pStyle w:val="ListParagraph"/>
+        <w:pStyle w:val="a7"/>
         <w:spacing w:after="0"/>
         <w:ind w:left="0"/>
         <w:jc w:val="both"/>
         <w:rPr>
           <w:rFonts w:ascii="Times New Roman" w:hAnsi="Times New Roman" w:cs="Times New Roman"/>
           <w:b/>
-          <w:color w:val="171719" w:themeColor="background1" w:themeShade="1A"/>
-          <w:sz w:val="28"/>
-        </w:rPr>
-      </w:pPr>
-    </w:p>
-    <w:p>
-      <w:pPr>
-        <w:pStyle w:val="ListParagraph"/>
+          <w:color w:val="1A1A1A" w:themeColor="background1" w:themeShade="1A"/>
+          <w:sz w:val="28"/>
+        </w:rPr>
+      </w:pPr>
+    </w:p>
+    <w:p>
+      <w:pPr>
+        <w:pStyle w:val="a7"/>
         <w:spacing w:line="300" w:lineRule="auto"/>
         <w:ind w:left="0" w:firstLine="697"/>
         <w:jc w:val="both"/>
@@ -2746,6 +2685,7 @@
       <w:r>
         <w:rPr>
           <w:noProof/>
+          <w:lang w:eastAsia="ru-RU"/>
         </w:rPr>
         <w:drawing>
           <wp:anchor distT="0" distB="0" distL="114300" distR="114300" simplePos="0" relativeHeight="251661312" behindDoc="0" locked="0" layoutInCell="1" allowOverlap="1" wp14:anchorId="41AC548D">
@@ -2813,7 +2753,7 @@
       <w:r>
         <w:rPr>
           <w:rFonts w:ascii="Times New Roman" w:hAnsi="Times New Roman" w:cs="Times New Roman"/>
-          <w:color w:val="171719" w:themeColor="background1" w:themeShade="1A"/>
+          <w:color w:val="1A1A1A" w:themeColor="background1" w:themeShade="1A"/>
           <w:sz w:val="28"/>
         </w:rPr>
         <w:t xml:space="preserve">1) </w:t>
@@ -2821,9 +2761,8 @@
       <w:r>
         <w:rPr>
           <w:rFonts w:ascii="Times New Roman" w:hAnsi="Times New Roman" w:cs="Times New Roman"/>
-          <w:color w:val="171719" w:themeColor="background1" w:themeShade="1A"/>
-          <w:sz w:val="28"/>
-          <w:lang w:val="en-RU"/>
+          <w:color w:val="1A1A1A" w:themeColor="background1" w:themeShade="1A"/>
+          <w:sz w:val="28"/>
         </w:rPr>
         <w:t>Ступенчатая функция (англ. </w:t>
       </w:r>
@@ -2832,18 +2771,16 @@
           <w:rFonts w:ascii="Times New Roman" w:hAnsi="Times New Roman" w:cs="Times New Roman"/>
           <w:i/>
           <w:iCs/>
-          <w:color w:val="171719" w:themeColor="background1" w:themeShade="1A"/>
-          <w:sz w:val="28"/>
-          <w:lang w:val="en-RU"/>
+          <w:color w:val="1A1A1A" w:themeColor="background1" w:themeShade="1A"/>
+          <w:sz w:val="28"/>
         </w:rPr>
         <w:t>binary step function</w:t>
       </w:r>
       <w:r>
         <w:rPr>
           <w:rFonts w:ascii="Times New Roman" w:hAnsi="Times New Roman" w:cs="Times New Roman"/>
-          <w:color w:val="171719" w:themeColor="background1" w:themeShade="1A"/>
-          <w:sz w:val="28"/>
-          <w:lang w:val="en-RU"/>
+          <w:color w:val="1A1A1A" w:themeColor="background1" w:themeShade="1A"/>
+          <w:sz w:val="28"/>
         </w:rPr>
         <w:t>) является пороговой функцией активации. То есть если zz больше или меньше некоторого значения, то нейрон становится активированным. Такая функция отлично работает для бинарной классификации. Но она не работает, когда для классификации требуется большее число нейронов и количество возможных классов больше двух.</w:t>
       </w:r>
@@ -2853,7 +2790,7 @@
     </w:p>
     <w:p>
       <w:pPr>
-        <w:pStyle w:val="ListParagraph"/>
+        <w:pStyle w:val="a7"/>
         <w:spacing w:line="300" w:lineRule="auto"/>
         <w:ind w:left="0" w:firstLine="697"/>
         <w:jc w:val="both"/>
@@ -2861,7 +2798,7 @@
     </w:p>
     <w:p>
       <w:pPr>
-        <w:pStyle w:val="ListParagraph"/>
+        <w:pStyle w:val="a7"/>
         <w:spacing w:line="300" w:lineRule="auto"/>
         <w:ind w:left="0" w:firstLine="697"/>
         <w:jc w:val="both"/>
@@ -2869,7 +2806,7 @@
     </w:p>
     <w:p>
       <w:pPr>
-        <w:pStyle w:val="ListParagraph"/>
+        <w:pStyle w:val="a7"/>
         <w:spacing w:line="300" w:lineRule="auto"/>
         <w:ind w:left="0" w:firstLine="697"/>
         <w:jc w:val="both"/>
@@ -2877,12 +2814,12 @@
           <w:rFonts w:ascii="Times New Roman" w:hAnsi="Times New Roman" w:cs="Times New Roman"/>
           <w:sz w:val="28"/>
           <w:szCs w:val="28"/>
-          <w:lang w:val="en-RU"/>
         </w:rPr>
       </w:pPr>
       <w:r>
         <w:rPr>
           <w:noProof/>
+          <w:lang w:eastAsia="ru-RU"/>
         </w:rPr>
         <w:drawing>
           <wp:anchor distT="0" distB="0" distL="114300" distR="114300" simplePos="0" relativeHeight="251662336" behindDoc="0" locked="0" layoutInCell="1" allowOverlap="1">
@@ -2960,7 +2897,6 @@
           <w:rFonts w:ascii="Times New Roman" w:hAnsi="Times New Roman" w:cs="Times New Roman"/>
           <w:sz w:val="28"/>
           <w:szCs w:val="28"/>
-          <w:lang w:val="en-RU"/>
         </w:rPr>
         <w:t>Линейная функция (англ. </w:t>
       </w:r>
@@ -2971,7 +2907,6 @@
           <w:iCs/>
           <w:sz w:val="28"/>
           <w:szCs w:val="28"/>
-          <w:lang w:val="en-RU"/>
         </w:rPr>
         <w:t>linear function</w:t>
       </w:r>
@@ -2980,14 +2915,13 @@
           <w:rFonts w:ascii="Times New Roman" w:hAnsi="Times New Roman" w:cs="Times New Roman"/>
           <w:sz w:val="28"/>
           <w:szCs w:val="28"/>
-          <w:lang w:val="en-RU"/>
         </w:rPr>
         <w:t>) представляет собой прямую линию, а это значит, что результат этой функции активации пропорционален переданному аргументу. В отличии от предыдущей функции, она позволяет получить диапазон значений на выходе, а не только бинарные 0 и 1, что решает проблему классификации с большим количеством классов.</w:t>
       </w:r>
     </w:p>
     <w:p>
       <w:pPr>
-        <w:pStyle w:val="ListParagraph"/>
+        <w:pStyle w:val="a7"/>
         <w:spacing w:line="300" w:lineRule="auto"/>
         <w:ind w:left="0" w:firstLine="697"/>
         <w:jc w:val="both"/>
@@ -2995,7 +2929,6 @@
           <w:rFonts w:ascii="Times New Roman" w:eastAsiaTheme="minorEastAsia" w:hAnsi="Times New Roman" w:cs="Times New Roman"/>
           <w:sz w:val="28"/>
           <w:szCs w:val="28"/>
-          <w:lang w:val="en-RU"/>
         </w:rPr>
       </w:pPr>
       <m:oMathPara>
@@ -3005,7 +2938,6 @@
               <w:rFonts w:ascii="Cambria Math" w:hAnsi="Cambria Math" w:cs="Times New Roman"/>
               <w:sz w:val="28"/>
               <w:szCs w:val="28"/>
-              <w:lang w:val="en-RU"/>
             </w:rPr>
             <m:t>a</m:t>
           </m:r>
@@ -3017,7 +2949,6 @@
                   <w:i/>
                   <w:sz w:val="28"/>
                   <w:szCs w:val="28"/>
-                  <w:lang w:val="en-RU"/>
                 </w:rPr>
               </m:ctrlPr>
             </m:dPr>
@@ -3027,7 +2958,6 @@
                   <w:rFonts w:ascii="Cambria Math" w:hAnsi="Cambria Math" w:cs="Times New Roman"/>
                   <w:sz w:val="28"/>
                   <w:szCs w:val="28"/>
-                  <w:lang w:val="en-RU"/>
                 </w:rPr>
                 <m:t>x</m:t>
               </m:r>
@@ -3038,7 +2968,6 @@
               <w:rFonts w:ascii="Cambria Math" w:hAnsi="Cambria Math" w:cs="Times New Roman"/>
               <w:sz w:val="28"/>
               <w:szCs w:val="28"/>
-              <w:lang w:val="en-RU"/>
             </w:rPr>
             <m:t>=</m:t>
           </m:r>
@@ -3053,7 +2982,6 @@
                   <w:i/>
                   <w:sz w:val="28"/>
                   <w:szCs w:val="28"/>
-                  <w:lang w:val="en-RU"/>
                 </w:rPr>
               </m:ctrlPr>
             </m:naryPr>
@@ -3063,7 +2991,6 @@
                   <w:rFonts w:ascii="Cambria Math" w:hAnsi="Cambria Math" w:cs="Times New Roman"/>
                   <w:sz w:val="28"/>
                   <w:szCs w:val="28"/>
-                  <w:lang w:val="en-RU"/>
                 </w:rPr>
                 <m:t>i</m:t>
               </m:r>
@@ -3078,7 +3005,6 @@
                       <w:i/>
                       <w:sz w:val="28"/>
                       <w:szCs w:val="28"/>
-                      <w:lang w:val="en-RU"/>
                     </w:rPr>
                   </m:ctrlPr>
                 </m:sSubPr>
@@ -3088,7 +3014,6 @@
                       <w:rFonts w:ascii="Cambria Math" w:hAnsi="Cambria Math" w:cs="Times New Roman"/>
                       <w:sz w:val="28"/>
                       <w:szCs w:val="28"/>
-                      <w:lang w:val="en-RU"/>
                     </w:rPr>
                     <m:t>c</m:t>
                   </m:r>
@@ -3099,7 +3024,6 @@
                       <w:rFonts w:ascii="Cambria Math" w:hAnsi="Cambria Math" w:cs="Times New Roman"/>
                       <w:sz w:val="28"/>
                       <w:szCs w:val="28"/>
-                      <w:lang w:val="en-RU"/>
                     </w:rPr>
                     <m:t>i</m:t>
                   </m:r>
@@ -3113,7 +3037,6 @@
                       <w:i/>
                       <w:sz w:val="28"/>
                       <w:szCs w:val="28"/>
-                      <w:lang w:val="en-RU"/>
                     </w:rPr>
                   </m:ctrlPr>
                 </m:sSubPr>
@@ -3123,7 +3046,6 @@
                       <w:rFonts w:ascii="Cambria Math" w:hAnsi="Cambria Math" w:cs="Times New Roman"/>
                       <w:sz w:val="28"/>
                       <w:szCs w:val="28"/>
-                      <w:lang w:val="en-RU"/>
                     </w:rPr>
                     <m:t>x</m:t>
                   </m:r>
@@ -3134,7 +3056,6 @@
                       <w:rFonts w:ascii="Cambria Math" w:hAnsi="Cambria Math" w:cs="Times New Roman"/>
                       <w:sz w:val="28"/>
                       <w:szCs w:val="28"/>
-                      <w:lang w:val="en-RU"/>
                     </w:rPr>
                     <m:t>i</m:t>
                   </m:r>
@@ -3147,7 +3068,7 @@
     </w:p>
     <w:p>
       <w:pPr>
-        <w:pStyle w:val="ListParagraph"/>
+        <w:pStyle w:val="a7"/>
         <w:spacing w:line="300" w:lineRule="auto"/>
         <w:ind w:left="2832" w:firstLine="708"/>
         <w:rPr>
@@ -3156,7 +3077,6 @@
           <w:iCs/>
           <w:sz w:val="28"/>
           <w:szCs w:val="28"/>
-          <w:lang w:val="en-RU"/>
         </w:rPr>
       </w:pPr>
       <w:r>
@@ -3166,10 +3086,10 @@
           <w:iCs/>
           <w:sz w:val="28"/>
           <w:szCs w:val="28"/>
-          <w:lang w:val="en-US"/>
         </w:rPr>
         <w:t xml:space="preserve">   </w:t>
       </w:r>
+      <w:proofErr w:type="spellStart"/>
       <w:r>
         <w:rPr>
           <w:rFonts w:ascii="Times New Roman" w:hAnsi="Times New Roman" w:cs="Times New Roman"/>
@@ -3177,14 +3097,36 @@
           <w:iCs/>
           <w:sz w:val="28"/>
           <w:szCs w:val="28"/>
-          <w:lang w:val="en-RU"/>
-        </w:rPr>
-        <w:t>linear function</w:t>
-      </w:r>
-    </w:p>
-    <w:p>
-      <w:pPr>
-        <w:pStyle w:val="ListParagraph"/>
+        </w:rPr>
+        <w:t>linear</w:t>
+      </w:r>
+      <w:proofErr w:type="spellEnd"/>
+      <w:r>
+        <w:rPr>
+          <w:rFonts w:ascii="Times New Roman" w:hAnsi="Times New Roman" w:cs="Times New Roman"/>
+          <w:i/>
+          <w:iCs/>
+          <w:sz w:val="28"/>
+          <w:szCs w:val="28"/>
+        </w:rPr>
+        <w:t xml:space="preserve"> </w:t>
+      </w:r>
+      <w:proofErr w:type="spellStart"/>
+      <w:r>
+        <w:rPr>
+          <w:rFonts w:ascii="Times New Roman" w:hAnsi="Times New Roman" w:cs="Times New Roman"/>
+          <w:i/>
+          <w:iCs/>
+          <w:sz w:val="28"/>
+          <w:szCs w:val="28"/>
+        </w:rPr>
+        <w:t>function</w:t>
+      </w:r>
+      <w:proofErr w:type="spellEnd"/>
+    </w:p>
+    <w:p>
+      <w:pPr>
+        <w:pStyle w:val="a7"/>
         <w:spacing w:line="300" w:lineRule="auto"/>
         <w:ind w:left="2832" w:firstLine="708"/>
         <w:rPr>
@@ -3193,13 +3135,12 @@
           <w:iCs/>
           <w:sz w:val="28"/>
           <w:szCs w:val="28"/>
-          <w:lang w:val="en-RU"/>
-        </w:rPr>
-      </w:pPr>
-    </w:p>
-    <w:p>
-      <w:pPr>
-        <w:pStyle w:val="ListParagraph"/>
+        </w:rPr>
+      </w:pPr>
+    </w:p>
+    <w:p>
+      <w:pPr>
+        <w:pStyle w:val="a7"/>
         <w:spacing w:line="300" w:lineRule="auto"/>
         <w:ind w:left="0" w:firstLine="697"/>
         <w:jc w:val="both"/>
@@ -3207,13 +3148,12 @@
           <w:rFonts w:ascii="Times New Roman" w:hAnsi="Times New Roman" w:cs="Times New Roman"/>
           <w:sz w:val="28"/>
           <w:szCs w:val="28"/>
-          <w:lang w:val="en-RU"/>
-        </w:rPr>
-      </w:pPr>
-    </w:p>
-    <w:p>
-      <w:pPr>
-        <w:pStyle w:val="ListParagraph"/>
+        </w:rPr>
+      </w:pPr>
+    </w:p>
+    <w:p>
+      <w:pPr>
+        <w:pStyle w:val="a7"/>
         <w:spacing w:line="300" w:lineRule="auto"/>
         <w:ind w:left="0" w:firstLine="697"/>
         <w:jc w:val="both"/>
@@ -3221,6 +3161,7 @@
       <w:r>
         <w:rPr>
           <w:noProof/>
+          <w:lang w:eastAsia="ru-RU"/>
         </w:rPr>
         <w:lastRenderedPageBreak/>
         <w:drawing>
@@ -3291,16 +3232,8 @@
           <w:rFonts w:ascii="Times New Roman" w:hAnsi="Times New Roman" w:cs="Times New Roman"/>
           <w:sz w:val="28"/>
           <w:szCs w:val="28"/>
-          <w:lang w:val="en-RU"/>
         </w:rPr>
         <w:tab/>
-      </w:r>
-      <w:r>
-        <w:rPr>
-          <w:rFonts w:ascii="Times New Roman" w:hAnsi="Times New Roman" w:cs="Times New Roman"/>
-          <w:sz w:val="28"/>
-          <w:szCs w:val="28"/>
-        </w:rPr>
         <w:t xml:space="preserve">3) </w:t>
       </w:r>
       <w:r>
@@ -3308,7 +3241,6 @@
           <w:rFonts w:ascii="Times New Roman" w:hAnsi="Times New Roman" w:cs="Times New Roman"/>
           <w:sz w:val="28"/>
           <w:szCs w:val="28"/>
-          <w:lang w:val="en-RU"/>
         </w:rPr>
         <w:t>Сигмоидная функция (англ. </w:t>
       </w:r>
@@ -3319,7 +3251,6 @@
           <w:iCs/>
           <w:sz w:val="28"/>
           <w:szCs w:val="28"/>
-          <w:lang w:val="en-RU"/>
         </w:rPr>
         <w:t>sigmoid function</w:t>
       </w:r>
@@ -3328,7 +3259,6 @@
           <w:rFonts w:ascii="Times New Roman" w:hAnsi="Times New Roman" w:cs="Times New Roman"/>
           <w:sz w:val="28"/>
           <w:szCs w:val="28"/>
-          <w:lang w:val="en-RU"/>
         </w:rPr>
         <w:t>), которую также называет логистической (англ. </w:t>
       </w:r>
@@ -3339,7 +3269,6 @@
           <w:iCs/>
           <w:sz w:val="28"/>
           <w:szCs w:val="28"/>
-          <w:lang w:val="en-RU"/>
         </w:rPr>
         <w:t>logistic function</w:t>
       </w:r>
@@ -3348,7 +3277,6 @@
           <w:rFonts w:ascii="Times New Roman" w:hAnsi="Times New Roman" w:cs="Times New Roman"/>
           <w:sz w:val="28"/>
           <w:szCs w:val="28"/>
-          <w:lang w:val="en-RU"/>
         </w:rPr>
         <w:t>), является гладкой монотонно возрастающей нелинейной функцией</w:t>
       </w:r>
@@ -3365,7 +3293,6 @@
           <w:rFonts w:ascii="Times New Roman" w:hAnsi="Times New Roman" w:cs="Times New Roman"/>
           <w:sz w:val="28"/>
           <w:szCs w:val="28"/>
-          <w:lang w:val="en-RU"/>
         </w:rPr>
         <w:t xml:space="preserve"> И так как эта функция нелинейна, то ее можно использовать в нейронных сетях с множеством слоев, а также обучать эти сети методом обратного распространения ошибки. Сигмоида ограничена двумя горизонтальными асимптотами y=1y=1 и y=0y=0, что дает нормализацию выходного значения каждого нейрона. Кроме того, для сигмоидной функции характерен гладкий градиент, который предотвращает "прыжки" при подсчете выходного значения. Помимо всего этого, у этой функции есть еще одно преимущество, для значений x&gt;2x&gt;2 и x&lt;−2x&lt;−2, yy "прижимается" к одной из асимптот, что позволяет делать четкие предсказания классов.</w:t>
       </w:r>
@@ -3375,7 +3302,7 @@
     </w:p>
     <w:p>
       <w:pPr>
-        <w:pStyle w:val="ListParagraph"/>
+        <w:pStyle w:val="a7"/>
         <w:spacing w:line="300" w:lineRule="auto"/>
         <w:ind w:left="0" w:firstLine="697"/>
         <w:jc w:val="both"/>
@@ -3384,7 +3311,6 @@
           <w:i/>
           <w:sz w:val="28"/>
           <w:szCs w:val="28"/>
-          <w:lang w:val="en-RU"/>
         </w:rPr>
       </w:pPr>
       <m:oMathPara>
@@ -3394,7 +3320,6 @@
               <w:rFonts w:ascii="Cambria Math" w:eastAsiaTheme="minorEastAsia" w:hAnsi="Cambria Math"/>
               <w:sz w:val="28"/>
               <w:szCs w:val="28"/>
-              <w:lang w:val="en-RU"/>
             </w:rPr>
             <m:t> σ(z)=</m:t>
           </m:r>
@@ -3406,7 +3331,6 @@
                   <w:i/>
                   <w:sz w:val="28"/>
                   <w:szCs w:val="28"/>
-                  <w:lang w:val="en-RU"/>
                 </w:rPr>
               </m:ctrlPr>
             </m:fPr>
@@ -3416,7 +3340,6 @@
                   <w:rFonts w:ascii="Cambria Math" w:eastAsiaTheme="minorEastAsia" w:hAnsi="Cambria Math"/>
                   <w:sz w:val="28"/>
                   <w:szCs w:val="28"/>
-                  <w:lang w:val="en-RU"/>
                 </w:rPr>
                 <m:t>1</m:t>
               </m:r>
@@ -3427,7 +3350,6 @@
                   <w:rFonts w:ascii="Cambria Math" w:eastAsiaTheme="minorEastAsia" w:hAnsi="Cambria Math"/>
                   <w:sz w:val="28"/>
                   <w:szCs w:val="28"/>
-                  <w:lang w:val="en-RU"/>
                 </w:rPr>
                 <m:t>1+</m:t>
               </m:r>
@@ -3439,7 +3361,6 @@
                       <w:i/>
                       <w:sz w:val="28"/>
                       <w:szCs w:val="28"/>
-                      <w:lang w:val="en-RU"/>
                     </w:rPr>
                   </m:ctrlPr>
                 </m:sSupPr>
@@ -3449,7 +3370,6 @@
                       <w:rFonts w:ascii="Cambria Math" w:eastAsiaTheme="minorEastAsia" w:hAnsi="Cambria Math"/>
                       <w:sz w:val="28"/>
                       <w:szCs w:val="28"/>
-                      <w:lang w:val="en-RU"/>
                     </w:rPr>
                     <m:t>e</m:t>
                   </m:r>
@@ -3460,7 +3380,6 @@
                       <w:rFonts w:ascii="Cambria Math" w:eastAsiaTheme="minorEastAsia" w:hAnsi="Cambria Math"/>
                       <w:sz w:val="28"/>
                       <w:szCs w:val="28"/>
-                      <w:lang w:val="en-RU"/>
                     </w:rPr>
                     <m:t>-z</m:t>
                   </m:r>
@@ -3473,7 +3392,7 @@
     </w:p>
     <w:p>
       <w:pPr>
-        <w:pStyle w:val="ListParagraph"/>
+        <w:pStyle w:val="a7"/>
         <w:spacing w:line="300" w:lineRule="auto"/>
         <w:ind w:left="2124" w:firstLine="708"/>
         <w:rPr>
@@ -3482,7 +3401,6 @@
           <w:iCs/>
           <w:sz w:val="28"/>
           <w:szCs w:val="28"/>
-          <w:lang w:val="en-RU"/>
         </w:rPr>
       </w:pPr>
       <w:r>
@@ -3492,7 +3410,6 @@
           <w:iCs/>
           <w:sz w:val="28"/>
           <w:szCs w:val="28"/>
-          <w:lang w:val="en-RU"/>
         </w:rPr>
         <w:t xml:space="preserve">          </w:t>
       </w:r>
@@ -3503,25 +3420,23 @@
           <w:iCs/>
           <w:sz w:val="28"/>
           <w:szCs w:val="28"/>
-          <w:lang w:val="en-RU"/>
         </w:rPr>
         <w:t>sigmoid function</w:t>
       </w:r>
     </w:p>
     <w:p>
       <w:pPr>
-        <w:pStyle w:val="ListParagraph"/>
+        <w:pStyle w:val="a7"/>
         <w:spacing w:line="300" w:lineRule="auto"/>
         <w:ind w:left="2124" w:firstLine="708"/>
         <w:rPr>
           <w:i/>
-          <w:lang w:val="en-RU"/>
-        </w:rPr>
-      </w:pPr>
-    </w:p>
-    <w:p>
-      <w:pPr>
-        <w:pStyle w:val="ListParagraph"/>
+        </w:rPr>
+      </w:pPr>
+    </w:p>
+    <w:p>
+      <w:pPr>
+        <w:pStyle w:val="a7"/>
         <w:spacing w:line="300" w:lineRule="auto"/>
         <w:ind w:left="0" w:firstLine="697"/>
         <w:jc w:val="both"/>
@@ -3529,28 +3444,21 @@
           <w:rFonts w:ascii="Times New Roman" w:hAnsi="Times New Roman" w:cs="Times New Roman"/>
           <w:sz w:val="28"/>
           <w:szCs w:val="28"/>
-          <w:lang w:val="en-RU"/>
         </w:rPr>
       </w:pPr>
       <w:r>
         <w:fldChar w:fldCharType="begin"/>
       </w:r>
       <w:r>
-        <w:rPr>
-          <w:lang w:val="en-RU"/>
-        </w:rPr>
         <w:instrText xml:space="preserve"> INCLUDEPICTURE "/Users/Noah Dylan Pelegrini/Library/Group Containers/UBF8T346G9.ms/WebArchiveCopyPasteTempFiles/com.microsoft.Word/200px-SigmoidFunction.jpg" \* MERGEFORMATINET </w:instrText>
       </w:r>
       <w:r>
-        <w:fldChar w:fldCharType="separate"/>
-      </w:r>
-      <w:r>
         <w:fldChar w:fldCharType="end"/>
       </w:r>
     </w:p>
     <w:p>
       <w:pPr>
-        <w:pStyle w:val="ListParagraph"/>
+        <w:pStyle w:val="a7"/>
         <w:spacing w:line="300" w:lineRule="auto"/>
         <w:ind w:left="0" w:firstLine="697"/>
         <w:jc w:val="both"/>
@@ -3558,12 +3466,12 @@
           <w:rFonts w:ascii="Times New Roman" w:hAnsi="Times New Roman" w:cs="Times New Roman"/>
           <w:sz w:val="28"/>
           <w:szCs w:val="28"/>
-          <w:lang w:val="en-RU"/>
         </w:rPr>
       </w:pPr>
       <w:r>
         <w:rPr>
           <w:noProof/>
+          <w:lang w:eastAsia="ru-RU"/>
         </w:rPr>
         <w:drawing>
           <wp:anchor distT="0" distB="0" distL="114300" distR="114300" simplePos="0" relativeHeight="251664384" behindDoc="0" locked="0" layoutInCell="1" allowOverlap="1">
@@ -3633,18 +3541,8 @@
           <w:rFonts w:ascii="Times New Roman" w:hAnsi="Times New Roman" w:cs="Times New Roman"/>
           <w:sz w:val="28"/>
           <w:szCs w:val="28"/>
-          <w:lang w:val="en-RU"/>
-        </w:rPr>
-        <w:t xml:space="preserve">4) </w:t>
-      </w:r>
-      <w:r>
-        <w:rPr>
-          <w:rFonts w:ascii="Times New Roman" w:hAnsi="Times New Roman" w:cs="Times New Roman"/>
-          <w:sz w:val="28"/>
-          <w:szCs w:val="28"/>
-          <w:lang w:val="en-RU"/>
-        </w:rPr>
-        <w:t>Функция гиперболического тангенса (англ. </w:t>
+        </w:rPr>
+        <w:t>4) Функция гиперболического тангенса (англ. </w:t>
       </w:r>
       <w:r>
         <w:rPr>
@@ -3653,7 +3551,6 @@
           <w:iCs/>
           <w:sz w:val="28"/>
           <w:szCs w:val="28"/>
-          <w:lang w:val="en-RU"/>
         </w:rPr>
         <w:t>hyperbolic tangent</w:t>
       </w:r>
@@ -3662,7 +3559,6 @@
           <w:rFonts w:ascii="Times New Roman" w:hAnsi="Times New Roman" w:cs="Times New Roman"/>
           <w:sz w:val="28"/>
           <w:szCs w:val="28"/>
-          <w:lang w:val="en-RU"/>
         </w:rPr>
         <w:t>).</w:t>
       </w:r>
@@ -3671,7 +3567,6 @@
           <w:rFonts w:ascii="Times New Roman" w:hAnsi="Times New Roman" w:cs="Times New Roman"/>
           <w:sz w:val="28"/>
           <w:szCs w:val="28"/>
-          <w:lang w:val="en-RU"/>
         </w:rPr>
         <w:t xml:space="preserve"> Эта функция является скорректированной</w:t>
       </w:r>
@@ -3688,14 +3583,13 @@
           <w:rFonts w:ascii="Times New Roman" w:hAnsi="Times New Roman" w:cs="Times New Roman"/>
           <w:sz w:val="28"/>
           <w:szCs w:val="28"/>
-          <w:lang w:val="en-RU"/>
         </w:rPr>
         <w:t>сигмоидной функцей </w:t>
       </w:r>
     </w:p>
     <w:p>
       <w:pPr>
-        <w:pStyle w:val="ListParagraph"/>
+        <w:pStyle w:val="a7"/>
         <w:spacing w:line="300" w:lineRule="auto"/>
         <w:ind w:left="0" w:firstLine="697"/>
         <w:jc w:val="both"/>
@@ -3703,15 +3597,13 @@
           <w:rFonts w:ascii="Times New Roman" w:hAnsi="Times New Roman" w:cs="Times New Roman"/>
           <w:sz w:val="28"/>
           <w:szCs w:val="28"/>
-          <w:lang w:val="en-RU"/>
-        </w:rPr>
-      </w:pPr>
-      <w:r>
-        <w:rPr>
-          <w:rFonts w:ascii="Times New Roman" w:hAnsi="Times New Roman" w:cs="Times New Roman"/>
-          <w:sz w:val="28"/>
-          <w:szCs w:val="28"/>
-          <w:lang w:val="en-RU"/>
+        </w:rPr>
+      </w:pPr>
+      <w:r>
+        <w:rPr>
+          <w:rFonts w:ascii="Times New Roman" w:hAnsi="Times New Roman" w:cs="Times New Roman"/>
+          <w:sz w:val="28"/>
+          <w:szCs w:val="28"/>
         </w:rPr>
         <w:t>tanh(z)=2</w:t>
       </w:r>
@@ -3720,7 +3612,6 @@
           <w:rFonts w:ascii="Cambria Math" w:hAnsi="Cambria Math" w:cs="Cambria Math"/>
           <w:sz w:val="28"/>
           <w:szCs w:val="28"/>
-          <w:lang w:val="en-RU"/>
         </w:rPr>
         <w:t>⋅</w:t>
       </w:r>
@@ -3729,7 +3620,6 @@
           <w:rFonts w:ascii="Times New Roman" w:hAnsi="Times New Roman" w:cs="Times New Roman"/>
           <w:sz w:val="28"/>
           <w:szCs w:val="28"/>
-          <w:lang w:val="en-RU"/>
         </w:rPr>
         <w:t>sigma(2z)−1tanh(z)=2</w:t>
       </w:r>
@@ -3738,7 +3628,6 @@
           <w:rFonts w:ascii="Cambria Math" w:hAnsi="Cambria Math" w:cs="Cambria Math"/>
           <w:sz w:val="28"/>
           <w:szCs w:val="28"/>
-          <w:lang w:val="en-RU"/>
         </w:rPr>
         <w:t>⋅</w:t>
       </w:r>
@@ -3747,14 +3636,13 @@
           <w:rFonts w:ascii="Times New Roman" w:hAnsi="Times New Roman" w:cs="Times New Roman"/>
           <w:sz w:val="28"/>
           <w:szCs w:val="28"/>
-          <w:lang w:val="en-RU"/>
         </w:rPr>
         <w:t xml:space="preserve">sigma(2z)−1, </w:t>
       </w:r>
     </w:p>
     <w:p>
       <w:pPr>
-        <w:pStyle w:val="ListParagraph"/>
+        <w:pStyle w:val="a7"/>
         <w:spacing w:line="300" w:lineRule="auto"/>
         <w:ind w:left="0"/>
         <w:jc w:val="both"/>
@@ -3762,22 +3650,20 @@
           <w:rFonts w:ascii="Times New Roman" w:hAnsi="Times New Roman" w:cs="Times New Roman"/>
           <w:sz w:val="28"/>
           <w:szCs w:val="28"/>
-          <w:lang w:val="en-RU"/>
-        </w:rPr>
-      </w:pPr>
-      <w:r>
-        <w:rPr>
-          <w:rFonts w:ascii="Times New Roman" w:hAnsi="Times New Roman" w:cs="Times New Roman"/>
-          <w:sz w:val="28"/>
-          <w:szCs w:val="28"/>
-          <w:lang w:val="en-RU"/>
+        </w:rPr>
+      </w:pPr>
+      <w:r>
+        <w:rPr>
+          <w:rFonts w:ascii="Times New Roman" w:hAnsi="Times New Roman" w:cs="Times New Roman"/>
+          <w:sz w:val="28"/>
+          <w:szCs w:val="28"/>
         </w:rPr>
         <w:t>то есть она сохраняет те же преимущества и недостатки, но уже для диапазона значений (−1;1)(−1;1).</w:t>
       </w:r>
     </w:p>
     <w:p>
       <w:pPr>
-        <w:pStyle w:val="ListParagraph"/>
+        <w:pStyle w:val="a7"/>
         <w:spacing w:line="300" w:lineRule="auto"/>
         <w:ind w:left="0"/>
         <w:jc w:val="both"/>
@@ -3785,13 +3671,12 @@
           <w:rFonts w:ascii="Times New Roman" w:hAnsi="Times New Roman" w:cs="Times New Roman"/>
           <w:sz w:val="28"/>
           <w:szCs w:val="28"/>
-          <w:lang w:val="en-RU"/>
-        </w:rPr>
-      </w:pPr>
-    </w:p>
-    <w:p>
-      <w:pPr>
-        <w:pStyle w:val="ListParagraph"/>
+        </w:rPr>
+      </w:pPr>
+    </w:p>
+    <w:p>
+      <w:pPr>
+        <w:pStyle w:val="a7"/>
         <w:spacing w:line="300" w:lineRule="auto"/>
         <w:ind w:left="0"/>
         <w:jc w:val="both"/>
@@ -3799,7 +3684,6 @@
           <w:rFonts w:ascii="Times New Roman" w:hAnsi="Times New Roman" w:cs="Times New Roman"/>
           <w:sz w:val="28"/>
           <w:szCs w:val="28"/>
-          <w:lang w:val="en-RU"/>
         </w:rPr>
       </w:pPr>
       <m:oMathPara>
@@ -3959,7 +3843,7 @@
     </w:p>
     <w:p>
       <w:pPr>
-        <w:pStyle w:val="ListParagraph"/>
+        <w:pStyle w:val="a7"/>
         <w:spacing w:line="300" w:lineRule="auto"/>
         <w:ind w:left="2124" w:firstLine="708"/>
         <w:jc w:val="both"/>
@@ -3967,7 +3851,6 @@
           <w:rFonts w:ascii="Times New Roman" w:hAnsi="Times New Roman" w:cs="Times New Roman"/>
           <w:sz w:val="28"/>
           <w:szCs w:val="28"/>
-          <w:lang w:val="en-RU"/>
         </w:rPr>
       </w:pPr>
       <w:r>
@@ -3977,10 +3860,10 @@
           <w:iCs/>
           <w:sz w:val="28"/>
           <w:szCs w:val="28"/>
-          <w:lang w:val="en-US"/>
         </w:rPr>
         <w:t xml:space="preserve">         </w:t>
       </w:r>
+      <w:proofErr w:type="spellStart"/>
       <w:r>
         <w:rPr>
           <w:rFonts w:ascii="Times New Roman" w:hAnsi="Times New Roman" w:cs="Times New Roman"/>
@@ -3988,14 +3871,36 @@
           <w:iCs/>
           <w:sz w:val="28"/>
           <w:szCs w:val="28"/>
-          <w:lang w:val="en-RU"/>
-        </w:rPr>
-        <w:t>hyperbolic tangent</w:t>
-      </w:r>
-    </w:p>
-    <w:p>
-      <w:pPr>
-        <w:pStyle w:val="ListParagraph"/>
+        </w:rPr>
+        <w:t>hyperbolic</w:t>
+      </w:r>
+      <w:proofErr w:type="spellEnd"/>
+      <w:r>
+        <w:rPr>
+          <w:rFonts w:ascii="Times New Roman" w:hAnsi="Times New Roman" w:cs="Times New Roman"/>
+          <w:i/>
+          <w:iCs/>
+          <w:sz w:val="28"/>
+          <w:szCs w:val="28"/>
+        </w:rPr>
+        <w:t xml:space="preserve"> </w:t>
+      </w:r>
+      <w:proofErr w:type="spellStart"/>
+      <w:r>
+        <w:rPr>
+          <w:rFonts w:ascii="Times New Roman" w:hAnsi="Times New Roman" w:cs="Times New Roman"/>
+          <w:i/>
+          <w:iCs/>
+          <w:sz w:val="28"/>
+          <w:szCs w:val="28"/>
+        </w:rPr>
+        <w:t>tangent</w:t>
+      </w:r>
+      <w:proofErr w:type="spellEnd"/>
+    </w:p>
+    <w:p>
+      <w:pPr>
+        <w:pStyle w:val="a7"/>
         <w:spacing w:line="300" w:lineRule="auto"/>
         <w:ind w:left="0" w:firstLine="697"/>
         <w:jc w:val="both"/>
@@ -4003,7 +3908,6 @@
           <w:rFonts w:ascii="Times New Roman" w:hAnsi="Times New Roman" w:cs="Times New Roman"/>
           <w:sz w:val="28"/>
           <w:szCs w:val="28"/>
-          <w:lang w:val="en-RU"/>
         </w:rPr>
       </w:pPr>
       <w:r>
@@ -4013,23 +3917,27 @@
         <w:instrText xml:space="preserve"> INCLUDEPICTURE "/Users/Noah Dylan Pelegrini/Library/Group Containers/UBF8T346G9.ms/WebArchiveCopyPasteTempFiles/com.microsoft.Word/200px-TanhFunction.jpg" \* MERGEFORMATINET </w:instrText>
       </w:r>
       <w:r>
-        <w:fldChar w:fldCharType="separate"/>
-      </w:r>
-      <w:r>
         <w:fldChar w:fldCharType="end"/>
       </w:r>
     </w:p>
     <w:p>
       <w:pPr>
-        <w:pStyle w:val="ListParagraph"/>
+        <w:pStyle w:val="a7"/>
         <w:spacing w:line="300" w:lineRule="auto"/>
         <w:ind w:left="0" w:firstLine="697"/>
         <w:jc w:val="both"/>
-        <w:rPr>
-          <w:rFonts w:ascii="Times New Roman" w:hAnsi="Times New Roman" w:cs="Times New Roman"/>
-          <w:color w:val="171719" w:themeColor="background1" w:themeShade="1A"/>
-          <w:sz w:val="28"/>
-          <w:lang w:val="en-RU"/>
+      </w:pPr>
+    </w:p>
+    <w:p>
+      <w:pPr>
+        <w:pStyle w:val="a7"/>
+        <w:spacing w:line="300" w:lineRule="auto"/>
+        <w:ind w:left="0" w:firstLine="697"/>
+        <w:jc w:val="both"/>
+        <w:rPr>
+          <w:rFonts w:ascii="Times New Roman" w:hAnsi="Times New Roman" w:cs="Times New Roman"/>
+          <w:color w:val="1A1A1A" w:themeColor="background1" w:themeShade="1A"/>
+          <w:sz w:val="28"/>
         </w:rPr>
       </w:pPr>
       <w:r>
@@ -4039,9 +3947,6 @@
         <w:instrText xml:space="preserve"> INCLUDEPICTURE "/Users/Noah Dylan Pelegrini/Library/Group Containers/UBF8T346G9.ms/WebArchiveCopyPasteTempFiles/com.microsoft.Word/200px-LinearFunction.jpg" \* MERGEFORMATINET </w:instrText>
       </w:r>
       <w:r>
-        <w:fldChar w:fldCharType="separate"/>
-      </w:r>
-      <w:r>
         <w:fldChar w:fldCharType="end"/>
       </w:r>
       <w:r>
@@ -4049,9 +3954,6 @@
       </w:r>
       <w:r>
         <w:instrText xml:space="preserve"> INCLUDEPICTURE "/Users/Noah Dylan Pelegrini/Library/Group Containers/UBF8T346G9.ms/WebArchiveCopyPasteTempFiles/com.microsoft.Word/200px-BinaryStepFunction.jpg" \* MERGEFORMATINET </w:instrText>
-      </w:r>
-      <w:r>
-        <w:fldChar w:fldCharType="separate"/>
       </w:r>
       <w:r>
         <w:fldChar w:fldCharType="end"/>
@@ -4064,7 +3966,7 @@
         <w:rPr>
           <w:rFonts w:ascii="Times New Roman" w:hAnsi="Times New Roman" w:cs="Times New Roman"/>
           <w:b/>
-          <w:color w:val="171719" w:themeColor="background1" w:themeShade="1A"/>
+          <w:color w:val="1A1A1A" w:themeColor="background1" w:themeShade="1A"/>
           <w:sz w:val="28"/>
         </w:rPr>
       </w:pPr>
@@ -4072,7 +3974,7 @@
         <w:rPr>
           <w:rFonts w:ascii="Times New Roman" w:hAnsi="Times New Roman" w:cs="Times New Roman"/>
           <w:b/>
-          <w:color w:val="171719" w:themeColor="background1" w:themeShade="1A"/>
+          <w:color w:val="1A1A1A" w:themeColor="background1" w:themeShade="1A"/>
           <w:sz w:val="28"/>
         </w:rPr>
         <w:lastRenderedPageBreak/>
@@ -4082,7 +3984,7 @@
         <w:rPr>
           <w:rFonts w:ascii="Times New Roman" w:hAnsi="Times New Roman" w:cs="Times New Roman"/>
           <w:b/>
-          <w:color w:val="171719" w:themeColor="background1" w:themeShade="1A"/>
+          <w:color w:val="1A1A1A" w:themeColor="background1" w:themeShade="1A"/>
           <w:sz w:val="28"/>
         </w:rPr>
         <w:t xml:space="preserve"> </w:t>
@@ -4091,7 +3993,7 @@
         <w:rPr>
           <w:rFonts w:ascii="Times New Roman" w:hAnsi="Times New Roman" w:cs="Times New Roman"/>
           <w:b/>
-          <w:color w:val="171719" w:themeColor="background1" w:themeShade="1A"/>
+          <w:color w:val="1A1A1A" w:themeColor="background1" w:themeShade="1A"/>
           <w:sz w:val="28"/>
         </w:rPr>
         <w:t>Выбор активационной функции</w:t>
@@ -4733,7 +4635,7 @@
     </w:p>
     <w:p>
       <w:pPr>
-        <w:pStyle w:val="ListParagraph"/>
+        <w:pStyle w:val="a7"/>
         <w:numPr>
           <w:ilvl w:val="0"/>
           <w:numId w:val="3"/>
@@ -4789,7 +4691,7 @@
     </w:p>
     <w:p>
       <w:pPr>
-        <w:pStyle w:val="ListParagraph"/>
+        <w:pStyle w:val="a7"/>
         <w:numPr>
           <w:ilvl w:val="0"/>
           <w:numId w:val="3"/>
@@ -5633,7 +5535,6 @@
           <w:rFonts w:ascii="Times New Roman" w:hAnsi="Times New Roman" w:cs="Times New Roman"/>
           <w:sz w:val="18"/>
           <w:szCs w:val="18"/>
-          <w:lang w:val="en-US"/>
         </w:rPr>
       </w:pPr>
       <w:r>
@@ -5670,7 +5571,7 @@
         <w:rPr>
           <w:rFonts w:ascii="Times New Roman" w:hAnsi="Times New Roman" w:cs="Times New Roman"/>
           <w:b/>
-          <w:color w:val="171719" w:themeColor="background1" w:themeShade="1A"/>
+          <w:color w:val="1A1A1A" w:themeColor="background1" w:themeShade="1A"/>
           <w:sz w:val="28"/>
         </w:rPr>
       </w:pPr>
@@ -5678,7 +5579,7 @@
         <w:rPr>
           <w:rFonts w:ascii="Times New Roman" w:hAnsi="Times New Roman" w:cs="Times New Roman"/>
           <w:b/>
-          <w:color w:val="171719" w:themeColor="background1" w:themeShade="1A"/>
+          <w:color w:val="1A1A1A" w:themeColor="background1" w:themeShade="1A"/>
           <w:sz w:val="28"/>
         </w:rPr>
         <w:lastRenderedPageBreak/>
@@ -5688,7 +5589,7 @@
         <w:rPr>
           <w:rFonts w:ascii="Times New Roman" w:hAnsi="Times New Roman" w:cs="Times New Roman"/>
           <w:b/>
-          <w:color w:val="171719" w:themeColor="background1" w:themeShade="1A"/>
+          <w:color w:val="1A1A1A" w:themeColor="background1" w:themeShade="1A"/>
           <w:sz w:val="28"/>
         </w:rPr>
         <w:t>Алгоритм работы нейронной сети</w:t>
@@ -5696,14 +5597,14 @@
     </w:p>
     <w:p>
       <w:pPr>
-        <w:pStyle w:val="ListParagraph"/>
+        <w:pStyle w:val="a7"/>
         <w:spacing w:after="0"/>
         <w:ind w:left="375"/>
         <w:jc w:val="both"/>
         <w:rPr>
           <w:rFonts w:ascii="Times New Roman" w:hAnsi="Times New Roman" w:cs="Times New Roman"/>
           <w:b/>
-          <w:color w:val="171719" w:themeColor="background1" w:themeShade="1A"/>
+          <w:color w:val="1A1A1A" w:themeColor="background1" w:themeShade="1A"/>
           <w:sz w:val="28"/>
         </w:rPr>
       </w:pPr>
@@ -6353,17 +6254,7 @@
           <w:sz w:val="28"/>
           <w:szCs w:val="28"/>
         </w:rPr>
-        <w:t>Скрытый</w:t>
-      </w:r>
-      <w:r>
-        <w:rPr>
-          <w:rFonts w:ascii="Times New Roman" w:hAnsi="Times New Roman" w:cs="Times New Roman"/>
-          <w:b/>
-          <w:bCs/>
-          <w:sz w:val="28"/>
-          <w:szCs w:val="28"/>
-        </w:rPr>
-        <w:t xml:space="preserve"> слой</w:t>
+        <w:t>Скрытый слой</w:t>
       </w:r>
     </w:p>
     <w:p>
@@ -6397,23 +6288,7 @@
           <w:sz w:val="28"/>
           <w:szCs w:val="28"/>
         </w:rPr>
-        <w:t xml:space="preserve">Скрытые слои нейронной сети содержат ненаблюдаемые обрабатывающие блоки (нейроны). Значение каждого скрытого нейрона </w:t>
-      </w:r>
-      <w:r>
-        <w:rPr>
-          <w:rFonts w:ascii="Times New Roman" w:hAnsi="Times New Roman" w:cs="Times New Roman"/>
-          <w:sz w:val="28"/>
-          <w:szCs w:val="28"/>
-        </w:rPr>
-        <w:t>— это</w:t>
-      </w:r>
-      <w:r>
-        <w:rPr>
-          <w:rFonts w:ascii="Times New Roman" w:hAnsi="Times New Roman" w:cs="Times New Roman"/>
-          <w:sz w:val="28"/>
-          <w:szCs w:val="28"/>
-        </w:rPr>
-        <w:t xml:space="preserve"> некоторая функция предикторов</w:t>
+        <w:t>Скрытые слои нейронной сети содержат ненаблюдаемые обрабатывающие блоки (нейроны). Значение каждого скрытого нейрона — это некоторая функция предикторов</w:t>
       </w:r>
       <w:r>
         <w:rPr>
@@ -7657,7 +7532,6 @@
           <w:bCs/>
           <w:sz w:val="28"/>
           <w:szCs w:val="28"/>
-          <w:lang w:val="en-US"/>
         </w:rPr>
         <w:t>.1</w:t>
       </w:r>
@@ -7862,6 +7736,8 @@
         </w:rPr>
         <w:t>Смещение – это дополнительный вход для нейрона, который всегда равен 1 и, следовательно, имеет собственный вес соединения. Это гарантирует, что даже когда все входы будут равны нулю, нейрон будет активен.</w:t>
       </w:r>
+      <w:bookmarkStart w:id="3" w:name="_GoBack"/>
+      <w:bookmarkEnd w:id="3"/>
     </w:p>
     <w:sectPr>
       <w:footerReference w:type="default" r:id="rId15"/>
@@ -7876,7 +7752,7 @@
 </file>
 
 <file path=word/endnotes.xml><?xml version="1.0" encoding="utf-8"?>
-<w:endnotes xmlns:wpc="http://schemas.microsoft.com/office/word/2010/wordprocessingCanvas" xmlns:cx="http://schemas.microsoft.com/office/drawing/2014/chartex" xmlns:cx1="http://schemas.microsoft.com/office/drawing/2015/9/8/chartex" xmlns:cx2="http://schemas.microsoft.com/office/drawing/2015/10/21/chartex" xmlns:cx3="http://schemas.microsoft.com/office/drawing/2016/5/9/chartex" xmlns:cx4="http://schemas.microsoft.com/office/drawing/2016/5/10/chartex" xmlns:cx5="http://schemas.microsoft.com/office/drawing/2016/5/11/chartex" xmlns:cx6="http://schemas.microsoft.com/office/drawing/2016/5/12/chartex" xmlns:cx7="http://schemas.microsoft.com/office/drawing/2016/5/13/chartex" xmlns:cx8="http://schemas.microsoft.com/office/drawing/2016/5/14/chartex" xmlns:mc="http://schemas.openxmlformats.org/markup-compatibility/2006" xmlns:aink="http://schemas.microsoft.com/office/drawing/2016/ink" xmlns:am3d="http://schemas.microsoft.com/office/drawing/2017/model3d" xmlns:o="urn:schemas-microsoft-com:office:office" xmlns:oel="http://schemas.microsoft.com/office/2019/extlst" xmlns:r="http://schemas.openxmlformats.org/officeDocument/2006/relationships" xmlns:m="http://schemas.openxmlformats.org/officeDocument/2006/math" xmlns:v="urn:schemas-microsoft-com:vml" xmlns:wp14="http://schemas.microsoft.com/office/word/2010/wordprocessingDrawing" xmlns:wp="http://schemas.openxmlformats.org/drawingml/2006/wordprocessingDrawing" xmlns:w10="urn:schemas-microsoft-com:office:word" xmlns:w="http://schemas.openxmlformats.org/wordprocessingml/2006/main" xmlns:w14="http://schemas.microsoft.com/office/word/2010/wordml" xmlns:w15="http://schemas.microsoft.com/office/word/2012/wordml" xmlns:w16cex="http://schemas.microsoft.com/office/word/2018/wordml/cex" xmlns:w16cid="http://schemas.microsoft.com/office/word/2016/wordml/cid" xmlns:w16="http://schemas.microsoft.com/office/word/2018/wordml" xmlns:w16sdtdh="http://schemas.microsoft.com/office/word/2020/wordml/sdtdatahash" xmlns:w16se="http://schemas.microsoft.com/office/word/2015/wordml/symex" xmlns:wpg="http://schemas.microsoft.com/office/word/2010/wordprocessingGroup" xmlns:wpi="http://schemas.microsoft.com/office/word/2010/wordprocessingInk" xmlns:wne="http://schemas.microsoft.com/office/word/2006/wordml" xmlns:wps="http://schemas.microsoft.com/office/word/2010/wordprocessingShape" mc:Ignorable="w14 w15 w16se w16cid w16 w16cex w16sdtdh wp14">
+<w:endnotes xmlns:wpc="http://schemas.microsoft.com/office/word/2010/wordprocessingCanvas" xmlns:mc="http://schemas.openxmlformats.org/markup-compatibility/2006" xmlns:o="urn:schemas-microsoft-com:office:office" xmlns:r="http://schemas.openxmlformats.org/officeDocument/2006/relationships" xmlns:m="http://schemas.openxmlformats.org/officeDocument/2006/math" xmlns:v="urn:schemas-microsoft-com:vml" xmlns:wp14="http://schemas.microsoft.com/office/word/2010/wordprocessingDrawing" xmlns:wp="http://schemas.openxmlformats.org/drawingml/2006/wordprocessingDrawing" xmlns:w10="urn:schemas-microsoft-com:office:word" xmlns:w="http://schemas.openxmlformats.org/wordprocessingml/2006/main" xmlns:w14="http://schemas.microsoft.com/office/word/2010/wordml" xmlns:w15="http://schemas.microsoft.com/office/word/2012/wordml" xmlns:wpg="http://schemas.microsoft.com/office/word/2010/wordprocessingGroup" xmlns:wpi="http://schemas.microsoft.com/office/word/2010/wordprocessingInk" xmlns:wne="http://schemas.microsoft.com/office/word/2006/wordml" xmlns:wps="http://schemas.microsoft.com/office/word/2010/wordprocessingShape" mc:Ignorable="w14 w15 wp14">
   <w:endnote w:type="separator" w:id="-1">
     <w:p>
       <w:pPr>
@@ -7901,7 +7777,7 @@
 </file>
 
 <file path=word/footer1.xml><?xml version="1.0" encoding="utf-8"?>
-<w:ftr xmlns:wpc="http://schemas.microsoft.com/office/word/2010/wordprocessingCanvas" xmlns:cx="http://schemas.microsoft.com/office/drawing/2014/chartex" xmlns:cx1="http://schemas.microsoft.com/office/drawing/2015/9/8/chartex" xmlns:cx2="http://schemas.microsoft.com/office/drawing/2015/10/21/chartex" xmlns:cx3="http://schemas.microsoft.com/office/drawing/2016/5/9/chartex" xmlns:cx4="http://schemas.microsoft.com/office/drawing/2016/5/10/chartex" xmlns:cx5="http://schemas.microsoft.com/office/drawing/2016/5/11/chartex" xmlns:cx6="http://schemas.microsoft.com/office/drawing/2016/5/12/chartex" xmlns:cx7="http://schemas.microsoft.com/office/drawing/2016/5/13/chartex" xmlns:cx8="http://schemas.microsoft.com/office/drawing/2016/5/14/chartex" xmlns:mc="http://schemas.openxmlformats.org/markup-compatibility/2006" xmlns:aink="http://schemas.microsoft.com/office/drawing/2016/ink" xmlns:am3d="http://schemas.microsoft.com/office/drawing/2017/model3d" xmlns:o="urn:schemas-microsoft-com:office:office" xmlns:oel="http://schemas.microsoft.com/office/2019/extlst" xmlns:r="http://schemas.openxmlformats.org/officeDocument/2006/relationships" xmlns:m="http://schemas.openxmlformats.org/officeDocument/2006/math" xmlns:v="urn:schemas-microsoft-com:vml" xmlns:wp14="http://schemas.microsoft.com/office/word/2010/wordprocessingDrawing" xmlns:wp="http://schemas.openxmlformats.org/drawingml/2006/wordprocessingDrawing" xmlns:w10="urn:schemas-microsoft-com:office:word" xmlns:w="http://schemas.openxmlformats.org/wordprocessingml/2006/main" xmlns:w14="http://schemas.microsoft.com/office/word/2010/wordml" xmlns:w15="http://schemas.microsoft.com/office/word/2012/wordml" xmlns:w16cex="http://schemas.microsoft.com/office/word/2018/wordml/cex" xmlns:w16cid="http://schemas.microsoft.com/office/word/2016/wordml/cid" xmlns:w16="http://schemas.microsoft.com/office/word/2018/wordml" xmlns:w16sdtdh="http://schemas.microsoft.com/office/word/2020/wordml/sdtdatahash" xmlns:w16se="http://schemas.microsoft.com/office/word/2015/wordml/symex" xmlns:wpg="http://schemas.microsoft.com/office/word/2010/wordprocessingGroup" xmlns:wpi="http://schemas.microsoft.com/office/word/2010/wordprocessingInk" xmlns:wne="http://schemas.microsoft.com/office/word/2006/wordml" xmlns:wps="http://schemas.microsoft.com/office/word/2010/wordprocessingShape" mc:Ignorable="w14 w15 w16se w16cid w16 w16cex w16sdtdh wp14">
+<w:ftr xmlns:wpc="http://schemas.microsoft.com/office/word/2010/wordprocessingCanvas" xmlns:mc="http://schemas.openxmlformats.org/markup-compatibility/2006" xmlns:o="urn:schemas-microsoft-com:office:office" xmlns:r="http://schemas.openxmlformats.org/officeDocument/2006/relationships" xmlns:m="http://schemas.openxmlformats.org/officeDocument/2006/math" xmlns:v="urn:schemas-microsoft-com:vml" xmlns:wp14="http://schemas.microsoft.com/office/word/2010/wordprocessingDrawing" xmlns:wp="http://schemas.openxmlformats.org/drawingml/2006/wordprocessingDrawing" xmlns:w10="urn:schemas-microsoft-com:office:word" xmlns:w="http://schemas.openxmlformats.org/wordprocessingml/2006/main" xmlns:w14="http://schemas.microsoft.com/office/word/2010/wordml" xmlns:w15="http://schemas.microsoft.com/office/word/2012/wordml" xmlns:wpg="http://schemas.microsoft.com/office/word/2010/wordprocessingGroup" xmlns:wpi="http://schemas.microsoft.com/office/word/2010/wordprocessingInk" xmlns:wne="http://schemas.microsoft.com/office/word/2006/wordml" xmlns:wps="http://schemas.microsoft.com/office/word/2010/wordprocessingShape" mc:Ignorable="w14 w15 wp14">
   <w:sdt>
     <w:sdtPr>
       <w:id w:val="-379709307"/>
@@ -7910,10 +7786,11 @@
         <w:docPartUnique/>
       </w:docPartObj>
     </w:sdtPr>
+    <w:sdtEndPr/>
     <w:sdtContent>
       <w:p>
         <w:pPr>
-          <w:pStyle w:val="Footer"/>
+          <w:pStyle w:val="aa"/>
           <w:jc w:val="right"/>
         </w:pPr>
         <w:r>
@@ -7929,7 +7806,7 @@
           <w:rPr>
             <w:noProof/>
           </w:rPr>
-          <w:t>2</w:t>
+          <w:t>10</w:t>
         </w:r>
         <w:r>
           <w:fldChar w:fldCharType="end"/>
@@ -7939,14 +7816,14 @@
   </w:sdt>
   <w:p>
     <w:pPr>
-      <w:pStyle w:val="Footer"/>
+      <w:pStyle w:val="aa"/>
     </w:pPr>
   </w:p>
 </w:ftr>
 </file>
 
 <file path=word/footnotes.xml><?xml version="1.0" encoding="utf-8"?>
-<w:footnotes xmlns:wpc="http://schemas.microsoft.com/office/word/2010/wordprocessingCanvas" xmlns:cx="http://schemas.microsoft.com/office/drawing/2014/chartex" xmlns:cx1="http://schemas.microsoft.com/office/drawing/2015/9/8/chartex" xmlns:cx2="http://schemas.microsoft.com/office/drawing/2015/10/21/chartex" xmlns:cx3="http://schemas.microsoft.com/office/drawing/2016/5/9/chartex" xmlns:cx4="http://schemas.microsoft.com/office/drawing/2016/5/10/chartex" xmlns:cx5="http://schemas.microsoft.com/office/drawing/2016/5/11/chartex" xmlns:cx6="http://schemas.microsoft.com/office/drawing/2016/5/12/chartex" xmlns:cx7="http://schemas.microsoft.com/office/drawing/2016/5/13/chartex" xmlns:cx8="http://schemas.microsoft.com/office/drawing/2016/5/14/chartex" xmlns:mc="http://schemas.openxmlformats.org/markup-compatibility/2006" xmlns:aink="http://schemas.microsoft.com/office/drawing/2016/ink" xmlns:am3d="http://schemas.microsoft.com/office/drawing/2017/model3d" xmlns:o="urn:schemas-microsoft-com:office:office" xmlns:oel="http://schemas.microsoft.com/office/2019/extlst" xmlns:r="http://schemas.openxmlformats.org/officeDocument/2006/relationships" xmlns:m="http://schemas.openxmlformats.org/officeDocument/2006/math" xmlns:v="urn:schemas-microsoft-com:vml" xmlns:wp14="http://schemas.microsoft.com/office/word/2010/wordprocessingDrawing" xmlns:wp="http://schemas.openxmlformats.org/drawingml/2006/wordprocessingDrawing" xmlns:w10="urn:schemas-microsoft-com:office:word" xmlns:w="http://schemas.openxmlformats.org/wordprocessingml/2006/main" xmlns:w14="http://schemas.microsoft.com/office/word/2010/wordml" xmlns:w15="http://schemas.microsoft.com/office/word/2012/wordml" xmlns:w16cex="http://schemas.microsoft.com/office/word/2018/wordml/cex" xmlns:w16cid="http://schemas.microsoft.com/office/word/2016/wordml/cid" xmlns:w16="http://schemas.microsoft.com/office/word/2018/wordml" xmlns:w16sdtdh="http://schemas.microsoft.com/office/word/2020/wordml/sdtdatahash" xmlns:w16se="http://schemas.microsoft.com/office/word/2015/wordml/symex" xmlns:wpg="http://schemas.microsoft.com/office/word/2010/wordprocessingGroup" xmlns:wpi="http://schemas.microsoft.com/office/word/2010/wordprocessingInk" xmlns:wne="http://schemas.microsoft.com/office/word/2006/wordml" xmlns:wps="http://schemas.microsoft.com/office/word/2010/wordprocessingShape" mc:Ignorable="w14 w15 w16se w16cid w16 w16cex w16sdtdh wp14">
+<w:footnotes xmlns:wpc="http://schemas.microsoft.com/office/word/2010/wordprocessingCanvas" xmlns:mc="http://schemas.openxmlformats.org/markup-compatibility/2006" xmlns:o="urn:schemas-microsoft-com:office:office" xmlns:r="http://schemas.openxmlformats.org/officeDocument/2006/relationships" xmlns:m="http://schemas.openxmlformats.org/officeDocument/2006/math" xmlns:v="urn:schemas-microsoft-com:vml" xmlns:wp14="http://schemas.microsoft.com/office/word/2010/wordprocessingDrawing" xmlns:wp="http://schemas.openxmlformats.org/drawingml/2006/wordprocessingDrawing" xmlns:w10="urn:schemas-microsoft-com:office:word" xmlns:w="http://schemas.openxmlformats.org/wordprocessingml/2006/main" xmlns:w14="http://schemas.microsoft.com/office/word/2010/wordml" xmlns:w15="http://schemas.microsoft.com/office/word/2012/wordml" xmlns:wpg="http://schemas.microsoft.com/office/word/2010/wordprocessingGroup" xmlns:wpi="http://schemas.microsoft.com/office/word/2010/wordprocessingInk" xmlns:wne="http://schemas.microsoft.com/office/word/2006/wordml" xmlns:wps="http://schemas.microsoft.com/office/word/2010/wordprocessingShape" mc:Ignorable="w14 w15 wp14">
   <w:footnote w:type="separator" w:id="-1">
     <w:p>
       <w:pPr>
@@ -7971,8 +7848,8 @@
 </file>
 
 <file path=word/numbering.xml><?xml version="1.0" encoding="utf-8"?>
-<w:numbering xmlns:wpc="http://schemas.microsoft.com/office/word/2010/wordprocessingCanvas" xmlns:cx="http://schemas.microsoft.com/office/drawing/2014/chartex" xmlns:cx1="http://schemas.microsoft.com/office/drawing/2015/9/8/chartex" xmlns:cx2="http://schemas.microsoft.com/office/drawing/2015/10/21/chartex" xmlns:cx3="http://schemas.microsoft.com/office/drawing/2016/5/9/chartex" xmlns:cx4="http://schemas.microsoft.com/office/drawing/2016/5/10/chartex" xmlns:cx5="http://schemas.microsoft.com/office/drawing/2016/5/11/chartex" xmlns:cx6="http://schemas.microsoft.com/office/drawing/2016/5/12/chartex" xmlns:cx7="http://schemas.microsoft.com/office/drawing/2016/5/13/chartex" xmlns:cx8="http://schemas.microsoft.com/office/drawing/2016/5/14/chartex" xmlns:mc="http://schemas.openxmlformats.org/markup-compatibility/2006" xmlns:aink="http://schemas.microsoft.com/office/drawing/2016/ink" xmlns:am3d="http://schemas.microsoft.com/office/drawing/2017/model3d" xmlns:o="urn:schemas-microsoft-com:office:office" xmlns:oel="http://schemas.microsoft.com/office/2019/extlst" xmlns:r="http://schemas.openxmlformats.org/officeDocument/2006/relationships" xmlns:m="http://schemas.openxmlformats.org/officeDocument/2006/math" xmlns:v="urn:schemas-microsoft-com:vml" xmlns:wp14="http://schemas.microsoft.com/office/word/2010/wordprocessingDrawing" xmlns:wp="http://schemas.openxmlformats.org/drawingml/2006/wordprocessingDrawing" xmlns:w10="urn:schemas-microsoft-com:office:word" xmlns:w="http://schemas.openxmlformats.org/wordprocessingml/2006/main" xmlns:w14="http://schemas.microsoft.com/office/word/2010/wordml" xmlns:w15="http://schemas.microsoft.com/office/word/2012/wordml" xmlns:w16cex="http://schemas.microsoft.com/office/word/2018/wordml/cex" xmlns:w16cid="http://schemas.microsoft.com/office/word/2016/wordml/cid" xmlns:w16="http://schemas.microsoft.com/office/word/2018/wordml" xmlns:w16sdtdh="http://schemas.microsoft.com/office/word/2020/wordml/sdtdatahash" xmlns:w16se="http://schemas.microsoft.com/office/word/2015/wordml/symex" xmlns:wpg="http://schemas.microsoft.com/office/word/2010/wordprocessingGroup" xmlns:wpi="http://schemas.microsoft.com/office/word/2010/wordprocessingInk" xmlns:wne="http://schemas.microsoft.com/office/word/2006/wordml" xmlns:wps="http://schemas.microsoft.com/office/word/2010/wordprocessingShape" mc:Ignorable="w14 w15 w16se w16cid w16 w16cex w16sdtdh wp14">
-  <w:abstractNum w:abstractNumId="0" w15:restartNumberingAfterBreak="0">
+<w:numbering xmlns:wpc="http://schemas.microsoft.com/office/word/2010/wordprocessingCanvas" xmlns:mc="http://schemas.openxmlformats.org/markup-compatibility/2006" xmlns:o="urn:schemas-microsoft-com:office:office" xmlns:r="http://schemas.openxmlformats.org/officeDocument/2006/relationships" xmlns:m="http://schemas.openxmlformats.org/officeDocument/2006/math" xmlns:v="urn:schemas-microsoft-com:vml" xmlns:wp14="http://schemas.microsoft.com/office/word/2010/wordprocessingDrawing" xmlns:wp="http://schemas.openxmlformats.org/drawingml/2006/wordprocessingDrawing" xmlns:w10="urn:schemas-microsoft-com:office:word" xmlns:w="http://schemas.openxmlformats.org/wordprocessingml/2006/main" xmlns:w14="http://schemas.microsoft.com/office/word/2010/wordml" xmlns:w15="http://schemas.microsoft.com/office/word/2012/wordml" xmlns:wpg="http://schemas.microsoft.com/office/word/2010/wordprocessingGroup" xmlns:wpi="http://schemas.microsoft.com/office/word/2010/wordprocessingInk" xmlns:wne="http://schemas.microsoft.com/office/word/2006/wordml" xmlns:wps="http://schemas.microsoft.com/office/word/2010/wordprocessingShape" mc:Ignorable="w14 w15 wp14">
+  <w:abstractNum w:abstractNumId="0">
     <w:nsid w:val="043814C7"/>
     <w:multiLevelType w:val="hybridMultilevel"/>
     <w:tmpl w:val="BB181584"/>
@@ -8085,7 +7962,7 @@
       </w:rPr>
     </w:lvl>
   </w:abstractNum>
-  <w:abstractNum w:abstractNumId="1" w15:restartNumberingAfterBreak="0">
+  <w:abstractNum w:abstractNumId="1">
     <w:nsid w:val="09523362"/>
     <w:multiLevelType w:val="hybridMultilevel"/>
     <w:tmpl w:val="0C2C725C"/>
@@ -8198,7 +8075,7 @@
       </w:rPr>
     </w:lvl>
   </w:abstractNum>
-  <w:abstractNum w:abstractNumId="2" w15:restartNumberingAfterBreak="0">
+  <w:abstractNum w:abstractNumId="2">
     <w:nsid w:val="19B03DDD"/>
     <w:multiLevelType w:val="hybridMultilevel"/>
     <w:tmpl w:val="E5908A6C"/>
@@ -8287,7 +8164,7 @@
       </w:pPr>
     </w:lvl>
   </w:abstractNum>
-  <w:abstractNum w:abstractNumId="3" w15:restartNumberingAfterBreak="0">
+  <w:abstractNum w:abstractNumId="3">
     <w:nsid w:val="28754DF4"/>
     <w:multiLevelType w:val="multilevel"/>
     <w:tmpl w:val="B1B031CC"/>
@@ -8400,7 +8277,7 @@
       </w:rPr>
     </w:lvl>
   </w:abstractNum>
-  <w:abstractNum w:abstractNumId="4" w15:restartNumberingAfterBreak="0">
+  <w:abstractNum w:abstractNumId="4">
     <w:nsid w:val="38264A56"/>
     <w:multiLevelType w:val="hybridMultilevel"/>
     <w:tmpl w:val="28BE77EC"/>
@@ -8513,7 +8390,7 @@
       </w:rPr>
     </w:lvl>
   </w:abstractNum>
-  <w:abstractNum w:abstractNumId="5" w15:restartNumberingAfterBreak="0">
+  <w:abstractNum w:abstractNumId="5">
     <w:nsid w:val="39984571"/>
     <w:multiLevelType w:val="hybridMultilevel"/>
     <w:tmpl w:val="A5703A46"/>
@@ -8599,7 +8476,7 @@
       </w:pPr>
     </w:lvl>
   </w:abstractNum>
-  <w:abstractNum w:abstractNumId="6" w15:restartNumberingAfterBreak="0">
+  <w:abstractNum w:abstractNumId="6">
     <w:nsid w:val="42F03D9E"/>
     <w:multiLevelType w:val="multilevel"/>
     <w:tmpl w:val="33C6B4B8"/>
@@ -8712,7 +8589,7 @@
       </w:rPr>
     </w:lvl>
   </w:abstractNum>
-  <w:abstractNum w:abstractNumId="7" w15:restartNumberingAfterBreak="0">
+  <w:abstractNum w:abstractNumId="7">
     <w:nsid w:val="4ACE7793"/>
     <w:multiLevelType w:val="multilevel"/>
     <w:tmpl w:val="1C58C59A"/>
@@ -8833,7 +8710,7 @@
       </w:rPr>
     </w:lvl>
   </w:abstractNum>
-  <w:abstractNum w:abstractNumId="8" w15:restartNumberingAfterBreak="0">
+  <w:abstractNum w:abstractNumId="8">
     <w:nsid w:val="5139308F"/>
     <w:multiLevelType w:val="hybridMultilevel"/>
     <w:tmpl w:val="BE705FDE"/>
@@ -8922,7 +8799,7 @@
       </w:pPr>
     </w:lvl>
   </w:abstractNum>
-  <w:abstractNum w:abstractNumId="9" w15:restartNumberingAfterBreak="0">
+  <w:abstractNum w:abstractNumId="9">
     <w:nsid w:val="61DA3710"/>
     <w:multiLevelType w:val="multilevel"/>
     <w:tmpl w:val="74E88560"/>
@@ -9043,7 +8920,7 @@
       </w:rPr>
     </w:lvl>
   </w:abstractNum>
-  <w:abstractNum w:abstractNumId="10" w15:restartNumberingAfterBreak="0">
+  <w:abstractNum w:abstractNumId="10">
     <w:nsid w:val="711A5288"/>
     <w:multiLevelType w:val="hybridMultilevel"/>
     <w:tmpl w:val="F48AD63C"/>
@@ -9156,7 +9033,7 @@
       </w:rPr>
     </w:lvl>
   </w:abstractNum>
-  <w:abstractNum w:abstractNumId="11" w15:restartNumberingAfterBreak="0">
+  <w:abstractNum w:abstractNumId="11">
     <w:nsid w:val="7D822E5A"/>
     <w:multiLevelType w:val="multilevel"/>
     <w:tmpl w:val="DD64DE1C"/>
@@ -9269,7 +9146,7 @@
       </w:rPr>
     </w:lvl>
   </w:abstractNum>
-  <w:abstractNum w:abstractNumId="12" w15:restartNumberingAfterBreak="0">
+  <w:abstractNum w:abstractNumId="12">
     <w:nsid w:val="7DE92BC9"/>
     <w:multiLevelType w:val="multilevel"/>
     <w:tmpl w:val="FCC6D516"/>
@@ -9382,50 +9259,50 @@
       </w:rPr>
     </w:lvl>
   </w:abstractNum>
-  <w:num w:numId="1" w16cid:durableId="1180048951">
+  <w:num w:numId="1">
     <w:abstractNumId w:val="4"/>
   </w:num>
-  <w:num w:numId="2" w16cid:durableId="24336469">
+  <w:num w:numId="2">
     <w:abstractNumId w:val="2"/>
   </w:num>
-  <w:num w:numId="3" w16cid:durableId="611743298">
+  <w:num w:numId="3">
     <w:abstractNumId w:val="10"/>
   </w:num>
-  <w:num w:numId="4" w16cid:durableId="620764209">
+  <w:num w:numId="4">
     <w:abstractNumId w:val="0"/>
   </w:num>
-  <w:num w:numId="5" w16cid:durableId="833689746">
+  <w:num w:numId="5">
     <w:abstractNumId w:val="5"/>
   </w:num>
-  <w:num w:numId="6" w16cid:durableId="1823817075">
+  <w:num w:numId="6">
     <w:abstractNumId w:val="9"/>
   </w:num>
-  <w:num w:numId="7" w16cid:durableId="669329675">
+  <w:num w:numId="7">
     <w:abstractNumId w:val="6"/>
   </w:num>
-  <w:num w:numId="8" w16cid:durableId="885992061">
+  <w:num w:numId="8">
     <w:abstractNumId w:val="8"/>
   </w:num>
-  <w:num w:numId="9" w16cid:durableId="659238763">
+  <w:num w:numId="9">
     <w:abstractNumId w:val="7"/>
   </w:num>
-  <w:num w:numId="10" w16cid:durableId="133911075">
+  <w:num w:numId="10">
     <w:abstractNumId w:val="12"/>
   </w:num>
-  <w:num w:numId="11" w16cid:durableId="1455706890">
+  <w:num w:numId="11">
     <w:abstractNumId w:val="11"/>
   </w:num>
-  <w:num w:numId="12" w16cid:durableId="1991011332">
+  <w:num w:numId="12">
     <w:abstractNumId w:val="3"/>
   </w:num>
-  <w:num w:numId="13" w16cid:durableId="660668699">
+  <w:num w:numId="13">
     <w:abstractNumId w:val="1"/>
   </w:num>
 </w:numbering>
 </file>
 
 <file path=word/styles.xml><?xml version="1.0" encoding="utf-8"?>
-<w:styles xmlns:mc="http://schemas.openxmlformats.org/markup-compatibility/2006" xmlns:r="http://schemas.openxmlformats.org/officeDocument/2006/relationships" xmlns:w="http://schemas.openxmlformats.org/wordprocessingml/2006/main" xmlns:w14="http://schemas.microsoft.com/office/word/2010/wordml" xmlns:w15="http://schemas.microsoft.com/office/word/2012/wordml" xmlns:w16cex="http://schemas.microsoft.com/office/word/2018/wordml/cex" xmlns:w16cid="http://schemas.microsoft.com/office/word/2016/wordml/cid" xmlns:w16="http://schemas.microsoft.com/office/word/2018/wordml" xmlns:w16sdtdh="http://schemas.microsoft.com/office/word/2020/wordml/sdtdatahash" xmlns:w16se="http://schemas.microsoft.com/office/word/2015/wordml/symex" mc:Ignorable="w14 w15 w16se w16cid w16 w16cex w16sdtdh">
+<w:styles xmlns:mc="http://schemas.openxmlformats.org/markup-compatibility/2006" xmlns:r="http://schemas.openxmlformats.org/officeDocument/2006/relationships" xmlns:w="http://schemas.openxmlformats.org/wordprocessingml/2006/main" xmlns:w14="http://schemas.microsoft.com/office/word/2010/wordml" xmlns:w15="http://schemas.microsoft.com/office/word/2012/wordml" mc:Ignorable="w14 w15">
   <w:docDefaults>
     <w:rPrDefault>
       <w:rPr>
@@ -9441,7 +9318,7 @@
       </w:pPr>
     </w:pPrDefault>
   </w:docDefaults>
-  <w:latentStyles w:defLockedState="0" w:defUIPriority="99" w:defSemiHidden="0" w:defUnhideWhenUsed="0" w:defQFormat="0" w:count="376">
+  <w:latentStyles w:defLockedState="0" w:defUIPriority="99" w:defSemiHidden="0" w:defUnhideWhenUsed="0" w:defQFormat="0" w:count="371">
     <w:lsdException w:name="Normal" w:uiPriority="0" w:qFormat="1"/>
     <w:lsdException w:name="heading 1" w:uiPriority="9" w:qFormat="1"/>
     <w:lsdException w:name="heading 2" w:semiHidden="1" w:uiPriority="9" w:unhideWhenUsed="1" w:qFormat="1"/>
@@ -9547,6 +9424,7 @@
     <w:lsdException w:name="HTML Sample" w:semiHidden="1" w:unhideWhenUsed="1"/>
     <w:lsdException w:name="HTML Typewriter" w:semiHidden="1" w:unhideWhenUsed="1"/>
     <w:lsdException w:name="HTML Variable" w:semiHidden="1" w:unhideWhenUsed="1"/>
+    <w:lsdException w:name="Normal Table" w:semiHidden="1" w:unhideWhenUsed="1"/>
     <w:lsdException w:name="annotation subject" w:semiHidden="1" w:unhideWhenUsed="1"/>
     <w:lsdException w:name="No List" w:semiHidden="1" w:unhideWhenUsed="1"/>
     <w:lsdException w:name="Outline List 1" w:semiHidden="1" w:unhideWhenUsed="1"/>
@@ -9589,8 +9467,11 @@
     <w:lsdException w:name="Table Contemporary" w:semiHidden="1" w:unhideWhenUsed="1"/>
     <w:lsdException w:name="Table Elegant" w:semiHidden="1" w:unhideWhenUsed="1"/>
     <w:lsdException w:name="Table Professional" w:semiHidden="1" w:unhideWhenUsed="1"/>
+    <w:lsdException w:name="Table Subtle 1" w:semiHidden="1" w:unhideWhenUsed="1"/>
     <w:lsdException w:name="Table Subtle 2" w:semiHidden="1" w:unhideWhenUsed="1"/>
     <w:lsdException w:name="Table Web 1" w:semiHidden="1" w:unhideWhenUsed="1"/>
+    <w:lsdException w:name="Table Web 2" w:semiHidden="1" w:unhideWhenUsed="1"/>
+    <w:lsdException w:name="Table Web 3" w:semiHidden="1" w:unhideWhenUsed="1"/>
     <w:lsdException w:name="Balloon Text" w:semiHidden="1" w:unhideWhenUsed="1"/>
     <w:lsdException w:name="Table Grid" w:uiPriority="39"/>
     <w:lsdException w:name="Table Theme" w:semiHidden="1" w:unhideWhenUsed="1"/>
@@ -9809,21 +9690,16 @@
     <w:lsdException w:name="List Table 5 Dark Accent 6" w:uiPriority="50"/>
     <w:lsdException w:name="List Table 6 Colorful Accent 6" w:uiPriority="51"/>
     <w:lsdException w:name="List Table 7 Colorful Accent 6" w:uiPriority="52"/>
-    <w:lsdException w:name="Mention" w:semiHidden="1" w:unhideWhenUsed="1"/>
-    <w:lsdException w:name="Smart Hyperlink" w:semiHidden="1" w:unhideWhenUsed="1"/>
-    <w:lsdException w:name="Hashtag" w:semiHidden="1" w:unhideWhenUsed="1"/>
-    <w:lsdException w:name="Unresolved Mention" w:semiHidden="1" w:unhideWhenUsed="1"/>
-    <w:lsdException w:name="Smart Link" w:semiHidden="1" w:unhideWhenUsed="1"/>
   </w:latentStyles>
-  <w:style w:type="paragraph" w:default="1" w:styleId="Normal">
+  <w:style w:type="paragraph" w:default="1" w:styleId="a">
     <w:name w:val="Normal"/>
     <w:qFormat/>
   </w:style>
-  <w:style w:type="paragraph" w:styleId="Heading1">
+  <w:style w:type="paragraph" w:styleId="1">
     <w:name w:val="heading 1"/>
-    <w:basedOn w:val="Normal"/>
-    <w:next w:val="Normal"/>
-    <w:link w:val="Heading1Char"/>
+    <w:basedOn w:val="a"/>
+    <w:next w:val="a"/>
+    <w:link w:val="10"/>
     <w:uiPriority w:val="9"/>
     <w:qFormat/>
     <w:rsid w:val="005317F9"/>
@@ -9840,11 +9716,11 @@
       <w:szCs w:val="32"/>
     </w:rPr>
   </w:style>
-  <w:style w:type="paragraph" w:styleId="Heading3">
+  <w:style w:type="paragraph" w:styleId="3">
     <w:name w:val="heading 3"/>
-    <w:basedOn w:val="Normal"/>
-    <w:next w:val="Normal"/>
-    <w:link w:val="Heading3Char"/>
+    <w:basedOn w:val="a"/>
+    <w:next w:val="a"/>
+    <w:link w:val="30"/>
     <w:uiPriority w:val="9"/>
     <w:semiHidden/>
     <w:unhideWhenUsed/>
@@ -9863,12 +9739,13 @@
       <w:szCs w:val="24"/>
     </w:rPr>
   </w:style>
-  <w:style w:type="character" w:default="1" w:styleId="DefaultParagraphFont">
+  <w:style w:type="character" w:default="1" w:styleId="a0">
     <w:name w:val="Default Paragraph Font"/>
     <w:uiPriority w:val="1"/>
+    <w:semiHidden/>
     <w:unhideWhenUsed/>
   </w:style>
-  <w:style w:type="table" w:default="1" w:styleId="TableNormal">
+  <w:style w:type="table" w:default="1" w:styleId="a1">
     <w:name w:val="Normal Table"/>
     <w:uiPriority w:val="99"/>
     <w:semiHidden/>
@@ -9883,16 +9760,16 @@
       </w:tblCellMar>
     </w:tblPr>
   </w:style>
-  <w:style w:type="numbering" w:default="1" w:styleId="NoList">
+  <w:style w:type="numbering" w:default="1" w:styleId="a2">
     <w:name w:val="No List"/>
     <w:uiPriority w:val="99"/>
     <w:semiHidden/>
     <w:unhideWhenUsed/>
   </w:style>
-  <w:style w:type="character" w:customStyle="1" w:styleId="Heading1Char">
-    <w:name w:val="Heading 1 Char"/>
-    <w:basedOn w:val="DefaultParagraphFont"/>
-    <w:link w:val="Heading1"/>
+  <w:style w:type="character" w:customStyle="1" w:styleId="10">
+    <w:name w:val="Заголовок 1 Знак"/>
+    <w:basedOn w:val="a0"/>
+    <w:link w:val="1"/>
     <w:uiPriority w:val="9"/>
     <w:rsid w:val="005317F9"/>
     <w:rPr>
@@ -9902,10 +9779,10 @@
       <w:szCs w:val="32"/>
     </w:rPr>
   </w:style>
-  <w:style w:type="paragraph" w:styleId="TOCHeading">
+  <w:style w:type="paragraph" w:styleId="a3">
     <w:name w:val="TOC Heading"/>
-    <w:basedOn w:val="Heading1"/>
-    <w:next w:val="Normal"/>
+    <w:basedOn w:val="1"/>
+    <w:next w:val="a"/>
     <w:uiPriority w:val="39"/>
     <w:unhideWhenUsed/>
     <w:qFormat/>
@@ -9917,10 +9794,10 @@
       <w:lang w:eastAsia="ru-RU"/>
     </w:rPr>
   </w:style>
-  <w:style w:type="paragraph" w:styleId="TOC1">
+  <w:style w:type="paragraph" w:styleId="11">
     <w:name w:val="toc 1"/>
-    <w:basedOn w:val="Normal"/>
-    <w:next w:val="Normal"/>
+    <w:basedOn w:val="a"/>
+    <w:next w:val="a"/>
     <w:autoRedefine/>
     <w:uiPriority w:val="39"/>
     <w:unhideWhenUsed/>
@@ -9938,9 +9815,9 @@
       <w:szCs w:val="24"/>
     </w:rPr>
   </w:style>
-  <w:style w:type="character" w:styleId="Hyperlink">
+  <w:style w:type="character" w:styleId="a4">
     <w:name w:val="Hyperlink"/>
-    <w:basedOn w:val="DefaultParagraphFont"/>
+    <w:basedOn w:val="a0"/>
     <w:uiPriority w:val="99"/>
     <w:unhideWhenUsed/>
     <w:rsid w:val="005317F9"/>
@@ -9949,11 +9826,11 @@
       <w:u w:val="single"/>
     </w:rPr>
   </w:style>
-  <w:style w:type="paragraph" w:styleId="Title">
+  <w:style w:type="paragraph" w:styleId="a5">
     <w:name w:val="Title"/>
-    <w:basedOn w:val="Normal"/>
-    <w:next w:val="Normal"/>
-    <w:link w:val="TitleChar"/>
+    <w:basedOn w:val="a"/>
+    <w:next w:val="a"/>
+    <w:link w:val="a6"/>
     <w:uiPriority w:val="10"/>
     <w:qFormat/>
     <w:rsid w:val="005317F9"/>
@@ -9969,10 +9846,10 @@
       <w:szCs w:val="56"/>
     </w:rPr>
   </w:style>
-  <w:style w:type="character" w:customStyle="1" w:styleId="TitleChar">
-    <w:name w:val="Title Char"/>
-    <w:basedOn w:val="DefaultParagraphFont"/>
-    <w:link w:val="Title"/>
+  <w:style w:type="character" w:customStyle="1" w:styleId="a6">
+    <w:name w:val="Название Знак"/>
+    <w:basedOn w:val="a0"/>
+    <w:link w:val="a5"/>
     <w:uiPriority w:val="10"/>
     <w:rsid w:val="005317F9"/>
     <w:rPr>
@@ -9983,9 +9860,9 @@
       <w:szCs w:val="56"/>
     </w:rPr>
   </w:style>
-  <w:style w:type="paragraph" w:styleId="ListParagraph">
+  <w:style w:type="paragraph" w:styleId="a7">
     <w:name w:val="List Paragraph"/>
-    <w:basedOn w:val="Normal"/>
+    <w:basedOn w:val="a"/>
     <w:uiPriority w:val="34"/>
     <w:qFormat/>
     <w:rsid w:val="00D95560"/>
@@ -9994,10 +9871,10 @@
       <w:contextualSpacing/>
     </w:pPr>
   </w:style>
-  <w:style w:type="paragraph" w:styleId="Header">
+  <w:style w:type="paragraph" w:styleId="a8">
     <w:name w:val="header"/>
-    <w:basedOn w:val="Normal"/>
-    <w:link w:val="HeaderChar"/>
+    <w:basedOn w:val="a"/>
+    <w:link w:val="a9"/>
     <w:uiPriority w:val="99"/>
     <w:unhideWhenUsed/>
     <w:rsid w:val="00440A98"/>
@@ -10009,17 +9886,17 @@
       <w:spacing w:after="0" w:line="240" w:lineRule="auto"/>
     </w:pPr>
   </w:style>
-  <w:style w:type="character" w:customStyle="1" w:styleId="HeaderChar">
-    <w:name w:val="Header Char"/>
-    <w:basedOn w:val="DefaultParagraphFont"/>
-    <w:link w:val="Header"/>
+  <w:style w:type="character" w:customStyle="1" w:styleId="a9">
+    <w:name w:val="Верхний колонтитул Знак"/>
+    <w:basedOn w:val="a0"/>
+    <w:link w:val="a8"/>
     <w:uiPriority w:val="99"/>
     <w:rsid w:val="00440A98"/>
   </w:style>
-  <w:style w:type="paragraph" w:styleId="Footer">
+  <w:style w:type="paragraph" w:styleId="aa">
     <w:name w:val="footer"/>
-    <w:basedOn w:val="Normal"/>
-    <w:link w:val="FooterChar"/>
+    <w:basedOn w:val="a"/>
+    <w:link w:val="ab"/>
     <w:uiPriority w:val="99"/>
     <w:unhideWhenUsed/>
     <w:rsid w:val="00440A98"/>
@@ -10031,16 +9908,16 @@
       <w:spacing w:after="0" w:line="240" w:lineRule="auto"/>
     </w:pPr>
   </w:style>
-  <w:style w:type="character" w:customStyle="1" w:styleId="FooterChar">
-    <w:name w:val="Footer Char"/>
-    <w:basedOn w:val="DefaultParagraphFont"/>
-    <w:link w:val="Footer"/>
+  <w:style w:type="character" w:customStyle="1" w:styleId="ab">
+    <w:name w:val="Нижний колонтитул Знак"/>
+    <w:basedOn w:val="a0"/>
+    <w:link w:val="aa"/>
     <w:uiPriority w:val="99"/>
     <w:rsid w:val="00440A98"/>
   </w:style>
-  <w:style w:type="character" w:styleId="PlaceholderText">
+  <w:style w:type="character" w:styleId="ac">
     <w:name w:val="Placeholder Text"/>
-    <w:basedOn w:val="DefaultParagraphFont"/>
+    <w:basedOn w:val="a0"/>
     <w:uiPriority w:val="99"/>
     <w:semiHidden/>
     <w:rsid w:val="004430E1"/>
@@ -10048,10 +9925,10 @@
       <w:color w:val="808080"/>
     </w:rPr>
   </w:style>
-  <w:style w:type="character" w:customStyle="1" w:styleId="Heading3Char">
-    <w:name w:val="Heading 3 Char"/>
-    <w:basedOn w:val="DefaultParagraphFont"/>
-    <w:link w:val="Heading3"/>
+  <w:style w:type="character" w:customStyle="1" w:styleId="30">
+    <w:name w:val="Заголовок 3 Знак"/>
+    <w:basedOn w:val="a0"/>
+    <w:link w:val="3"/>
     <w:uiPriority w:val="9"/>
     <w:semiHidden/>
     <w:rsid w:val="00F65A0B"/>
@@ -10062,9 +9939,9 @@
       <w:szCs w:val="24"/>
     </w:rPr>
   </w:style>
-  <w:style w:type="character" w:styleId="UnresolvedMention">
+  <w:style w:type="character" w:customStyle="1" w:styleId="UnresolvedMention">
     <w:name w:val="Unresolved Mention"/>
-    <w:basedOn w:val="DefaultParagraphFont"/>
+    <w:basedOn w:val="a0"/>
     <w:uiPriority w:val="99"/>
     <w:semiHidden/>
     <w:unhideWhenUsed/>
@@ -10076,23 +9953,23 @@
   </w:style>
   <w:style w:type="character" w:customStyle="1" w:styleId="mi">
     <w:name w:val="mi"/>
-    <w:basedOn w:val="DefaultParagraphFont"/>
+    <w:basedOn w:val="a0"/>
     <w:rsid w:val="00E42B39"/>
   </w:style>
   <w:style w:type="character" w:customStyle="1" w:styleId="mo">
     <w:name w:val="mo"/>
-    <w:basedOn w:val="DefaultParagraphFont"/>
+    <w:basedOn w:val="a0"/>
     <w:rsid w:val="00E42B39"/>
   </w:style>
   <w:style w:type="character" w:customStyle="1" w:styleId="mn">
     <w:name w:val="mn"/>
-    <w:basedOn w:val="DefaultParagraphFont"/>
+    <w:basedOn w:val="a0"/>
     <w:rsid w:val="00E42B39"/>
   </w:style>
-  <w:style w:type="paragraph" w:styleId="TOC2">
+  <w:style w:type="paragraph" w:styleId="2">
     <w:name w:val="toc 2"/>
-    <w:basedOn w:val="Normal"/>
-    <w:next w:val="Normal"/>
+    <w:basedOn w:val="a"/>
+    <w:next w:val="a"/>
     <w:autoRedefine/>
     <w:uiPriority w:val="39"/>
     <w:unhideWhenUsed/>
@@ -10107,10 +9984,10 @@
       <w:bCs/>
     </w:rPr>
   </w:style>
-  <w:style w:type="paragraph" w:styleId="TOC3">
+  <w:style w:type="paragraph" w:styleId="31">
     <w:name w:val="toc 3"/>
-    <w:basedOn w:val="Normal"/>
-    <w:next w:val="Normal"/>
+    <w:basedOn w:val="a"/>
+    <w:next w:val="a"/>
     <w:autoRedefine/>
     <w:uiPriority w:val="39"/>
     <w:unhideWhenUsed/>
@@ -10125,10 +10002,10 @@
       <w:szCs w:val="20"/>
     </w:rPr>
   </w:style>
-  <w:style w:type="paragraph" w:styleId="TOC4">
+  <w:style w:type="paragraph" w:styleId="4">
     <w:name w:val="toc 4"/>
-    <w:basedOn w:val="Normal"/>
-    <w:next w:val="Normal"/>
+    <w:basedOn w:val="a"/>
+    <w:next w:val="a"/>
     <w:autoRedefine/>
     <w:uiPriority w:val="39"/>
     <w:semiHidden/>
@@ -10144,10 +10021,10 @@
       <w:szCs w:val="20"/>
     </w:rPr>
   </w:style>
-  <w:style w:type="paragraph" w:styleId="TOC5">
+  <w:style w:type="paragraph" w:styleId="5">
     <w:name w:val="toc 5"/>
-    <w:basedOn w:val="Normal"/>
-    <w:next w:val="Normal"/>
+    <w:basedOn w:val="a"/>
+    <w:next w:val="a"/>
     <w:autoRedefine/>
     <w:uiPriority w:val="39"/>
     <w:semiHidden/>
@@ -10163,10 +10040,10 @@
       <w:szCs w:val="20"/>
     </w:rPr>
   </w:style>
-  <w:style w:type="paragraph" w:styleId="TOC6">
+  <w:style w:type="paragraph" w:styleId="6">
     <w:name w:val="toc 6"/>
-    <w:basedOn w:val="Normal"/>
-    <w:next w:val="Normal"/>
+    <w:basedOn w:val="a"/>
+    <w:next w:val="a"/>
     <w:autoRedefine/>
     <w:uiPriority w:val="39"/>
     <w:semiHidden/>
@@ -10182,10 +10059,10 @@
       <w:szCs w:val="20"/>
     </w:rPr>
   </w:style>
-  <w:style w:type="paragraph" w:styleId="TOC7">
+  <w:style w:type="paragraph" w:styleId="7">
     <w:name w:val="toc 7"/>
-    <w:basedOn w:val="Normal"/>
-    <w:next w:val="Normal"/>
+    <w:basedOn w:val="a"/>
+    <w:next w:val="a"/>
     <w:autoRedefine/>
     <w:uiPriority w:val="39"/>
     <w:semiHidden/>
@@ -10201,10 +10078,10 @@
       <w:szCs w:val="20"/>
     </w:rPr>
   </w:style>
-  <w:style w:type="paragraph" w:styleId="TOC8">
+  <w:style w:type="paragraph" w:styleId="8">
     <w:name w:val="toc 8"/>
-    <w:basedOn w:val="Normal"/>
-    <w:next w:val="Normal"/>
+    <w:basedOn w:val="a"/>
+    <w:next w:val="a"/>
     <w:autoRedefine/>
     <w:uiPriority w:val="39"/>
     <w:semiHidden/>
@@ -10220,10 +10097,10 @@
       <w:szCs w:val="20"/>
     </w:rPr>
   </w:style>
-  <w:style w:type="paragraph" w:styleId="TOC9">
+  <w:style w:type="paragraph" w:styleId="9">
     <w:name w:val="toc 9"/>
-    <w:basedOn w:val="Normal"/>
-    <w:next w:val="Normal"/>
+    <w:basedOn w:val="a"/>
+    <w:next w:val="a"/>
     <w:autoRedefine/>
     <w:uiPriority w:val="39"/>
     <w:semiHidden/>
@@ -10247,10 +10124,10 @@
   <a:themeElements>
     <a:clrScheme name="Стандартная">
       <a:dk1>
-        <a:sysClr val="windowText" lastClr="494949"/>
+        <a:sysClr val="windowText" lastClr="000000"/>
       </a:dk1>
       <a:lt1>
-        <a:sysClr val="window" lastClr="F2F2F3"/>
+        <a:sysClr val="window" lastClr="FFFFFF"/>
       </a:lt1>
       <a:dk2>
         <a:srgbClr val="44546A"/>
@@ -10508,7 +10385,7 @@
 </file>
 
 <file path=customXml/itemProps1.xml><?xml version="1.0" encoding="utf-8"?>
-<ds:datastoreItem xmlns:ds="http://schemas.openxmlformats.org/officeDocument/2006/customXml" ds:itemID="{5EDE5E3B-25E2-450E-9BC6-A6E4C4135FBB}">
+<ds:datastoreItem xmlns:ds="http://schemas.openxmlformats.org/officeDocument/2006/customXml" ds:itemID="{112EB624-0863-4543-89C5-0AC640E02E61}">
   <ds:schemaRefs>
     <ds:schemaRef ds:uri="http://schemas.openxmlformats.org/officeDocument/2006/bibliography"/>
   </ds:schemaRefs>

</xml_diff>

<commit_message>
Refine network training and evaluation
</commit_message>
<xml_diff>
--- a/Курсовая.docx
+++ b/Курсовая.docx
@@ -189,6 +189,8 @@
           <w:szCs w:val="28"/>
         </w:rPr>
       </w:pPr>
+      <w:bookmarkStart w:id="0" w:name="_GoBack"/>
+      <w:bookmarkEnd w:id="0"/>
     </w:p>
     <w:p>
       <w:pPr>
@@ -919,7 +921,7 @@
               <w:rFonts w:cstheme="majorHAnsi"/>
               <w:b/>
               <w:bCs/>
-              <w:color w:val="000000" w:themeColor="text1" w:themeShade="80"/>
+              <w:color w:val="242424" w:themeColor="text1" w:themeShade="80"/>
             </w:rPr>
           </w:pPr>
           <w:r>
@@ -927,7 +929,7 @@
               <w:rFonts w:cstheme="majorHAnsi"/>
               <w:b/>
               <w:bCs/>
-              <w:color w:val="000000" w:themeColor="text1" w:themeShade="80"/>
+              <w:color w:val="242424" w:themeColor="text1" w:themeShade="80"/>
             </w:rPr>
             <w:t>Содержание</w:t>
           </w:r>
@@ -1034,7 +1036,7 @@
         </w:p>
         <w:p>
           <w:pPr>
-            <w:pStyle w:val="2"/>
+            <w:pStyle w:val="21"/>
             <w:rPr>
               <w:rFonts w:asciiTheme="majorHAnsi" w:hAnsiTheme="majorHAnsi" w:cstheme="majorHAnsi"/>
               <w:b w:val="0"/>
@@ -1076,7 +1078,7 @@
         </w:p>
         <w:p>
           <w:pPr>
-            <w:pStyle w:val="2"/>
+            <w:pStyle w:val="21"/>
             <w:rPr>
               <w:rFonts w:asciiTheme="majorHAnsi" w:hAnsiTheme="majorHAnsi" w:cstheme="majorHAnsi"/>
               <w:b w:val="0"/>
@@ -1118,7 +1120,7 @@
         </w:p>
         <w:p>
           <w:pPr>
-            <w:pStyle w:val="2"/>
+            <w:pStyle w:val="21"/>
             <w:rPr>
               <w:rFonts w:asciiTheme="majorHAnsi" w:hAnsiTheme="majorHAnsi" w:cstheme="majorHAnsi"/>
               <w:b w:val="0"/>
@@ -1554,22 +1556,22 @@
         <w:rPr>
           <w:rFonts w:ascii="Times New Roman" w:hAnsi="Times New Roman" w:cs="Times New Roman"/>
           <w:b/>
-          <w:color w:val="1A1A1A" w:themeColor="background1" w:themeShade="1A"/>
-        </w:rPr>
-      </w:pPr>
-      <w:bookmarkStart w:id="0" w:name="_Toc121431332"/>
-      <w:bookmarkStart w:id="1" w:name="_Toc121930367"/>
-      <w:r>
-        <w:rPr>
-          <w:rFonts w:ascii="Times New Roman" w:hAnsi="Times New Roman" w:cs="Times New Roman"/>
-          <w:b/>
-          <w:color w:val="1A1A1A" w:themeColor="background1" w:themeShade="1A"/>
+          <w:color w:val="171719" w:themeColor="background1" w:themeShade="1A"/>
+        </w:rPr>
+      </w:pPr>
+      <w:bookmarkStart w:id="1" w:name="_Toc121431332"/>
+      <w:bookmarkStart w:id="2" w:name="_Toc121930367"/>
+      <w:r>
+        <w:rPr>
+          <w:rFonts w:ascii="Times New Roman" w:hAnsi="Times New Roman" w:cs="Times New Roman"/>
+          <w:b/>
+          <w:color w:val="171719" w:themeColor="background1" w:themeShade="1A"/>
         </w:rPr>
         <w:lastRenderedPageBreak/>
         <w:t>Введение</w:t>
       </w:r>
-      <w:bookmarkEnd w:id="0"/>
       <w:bookmarkEnd w:id="1"/>
+      <w:bookmarkEnd w:id="2"/>
     </w:p>
     <w:p>
       <w:pPr>
@@ -1690,309 +1692,15 @@
           <w:sz w:val="28"/>
           <w:szCs w:val="28"/>
         </w:rPr>
-        <w:t>Именно такие особенности позволили использовать нейронные сети в финансовой области</w:t>
-      </w:r>
-      <w:r>
-        <w:rPr>
-          <w:rFonts w:ascii="Times New Roman" w:hAnsi="Times New Roman" w:cs="Times New Roman"/>
-          <w:sz w:val="28"/>
-          <w:szCs w:val="28"/>
-        </w:rPr>
-        <w:t>.</w:t>
-      </w:r>
-      <w:r>
-        <w:rPr>
-          <w:rFonts w:ascii="Times New Roman" w:hAnsi="Times New Roman" w:cs="Times New Roman"/>
-          <w:sz w:val="28"/>
-          <w:szCs w:val="28"/>
-        </w:rPr>
-        <w:t xml:space="preserve"> </w:t>
-      </w:r>
-      <w:r>
-        <w:rPr>
-          <w:rFonts w:ascii="Times New Roman" w:hAnsi="Times New Roman" w:cs="Times New Roman"/>
-          <w:sz w:val="28"/>
-          <w:szCs w:val="28"/>
-        </w:rPr>
-        <w:t xml:space="preserve">Для наглядного примера примем за </w:t>
-      </w:r>
-      <w:r>
-        <w:rPr>
-          <w:rFonts w:ascii="Times New Roman" w:hAnsi="Times New Roman" w:cs="Times New Roman"/>
-          <w:sz w:val="28"/>
-          <w:szCs w:val="28"/>
-        </w:rPr>
-        <w:t>входные данные - курс акций за год</w:t>
-      </w:r>
-      <w:r>
-        <w:rPr>
-          <w:rFonts w:ascii="Times New Roman" w:hAnsi="Times New Roman" w:cs="Times New Roman"/>
-          <w:sz w:val="28"/>
-          <w:szCs w:val="28"/>
-        </w:rPr>
-        <w:t>, а</w:t>
-      </w:r>
-      <w:r>
-        <w:rPr>
-          <w:rFonts w:ascii="Times New Roman" w:hAnsi="Times New Roman" w:cs="Times New Roman"/>
-          <w:sz w:val="28"/>
-          <w:szCs w:val="28"/>
-        </w:rPr>
-        <w:t xml:space="preserve"> </w:t>
-      </w:r>
-      <w:r>
-        <w:rPr>
-          <w:rFonts w:ascii="Times New Roman" w:hAnsi="Times New Roman" w:cs="Times New Roman"/>
-          <w:sz w:val="28"/>
-          <w:szCs w:val="28"/>
-        </w:rPr>
-        <w:t>з</w:t>
-      </w:r>
-      <w:r>
-        <w:rPr>
-          <w:rFonts w:ascii="Times New Roman" w:hAnsi="Times New Roman" w:cs="Times New Roman"/>
-          <w:sz w:val="28"/>
-          <w:szCs w:val="28"/>
-        </w:rPr>
-        <w:t>адач</w:t>
-      </w:r>
-      <w:r>
-        <w:rPr>
-          <w:rFonts w:ascii="Times New Roman" w:hAnsi="Times New Roman" w:cs="Times New Roman"/>
-          <w:sz w:val="28"/>
-          <w:szCs w:val="28"/>
-        </w:rPr>
-        <w:t xml:space="preserve">ей для такого алгоритма станет </w:t>
-      </w:r>
-      <w:r>
-        <w:rPr>
-          <w:rFonts w:ascii="Times New Roman" w:hAnsi="Times New Roman" w:cs="Times New Roman"/>
-          <w:sz w:val="28"/>
-          <w:szCs w:val="28"/>
-        </w:rPr>
-        <w:t>определ</w:t>
-      </w:r>
-      <w:r>
-        <w:rPr>
-          <w:rFonts w:ascii="Times New Roman" w:hAnsi="Times New Roman" w:cs="Times New Roman"/>
-          <w:sz w:val="28"/>
-          <w:szCs w:val="28"/>
-        </w:rPr>
-        <w:t>ение</w:t>
-      </w:r>
-      <w:r>
-        <w:rPr>
-          <w:rFonts w:ascii="Times New Roman" w:hAnsi="Times New Roman" w:cs="Times New Roman"/>
-          <w:sz w:val="28"/>
-          <w:szCs w:val="28"/>
-        </w:rPr>
-        <w:t xml:space="preserve"> завтрашн</w:t>
-      </w:r>
-      <w:r>
-        <w:rPr>
-          <w:rFonts w:ascii="Times New Roman" w:hAnsi="Times New Roman" w:cs="Times New Roman"/>
-          <w:sz w:val="28"/>
-          <w:szCs w:val="28"/>
-        </w:rPr>
-        <w:t>его</w:t>
-      </w:r>
-      <w:r>
-        <w:rPr>
-          <w:rFonts w:ascii="Times New Roman" w:hAnsi="Times New Roman" w:cs="Times New Roman"/>
-          <w:sz w:val="28"/>
-          <w:szCs w:val="28"/>
-        </w:rPr>
-        <w:t xml:space="preserve"> курс</w:t>
-      </w:r>
-      <w:r>
-        <w:rPr>
-          <w:rFonts w:ascii="Times New Roman" w:hAnsi="Times New Roman" w:cs="Times New Roman"/>
-          <w:sz w:val="28"/>
-          <w:szCs w:val="28"/>
-        </w:rPr>
-        <w:t>а</w:t>
-      </w:r>
-      <w:r>
-        <w:rPr>
-          <w:rFonts w:ascii="Times New Roman" w:hAnsi="Times New Roman" w:cs="Times New Roman"/>
-          <w:sz w:val="28"/>
-          <w:szCs w:val="28"/>
-        </w:rPr>
-        <w:t xml:space="preserve">. </w:t>
-      </w:r>
-      <w:r>
-        <w:rPr>
-          <w:rFonts w:ascii="Times New Roman" w:hAnsi="Times New Roman" w:cs="Times New Roman"/>
-          <w:sz w:val="28"/>
-          <w:szCs w:val="28"/>
-        </w:rPr>
-        <w:t>Для решения поставленной задачи п</w:t>
-      </w:r>
-      <w:r>
-        <w:rPr>
-          <w:rFonts w:ascii="Times New Roman" w:hAnsi="Times New Roman" w:cs="Times New Roman"/>
-          <w:sz w:val="28"/>
-          <w:szCs w:val="28"/>
-        </w:rPr>
-        <w:t>ровод</w:t>
-      </w:r>
-      <w:r>
-        <w:rPr>
-          <w:rFonts w:ascii="Times New Roman" w:hAnsi="Times New Roman" w:cs="Times New Roman"/>
-          <w:sz w:val="28"/>
-          <w:szCs w:val="28"/>
-        </w:rPr>
-        <w:t>ится следующее преобразование</w:t>
-      </w:r>
-      <w:r>
-        <w:rPr>
-          <w:rFonts w:ascii="Times New Roman" w:hAnsi="Times New Roman" w:cs="Times New Roman"/>
-          <w:sz w:val="28"/>
-          <w:szCs w:val="28"/>
-        </w:rPr>
-        <w:t>:</w:t>
-      </w:r>
-      <w:r>
-        <w:rPr>
-          <w:rFonts w:ascii="Times New Roman" w:hAnsi="Times New Roman" w:cs="Times New Roman"/>
-          <w:sz w:val="28"/>
-          <w:szCs w:val="28"/>
-        </w:rPr>
-        <w:t xml:space="preserve"> </w:t>
-      </w:r>
-    </w:p>
-    <w:p>
-      <w:pPr>
-        <w:pStyle w:val="a7"/>
-        <w:numPr>
-          <w:ilvl w:val="0"/>
-          <w:numId w:val="5"/>
-        </w:numPr>
-        <w:spacing w:after="0" w:line="300" w:lineRule="auto"/>
-        <w:jc w:val="both"/>
-        <w:rPr>
-          <w:rFonts w:ascii="Times New Roman" w:hAnsi="Times New Roman" w:cs="Times New Roman"/>
-          <w:sz w:val="28"/>
-          <w:szCs w:val="28"/>
-        </w:rPr>
-      </w:pPr>
-      <w:r>
-        <w:rPr>
-          <w:rFonts w:ascii="Times New Roman" w:hAnsi="Times New Roman" w:cs="Times New Roman"/>
-          <w:sz w:val="28"/>
-          <w:szCs w:val="28"/>
-        </w:rPr>
-        <w:t>В</w:t>
-      </w:r>
-      <w:r>
-        <w:rPr>
-          <w:rFonts w:ascii="Times New Roman" w:hAnsi="Times New Roman" w:cs="Times New Roman"/>
-          <w:sz w:val="28"/>
-          <w:szCs w:val="28"/>
-        </w:rPr>
-        <w:t xml:space="preserve">ыстраивается в ряд курс за сегодня, вчера, за позавчера. </w:t>
-      </w:r>
-    </w:p>
-    <w:p>
-      <w:pPr>
-        <w:pStyle w:val="a7"/>
-        <w:numPr>
-          <w:ilvl w:val="0"/>
-          <w:numId w:val="5"/>
-        </w:numPr>
-        <w:spacing w:after="0" w:line="300" w:lineRule="auto"/>
-        <w:jc w:val="both"/>
-        <w:rPr>
-          <w:rFonts w:ascii="Times New Roman" w:hAnsi="Times New Roman" w:cs="Times New Roman"/>
-          <w:sz w:val="28"/>
-          <w:szCs w:val="28"/>
-        </w:rPr>
-      </w:pPr>
-      <w:r>
-        <w:rPr>
-          <w:rFonts w:ascii="Times New Roman" w:hAnsi="Times New Roman" w:cs="Times New Roman"/>
-          <w:sz w:val="28"/>
-          <w:szCs w:val="28"/>
-        </w:rPr>
-        <w:t xml:space="preserve">Следующий ряд - смещается по дате на один день и так далее. </w:t>
-      </w:r>
-    </w:p>
-    <w:p>
-      <w:pPr>
-        <w:pStyle w:val="a7"/>
-        <w:numPr>
-          <w:ilvl w:val="0"/>
-          <w:numId w:val="5"/>
-        </w:numPr>
-        <w:spacing w:after="0" w:line="300" w:lineRule="auto"/>
-        <w:jc w:val="both"/>
-        <w:rPr>
-          <w:rFonts w:ascii="Times New Roman" w:hAnsi="Times New Roman" w:cs="Times New Roman"/>
-          <w:sz w:val="28"/>
-          <w:szCs w:val="28"/>
-        </w:rPr>
-      </w:pPr>
-      <w:r>
-        <w:rPr>
-          <w:rFonts w:ascii="Times New Roman" w:hAnsi="Times New Roman" w:cs="Times New Roman"/>
-          <w:sz w:val="28"/>
-          <w:szCs w:val="28"/>
-        </w:rPr>
-        <w:t xml:space="preserve">На полученном наборе обучается сеть с 3 входами и одним выходом - то есть выход: курс на дату, входы: курс на дату минус один день, минус два дня, минус три дня. </w:t>
-      </w:r>
-    </w:p>
-    <w:p>
-      <w:pPr>
-        <w:pStyle w:val="a7"/>
-        <w:numPr>
-          <w:ilvl w:val="0"/>
-          <w:numId w:val="5"/>
-        </w:numPr>
-        <w:spacing w:after="0" w:line="300" w:lineRule="auto"/>
-        <w:jc w:val="both"/>
-        <w:rPr>
-          <w:rFonts w:ascii="Times New Roman" w:hAnsi="Times New Roman" w:cs="Times New Roman"/>
-          <w:sz w:val="28"/>
-          <w:szCs w:val="28"/>
-        </w:rPr>
-      </w:pPr>
-      <w:r>
-        <w:rPr>
-          <w:rFonts w:ascii="Times New Roman" w:hAnsi="Times New Roman" w:cs="Times New Roman"/>
-          <w:sz w:val="28"/>
-          <w:szCs w:val="28"/>
-        </w:rPr>
-        <w:t xml:space="preserve">Обученной сети подаётся на вход курс за сегодня, вчера, позавчера и получается ответ на завтра. </w:t>
-      </w:r>
-    </w:p>
-    <w:p>
-      <w:pPr>
-        <w:spacing w:after="0" w:line="300" w:lineRule="auto"/>
-        <w:ind w:firstLine="706"/>
-        <w:contextualSpacing/>
-        <w:jc w:val="both"/>
-        <w:rPr>
-          <w:rFonts w:ascii="Times New Roman" w:hAnsi="Times New Roman" w:cs="Times New Roman"/>
-          <w:sz w:val="28"/>
-          <w:szCs w:val="28"/>
-        </w:rPr>
-      </w:pPr>
-      <w:r>
-        <w:rPr>
-          <w:rFonts w:ascii="Times New Roman" w:hAnsi="Times New Roman" w:cs="Times New Roman"/>
-          <w:sz w:val="28"/>
-          <w:szCs w:val="28"/>
-        </w:rPr>
-        <w:t xml:space="preserve">В этом случае сеть выведет зависимость одного параметра от трёх предыдущих. Если желательно учитывать ещё какой-то параметр (например, общий индекс по отрасли), то его надо добавить, как вход (и включить в примеры), переобучить сеть и получить новые результаты. Для </w:t>
-      </w:r>
-      <w:r>
-        <w:rPr>
-          <w:rFonts w:ascii="Times New Roman" w:hAnsi="Times New Roman" w:cs="Times New Roman"/>
-          <w:sz w:val="28"/>
-          <w:szCs w:val="28"/>
-        </w:rPr>
-        <w:lastRenderedPageBreak/>
-        <w:t>наиболее точного обучения стоит использовать метод ОРО, как наиболее предсказуемый и несложный в реализации.</w:t>
+        <w:t>Актуальность работы обусловлена тем, что в современном мире всё больше людей взаимодействуют с компьютером, заведомо не имея даже начальных навыков компьютерной грамотности, из-за</w:t>
+      </w:r>
+      <w:r>
+        <w:rPr>
+          <w:rFonts w:ascii="Times New Roman" w:hAnsi="Times New Roman" w:cs="Times New Roman"/>
+          <w:sz w:val="28"/>
+          <w:szCs w:val="28"/>
+        </w:rPr>
+        <w:t xml:space="preserve"> чего уменьшение порога для входа за счёт понимания компьютером более высокоуровневых языков является одной из главных задач перед программистами.</w:t>
       </w:r>
     </w:p>
     <w:p>
@@ -2173,226 +1881,6 @@
     </w:p>
     <w:p>
       <w:pPr>
-        <w:spacing w:after="0" w:line="300" w:lineRule="auto"/>
-        <w:contextualSpacing/>
-        <w:rPr>
-          <w:rFonts w:ascii="Times New Roman" w:hAnsi="Times New Roman" w:cs="Times New Roman"/>
-          <w:sz w:val="28"/>
-          <w:szCs w:val="28"/>
-        </w:rPr>
-      </w:pPr>
-    </w:p>
-    <w:p>
-      <w:pPr>
-        <w:spacing w:after="0" w:line="300" w:lineRule="auto"/>
-        <w:contextualSpacing/>
-        <w:rPr>
-          <w:rFonts w:ascii="Times New Roman" w:hAnsi="Times New Roman" w:cs="Times New Roman"/>
-          <w:sz w:val="28"/>
-          <w:szCs w:val="28"/>
-        </w:rPr>
-      </w:pPr>
-    </w:p>
-    <w:p>
-      <w:pPr>
-        <w:spacing w:after="0" w:line="300" w:lineRule="auto"/>
-        <w:contextualSpacing/>
-        <w:rPr>
-          <w:rFonts w:ascii="Times New Roman" w:hAnsi="Times New Roman" w:cs="Times New Roman"/>
-          <w:sz w:val="28"/>
-          <w:szCs w:val="28"/>
-        </w:rPr>
-      </w:pPr>
-    </w:p>
-    <w:p>
-      <w:pPr>
-        <w:spacing w:after="0" w:line="300" w:lineRule="auto"/>
-        <w:contextualSpacing/>
-        <w:rPr>
-          <w:rFonts w:ascii="Times New Roman" w:hAnsi="Times New Roman" w:cs="Times New Roman"/>
-          <w:sz w:val="28"/>
-          <w:szCs w:val="28"/>
-        </w:rPr>
-      </w:pPr>
-    </w:p>
-    <w:p>
-      <w:pPr>
-        <w:spacing w:after="0" w:line="300" w:lineRule="auto"/>
-        <w:contextualSpacing/>
-        <w:rPr>
-          <w:rFonts w:ascii="Times New Roman" w:hAnsi="Times New Roman" w:cs="Times New Roman"/>
-          <w:sz w:val="28"/>
-          <w:szCs w:val="28"/>
-        </w:rPr>
-      </w:pPr>
-    </w:p>
-    <w:p>
-      <w:pPr>
-        <w:spacing w:after="0" w:line="300" w:lineRule="auto"/>
-        <w:contextualSpacing/>
-        <w:rPr>
-          <w:rFonts w:ascii="Times New Roman" w:hAnsi="Times New Roman" w:cs="Times New Roman"/>
-          <w:sz w:val="28"/>
-          <w:szCs w:val="28"/>
-        </w:rPr>
-      </w:pPr>
-    </w:p>
-    <w:p>
-      <w:pPr>
-        <w:spacing w:after="0" w:line="300" w:lineRule="auto"/>
-        <w:contextualSpacing/>
-        <w:rPr>
-          <w:rFonts w:ascii="Times New Roman" w:hAnsi="Times New Roman" w:cs="Times New Roman"/>
-          <w:sz w:val="28"/>
-          <w:szCs w:val="28"/>
-        </w:rPr>
-      </w:pPr>
-    </w:p>
-    <w:p>
-      <w:pPr>
-        <w:spacing w:after="0" w:line="300" w:lineRule="auto"/>
-        <w:contextualSpacing/>
-        <w:rPr>
-          <w:rFonts w:ascii="Times New Roman" w:hAnsi="Times New Roman" w:cs="Times New Roman"/>
-          <w:sz w:val="28"/>
-          <w:szCs w:val="28"/>
-        </w:rPr>
-      </w:pPr>
-    </w:p>
-    <w:p>
-      <w:pPr>
-        <w:spacing w:after="0" w:line="300" w:lineRule="auto"/>
-        <w:contextualSpacing/>
-        <w:rPr>
-          <w:rFonts w:ascii="Times New Roman" w:hAnsi="Times New Roman" w:cs="Times New Roman"/>
-          <w:sz w:val="28"/>
-          <w:szCs w:val="28"/>
-        </w:rPr>
-      </w:pPr>
-    </w:p>
-    <w:p>
-      <w:pPr>
-        <w:spacing w:after="0" w:line="300" w:lineRule="auto"/>
-        <w:contextualSpacing/>
-        <w:rPr>
-          <w:rFonts w:ascii="Times New Roman" w:hAnsi="Times New Roman" w:cs="Times New Roman"/>
-          <w:sz w:val="28"/>
-          <w:szCs w:val="28"/>
-        </w:rPr>
-      </w:pPr>
-    </w:p>
-    <w:p>
-      <w:pPr>
-        <w:spacing w:after="0" w:line="300" w:lineRule="auto"/>
-        <w:contextualSpacing/>
-        <w:rPr>
-          <w:rFonts w:ascii="Times New Roman" w:hAnsi="Times New Roman" w:cs="Times New Roman"/>
-          <w:sz w:val="28"/>
-          <w:szCs w:val="28"/>
-        </w:rPr>
-      </w:pPr>
-    </w:p>
-    <w:p>
-      <w:pPr>
-        <w:spacing w:after="0" w:line="300" w:lineRule="auto"/>
-        <w:contextualSpacing/>
-        <w:rPr>
-          <w:rFonts w:ascii="Times New Roman" w:hAnsi="Times New Roman" w:cs="Times New Roman"/>
-          <w:sz w:val="28"/>
-          <w:szCs w:val="28"/>
-        </w:rPr>
-      </w:pPr>
-    </w:p>
-    <w:p>
-      <w:pPr>
-        <w:spacing w:after="0" w:line="300" w:lineRule="auto"/>
-        <w:contextualSpacing/>
-        <w:rPr>
-          <w:rFonts w:ascii="Times New Roman" w:hAnsi="Times New Roman" w:cs="Times New Roman"/>
-          <w:sz w:val="28"/>
-          <w:szCs w:val="28"/>
-        </w:rPr>
-      </w:pPr>
-    </w:p>
-    <w:p>
-      <w:pPr>
-        <w:spacing w:after="0" w:line="300" w:lineRule="auto"/>
-        <w:contextualSpacing/>
-        <w:rPr>
-          <w:rFonts w:ascii="Times New Roman" w:hAnsi="Times New Roman" w:cs="Times New Roman"/>
-          <w:sz w:val="28"/>
-          <w:szCs w:val="28"/>
-        </w:rPr>
-      </w:pPr>
-    </w:p>
-    <w:p>
-      <w:pPr>
-        <w:spacing w:after="0" w:line="300" w:lineRule="auto"/>
-        <w:contextualSpacing/>
-        <w:rPr>
-          <w:rFonts w:ascii="Times New Roman" w:hAnsi="Times New Roman" w:cs="Times New Roman"/>
-          <w:sz w:val="28"/>
-          <w:szCs w:val="28"/>
-        </w:rPr>
-      </w:pPr>
-    </w:p>
-    <w:p>
-      <w:pPr>
-        <w:spacing w:after="0" w:line="300" w:lineRule="auto"/>
-        <w:contextualSpacing/>
-        <w:rPr>
-          <w:rFonts w:ascii="Times New Roman" w:hAnsi="Times New Roman" w:cs="Times New Roman"/>
-          <w:sz w:val="28"/>
-          <w:szCs w:val="28"/>
-        </w:rPr>
-      </w:pPr>
-    </w:p>
-    <w:p>
-      <w:pPr>
-        <w:spacing w:after="0" w:line="300" w:lineRule="auto"/>
-        <w:contextualSpacing/>
-        <w:rPr>
-          <w:rFonts w:ascii="Times New Roman" w:hAnsi="Times New Roman" w:cs="Times New Roman"/>
-          <w:sz w:val="28"/>
-          <w:szCs w:val="28"/>
-        </w:rPr>
-      </w:pPr>
-    </w:p>
-    <w:p>
-      <w:pPr>
-        <w:spacing w:after="0" w:line="300" w:lineRule="auto"/>
-        <w:contextualSpacing/>
-        <w:rPr>
-          <w:rFonts w:ascii="Times New Roman" w:hAnsi="Times New Roman" w:cs="Times New Roman"/>
-          <w:sz w:val="28"/>
-          <w:szCs w:val="28"/>
-        </w:rPr>
-      </w:pPr>
-    </w:p>
-    <w:p>
-      <w:pPr>
-        <w:spacing w:after="0" w:line="300" w:lineRule="auto"/>
-        <w:contextualSpacing/>
-        <w:rPr>
-          <w:rFonts w:ascii="Times New Roman" w:hAnsi="Times New Roman" w:cs="Times New Roman"/>
-          <w:sz w:val="28"/>
-          <w:szCs w:val="28"/>
-        </w:rPr>
-      </w:pPr>
-    </w:p>
-    <w:p>
-      <w:pPr>
-        <w:spacing w:after="0" w:line="300" w:lineRule="auto"/>
-        <w:contextualSpacing/>
-        <w:rPr>
-          <w:rFonts w:ascii="Times New Roman" w:hAnsi="Times New Roman" w:cs="Times New Roman"/>
-          <w:sz w:val="28"/>
-          <w:szCs w:val="28"/>
-        </w:rPr>
-      </w:pPr>
-    </w:p>
-    <w:p>
-      <w:pPr>
         <w:pStyle w:val="1"/>
         <w:numPr>
           <w:ilvl w:val="0"/>
@@ -2404,15 +1892,15 @@
         <w:rPr>
           <w:rFonts w:ascii="Times New Roman" w:hAnsi="Times New Roman" w:cs="Times New Roman"/>
           <w:b/>
-          <w:color w:val="1A1A1A" w:themeColor="background1" w:themeShade="1A"/>
-        </w:rPr>
-      </w:pPr>
-      <w:bookmarkStart w:id="2" w:name="_Toc121930368"/>
-      <w:r>
-        <w:rPr>
-          <w:rFonts w:ascii="Times New Roman" w:hAnsi="Times New Roman" w:cs="Times New Roman"/>
-          <w:b/>
-          <w:color w:val="1A1A1A" w:themeColor="background1" w:themeShade="1A"/>
+          <w:color w:val="171719" w:themeColor="background1" w:themeShade="1A"/>
+        </w:rPr>
+      </w:pPr>
+      <w:bookmarkStart w:id="3" w:name="_Toc121930368"/>
+      <w:r>
+        <w:rPr>
+          <w:rFonts w:ascii="Times New Roman" w:hAnsi="Times New Roman" w:cs="Times New Roman"/>
+          <w:b/>
+          <w:color w:val="171719" w:themeColor="background1" w:themeShade="1A"/>
         </w:rPr>
         <w:lastRenderedPageBreak/>
         <w:t>Теоре</w:t>
@@ -2421,28 +1909,28 @@
         <w:rPr>
           <w:rFonts w:ascii="Times New Roman" w:hAnsi="Times New Roman" w:cs="Times New Roman"/>
           <w:b/>
-          <w:color w:val="1A1A1A" w:themeColor="background1" w:themeShade="1A"/>
+          <w:color w:val="171719" w:themeColor="background1" w:themeShade="1A"/>
         </w:rPr>
         <w:t>тическая основа курсовой работы</w:t>
       </w:r>
-      <w:bookmarkEnd w:id="2"/>
-    </w:p>
-    <w:p>
-      <w:pPr>
-        <w:spacing w:after="0"/>
-        <w:jc w:val="both"/>
-        <w:rPr>
-          <w:rFonts w:ascii="Times New Roman" w:hAnsi="Times New Roman" w:cs="Times New Roman"/>
-          <w:b/>
-          <w:color w:val="1A1A1A" w:themeColor="background1" w:themeShade="1A"/>
-          <w:sz w:val="28"/>
-        </w:rPr>
-      </w:pPr>
-      <w:r>
-        <w:rPr>
-          <w:rFonts w:ascii="Times New Roman" w:hAnsi="Times New Roman" w:cs="Times New Roman"/>
-          <w:b/>
-          <w:color w:val="1A1A1A" w:themeColor="background1" w:themeShade="1A"/>
+      <w:bookmarkEnd w:id="3"/>
+    </w:p>
+    <w:p>
+      <w:pPr>
+        <w:spacing w:after="0"/>
+        <w:jc w:val="both"/>
+        <w:rPr>
+          <w:rFonts w:ascii="Times New Roman" w:hAnsi="Times New Roman" w:cs="Times New Roman"/>
+          <w:b/>
+          <w:color w:val="171719" w:themeColor="background1" w:themeShade="1A"/>
+          <w:sz w:val="28"/>
+        </w:rPr>
+      </w:pPr>
+      <w:r>
+        <w:rPr>
+          <w:rFonts w:ascii="Times New Roman" w:hAnsi="Times New Roman" w:cs="Times New Roman"/>
+          <w:b/>
+          <w:color w:val="171719" w:themeColor="background1" w:themeShade="1A"/>
           <w:sz w:val="28"/>
         </w:rPr>
         <w:t xml:space="preserve">1.1 </w:t>
@@ -2451,7 +1939,7 @@
         <w:rPr>
           <w:rFonts w:ascii="Times New Roman" w:hAnsi="Times New Roman" w:cs="Times New Roman"/>
           <w:b/>
-          <w:color w:val="1A1A1A" w:themeColor="background1" w:themeShade="1A"/>
+          <w:color w:val="171719" w:themeColor="background1" w:themeShade="1A"/>
           <w:sz w:val="28"/>
         </w:rPr>
         <w:t>Теория о всех вариантов алгоритмов: нейросети</w:t>
@@ -2466,7 +1954,7 @@
         <w:rPr>
           <w:rFonts w:ascii="Times New Roman" w:hAnsi="Times New Roman" w:cs="Times New Roman"/>
           <w:b/>
-          <w:color w:val="1A1A1A" w:themeColor="background1" w:themeShade="1A"/>
+          <w:color w:val="171719" w:themeColor="background1" w:themeShade="1A"/>
           <w:sz w:val="28"/>
         </w:rPr>
       </w:pPr>
@@ -2479,14 +1967,14 @@
         <w:jc w:val="both"/>
         <w:rPr>
           <w:rFonts w:ascii="Times New Roman" w:hAnsi="Times New Roman" w:cs="Times New Roman"/>
-          <w:color w:val="1A1A1A" w:themeColor="background1" w:themeShade="1A"/>
-          <w:sz w:val="28"/>
-        </w:rPr>
-      </w:pPr>
-      <w:r>
-        <w:rPr>
-          <w:rFonts w:ascii="Times New Roman" w:hAnsi="Times New Roman" w:cs="Times New Roman"/>
-          <w:color w:val="1A1A1A" w:themeColor="background1" w:themeShade="1A"/>
+          <w:color w:val="171719" w:themeColor="background1" w:themeShade="1A"/>
+          <w:sz w:val="28"/>
+        </w:rPr>
+      </w:pPr>
+      <w:r>
+        <w:rPr>
+          <w:rFonts w:ascii="Times New Roman" w:hAnsi="Times New Roman" w:cs="Times New Roman"/>
+          <w:color w:val="171719" w:themeColor="background1" w:themeShade="1A"/>
           <w:sz w:val="28"/>
         </w:rPr>
         <w:t>Нейронная сеть</w:t>
@@ -2494,7 +1982,7 @@
       <w:r>
         <w:rPr>
           <w:rFonts w:ascii="Times New Roman" w:hAnsi="Times New Roman" w:cs="Times New Roman"/>
-          <w:color w:val="1A1A1A" w:themeColor="background1" w:themeShade="1A"/>
+          <w:color w:val="171719" w:themeColor="background1" w:themeShade="1A"/>
           <w:sz w:val="28"/>
         </w:rPr>
         <w:t xml:space="preserve"> (также искусственная нейронная сеть, ИНС) — математическая модель, а также её программное или аппаратное воплощение, построенная по принципу организации и функционирования биологических нейронных сетей — сетей нервных клеток живого организма. Это понятие возникло при изучении процессов, протекающих в мозге, и при попытке смоделировать эти процессы. Первой такой </w:t>
@@ -2502,7 +1990,7 @@
       <w:r>
         <w:rPr>
           <w:rFonts w:ascii="Times New Roman" w:hAnsi="Times New Roman" w:cs="Times New Roman"/>
-          <w:color w:val="1A1A1A" w:themeColor="background1" w:themeShade="1A"/>
+          <w:color w:val="171719" w:themeColor="background1" w:themeShade="1A"/>
           <w:sz w:val="28"/>
         </w:rPr>
         <w:t>попыткой были нейронные сети У.</w:t>
@@ -2510,7 +1998,7 @@
       <w:r>
         <w:rPr>
           <w:rFonts w:ascii="Times New Roman" w:hAnsi="Times New Roman" w:cs="Times New Roman"/>
-          <w:color w:val="1A1A1A" w:themeColor="background1" w:themeShade="1A"/>
+          <w:color w:val="171719" w:themeColor="background1" w:themeShade="1A"/>
           <w:sz w:val="28"/>
         </w:rPr>
         <w:t xml:space="preserve"> Маккалока и У. Питтса. После разработки алгоритмов обучения получаемые модели стали использовать в практических целях: в задачах прогнозирования, для распознавания образов, в задачах управления и др.</w:t>
@@ -2524,14 +2012,14 @@
         <w:jc w:val="both"/>
         <w:rPr>
           <w:rFonts w:ascii="Times New Roman" w:hAnsi="Times New Roman" w:cs="Times New Roman"/>
-          <w:color w:val="1A1A1A" w:themeColor="background1" w:themeShade="1A"/>
-          <w:sz w:val="28"/>
-        </w:rPr>
-      </w:pPr>
-      <w:r>
-        <w:rPr>
-          <w:rFonts w:ascii="Times New Roman" w:hAnsi="Times New Roman" w:cs="Times New Roman"/>
-          <w:color w:val="1A1A1A" w:themeColor="background1" w:themeShade="1A"/>
+          <w:color w:val="171719" w:themeColor="background1" w:themeShade="1A"/>
+          <w:sz w:val="28"/>
+        </w:rPr>
+      </w:pPr>
+      <w:r>
+        <w:rPr>
+          <w:rFonts w:ascii="Times New Roman" w:hAnsi="Times New Roman" w:cs="Times New Roman"/>
+          <w:color w:val="171719" w:themeColor="background1" w:themeShade="1A"/>
           <w:sz w:val="28"/>
         </w:rPr>
         <w:t>В качестве образов могут выступать различные по своей природе объекты: символы текста, изображения, образцы звуков и т. д. При обучении сети предлагаются различные образцы образов с указанием того, к какому классу они относятся. Образец, как правило, представляется как вектор значений признаков. При этом совокупность всех признаков должна </w:t>
@@ -2541,7 +2029,7 @@
           <w:rFonts w:ascii="Times New Roman" w:hAnsi="Times New Roman" w:cs="Times New Roman"/>
           <w:i/>
           <w:iCs/>
-          <w:color w:val="1A1A1A" w:themeColor="background1" w:themeShade="1A"/>
+          <w:color w:val="171719" w:themeColor="background1" w:themeShade="1A"/>
           <w:sz w:val="28"/>
         </w:rPr>
         <w:t>однозначно определять класс</w:t>
@@ -2549,7 +2037,7 @@
       <w:r>
         <w:rPr>
           <w:rFonts w:ascii="Times New Roman" w:hAnsi="Times New Roman" w:cs="Times New Roman"/>
-          <w:color w:val="1A1A1A" w:themeColor="background1" w:themeShade="1A"/>
+          <w:color w:val="171719" w:themeColor="background1" w:themeShade="1A"/>
           <w:sz w:val="28"/>
         </w:rPr>
         <w:t>, к которому относится образец. В случае, если признаков недостаточно, сеть может соотнести один и тот же образец с несколькими классами, что неверно. По окончании обучения сети ей можно предъявлять неизвестные ранее образы и получать ответ о принадлежности к определённому классу.</w:t>
@@ -2563,14 +2051,14 @@
         <w:jc w:val="both"/>
         <w:rPr>
           <w:rFonts w:ascii="Times New Roman" w:hAnsi="Times New Roman" w:cs="Times New Roman"/>
-          <w:color w:val="1A1A1A" w:themeColor="background1" w:themeShade="1A"/>
-          <w:sz w:val="28"/>
-        </w:rPr>
-      </w:pPr>
-      <w:r>
-        <w:rPr>
-          <w:rFonts w:ascii="Times New Roman" w:hAnsi="Times New Roman" w:cs="Times New Roman"/>
-          <w:color w:val="1A1A1A" w:themeColor="background1" w:themeShade="1A"/>
+          <w:color w:val="171719" w:themeColor="background1" w:themeShade="1A"/>
+          <w:sz w:val="28"/>
+        </w:rPr>
+      </w:pPr>
+      <w:r>
+        <w:rPr>
+          <w:rFonts w:ascii="Times New Roman" w:hAnsi="Times New Roman" w:cs="Times New Roman"/>
+          <w:color w:val="171719" w:themeColor="background1" w:themeShade="1A"/>
           <w:sz w:val="28"/>
         </w:rPr>
         <w:t>Топология такой сети характеризуется тем, что количество нейронов в выходном слое, как правило, равно количеству определяемых классов. При этом устанавливается соответствие между выходом нейронной сети и классом, который он представляет. Когда сети предъявляется некий образ, на одном из её выходов должен появиться признак того, что образ принадлежит этому классу. В то же время на других выходах должен быть признак того, что образ данному классу не принадлежит. Если на двух или более выходах есть признак принадлежности к классу, считается, что сеть «не уверена» в своём ответе.</w:t>
@@ -2584,7 +2072,7 @@
         <w:jc w:val="both"/>
         <w:rPr>
           <w:rFonts w:ascii="Times New Roman" w:hAnsi="Times New Roman" w:cs="Times New Roman"/>
-          <w:color w:val="1A1A1A" w:themeColor="background1" w:themeShade="1A"/>
+          <w:color w:val="171719" w:themeColor="background1" w:themeShade="1A"/>
           <w:sz w:val="28"/>
         </w:rPr>
       </w:pPr>
@@ -2597,7 +2085,7 @@
         <w:jc w:val="both"/>
         <w:rPr>
           <w:rFonts w:ascii="Times New Roman" w:hAnsi="Times New Roman" w:cs="Times New Roman"/>
-          <w:color w:val="1A1A1A" w:themeColor="background1" w:themeShade="1A"/>
+          <w:color w:val="171719" w:themeColor="background1" w:themeShade="1A"/>
           <w:sz w:val="28"/>
         </w:rPr>
       </w:pPr>
@@ -2611,7 +2099,7 @@
         <w:rPr>
           <w:rFonts w:ascii="Times New Roman" w:hAnsi="Times New Roman" w:cs="Times New Roman"/>
           <w:b/>
-          <w:color w:val="1A1A1A" w:themeColor="background1" w:themeShade="1A"/>
+          <w:color w:val="171719" w:themeColor="background1" w:themeShade="1A"/>
           <w:sz w:val="28"/>
         </w:rPr>
       </w:pPr>
@@ -2628,15 +2116,15 @@
         <w:rPr>
           <w:rFonts w:ascii="Times New Roman" w:hAnsi="Times New Roman" w:cs="Times New Roman"/>
           <w:b/>
-          <w:color w:val="1A1A1A" w:themeColor="background1" w:themeShade="1A"/>
-          <w:sz w:val="28"/>
-        </w:rPr>
-      </w:pPr>
-      <w:r>
-        <w:rPr>
-          <w:rFonts w:ascii="Times New Roman" w:hAnsi="Times New Roman" w:cs="Times New Roman"/>
-          <w:b/>
-          <w:color w:val="1A1A1A" w:themeColor="background1" w:themeShade="1A"/>
+          <w:color w:val="171719" w:themeColor="background1" w:themeShade="1A"/>
+          <w:sz w:val="28"/>
+        </w:rPr>
+      </w:pPr>
+      <w:r>
+        <w:rPr>
+          <w:rFonts w:ascii="Times New Roman" w:hAnsi="Times New Roman" w:cs="Times New Roman"/>
+          <w:b/>
+          <w:color w:val="171719" w:themeColor="background1" w:themeShade="1A"/>
           <w:sz w:val="28"/>
         </w:rPr>
         <w:lastRenderedPageBreak/>
@@ -2646,7 +2134,7 @@
         <w:rPr>
           <w:rFonts w:ascii="Times New Roman" w:hAnsi="Times New Roman" w:cs="Times New Roman"/>
           <w:b/>
-          <w:color w:val="1A1A1A" w:themeColor="background1" w:themeShade="1A"/>
+          <w:color w:val="171719" w:themeColor="background1" w:themeShade="1A"/>
           <w:sz w:val="28"/>
         </w:rPr>
         <w:t xml:space="preserve">Выбор методов и </w:t>
@@ -2655,7 +2143,7 @@
         <w:rPr>
           <w:rFonts w:ascii="Times New Roman" w:hAnsi="Times New Roman" w:cs="Times New Roman"/>
           <w:b/>
-          <w:color w:val="1A1A1A" w:themeColor="background1" w:themeShade="1A"/>
+          <w:color w:val="171719" w:themeColor="background1" w:themeShade="1A"/>
           <w:sz w:val="28"/>
         </w:rPr>
         <w:t>алгоритмов. Варианты активационных функций.</w:t>
@@ -2670,7 +2158,7 @@
         <w:rPr>
           <w:rFonts w:ascii="Times New Roman" w:hAnsi="Times New Roman" w:cs="Times New Roman"/>
           <w:b/>
-          <w:color w:val="1A1A1A" w:themeColor="background1" w:themeShade="1A"/>
+          <w:color w:val="171719" w:themeColor="background1" w:themeShade="1A"/>
           <w:sz w:val="28"/>
         </w:rPr>
       </w:pPr>
@@ -2753,7 +2241,7 @@
       <w:r>
         <w:rPr>
           <w:rFonts w:ascii="Times New Roman" w:hAnsi="Times New Roman" w:cs="Times New Roman"/>
-          <w:color w:val="1A1A1A" w:themeColor="background1" w:themeShade="1A"/>
+          <w:color w:val="171719" w:themeColor="background1" w:themeShade="1A"/>
           <w:sz w:val="28"/>
         </w:rPr>
         <w:t xml:space="preserve">1) </w:t>
@@ -2761,7 +2249,7 @@
       <w:r>
         <w:rPr>
           <w:rFonts w:ascii="Times New Roman" w:hAnsi="Times New Roman" w:cs="Times New Roman"/>
-          <w:color w:val="1A1A1A" w:themeColor="background1" w:themeShade="1A"/>
+          <w:color w:val="171719" w:themeColor="background1" w:themeShade="1A"/>
           <w:sz w:val="28"/>
         </w:rPr>
         <w:t>Ступенчатая функция (англ. </w:t>
@@ -2771,7 +2259,7 @@
           <w:rFonts w:ascii="Times New Roman" w:hAnsi="Times New Roman" w:cs="Times New Roman"/>
           <w:i/>
           <w:iCs/>
-          <w:color w:val="1A1A1A" w:themeColor="background1" w:themeShade="1A"/>
+          <w:color w:val="171719" w:themeColor="background1" w:themeShade="1A"/>
           <w:sz w:val="28"/>
         </w:rPr>
         <w:t>binary step function</w:t>
@@ -2779,7 +2267,7 @@
       <w:r>
         <w:rPr>
           <w:rFonts w:ascii="Times New Roman" w:hAnsi="Times New Roman" w:cs="Times New Roman"/>
-          <w:color w:val="1A1A1A" w:themeColor="background1" w:themeShade="1A"/>
+          <w:color w:val="171719" w:themeColor="background1" w:themeShade="1A"/>
           <w:sz w:val="28"/>
         </w:rPr>
         <w:t>) является пороговой функцией активации. То есть если zz больше или меньше некоторого значения, то нейрон становится активированным. Такая функция отлично работает для бинарной классификации. Но она не работает, когда для классификации требуется большее число нейронов и количество возможных классов больше двух.</w:t>
@@ -3936,7 +3424,7 @@
         <w:jc w:val="both"/>
         <w:rPr>
           <w:rFonts w:ascii="Times New Roman" w:hAnsi="Times New Roman" w:cs="Times New Roman"/>
-          <w:color w:val="1A1A1A" w:themeColor="background1" w:themeShade="1A"/>
+          <w:color w:val="171719" w:themeColor="background1" w:themeShade="1A"/>
           <w:sz w:val="28"/>
         </w:rPr>
       </w:pPr>
@@ -3961,20 +3449,1570 @@
     </w:p>
     <w:p>
       <w:pPr>
-        <w:spacing w:after="0"/>
-        <w:jc w:val="both"/>
-        <w:rPr>
-          <w:rFonts w:ascii="Times New Roman" w:hAnsi="Times New Roman" w:cs="Times New Roman"/>
-          <w:b/>
-          <w:color w:val="1A1A1A" w:themeColor="background1" w:themeShade="1A"/>
-          <w:sz w:val="28"/>
-        </w:rPr>
-      </w:pPr>
-      <w:r>
-        <w:rPr>
-          <w:rFonts w:ascii="Times New Roman" w:hAnsi="Times New Roman" w:cs="Times New Roman"/>
-          <w:b/>
-          <w:color w:val="1A1A1A" w:themeColor="background1" w:themeShade="1A"/>
+        <w:pStyle w:val="a7"/>
+        <w:numPr>
+          <w:ilvl w:val="1"/>
+          <w:numId w:val="12"/>
+        </w:numPr>
+        <w:spacing w:after="0"/>
+        <w:jc w:val="both"/>
+        <w:rPr>
+          <w:rFonts w:ascii="Times New Roman" w:hAnsi="Times New Roman" w:cs="Times New Roman"/>
+          <w:b/>
+          <w:color w:val="171719" w:themeColor="background1" w:themeShade="1A"/>
+          <w:sz w:val="28"/>
+        </w:rPr>
+      </w:pPr>
+      <w:r>
+        <w:rPr>
+          <w:rFonts w:ascii="Times New Roman" w:hAnsi="Times New Roman" w:cs="Times New Roman"/>
+          <w:b/>
+          <w:color w:val="171719" w:themeColor="background1" w:themeShade="1A"/>
+          <w:sz w:val="28"/>
+        </w:rPr>
+        <w:lastRenderedPageBreak/>
+        <w:t xml:space="preserve"> </w:t>
+      </w:r>
+      <w:r>
+        <w:rPr>
+          <w:rFonts w:ascii="Times New Roman" w:hAnsi="Times New Roman" w:cs="Times New Roman"/>
+          <w:b/>
+          <w:color w:val="171719" w:themeColor="background1" w:themeShade="1A"/>
+          <w:sz w:val="28"/>
+        </w:rPr>
+        <w:t>Типы нейронных сетей</w:t>
+      </w:r>
+    </w:p>
+    <w:p>
+      <w:pPr>
+        <w:pStyle w:val="a7"/>
+        <w:spacing w:after="0"/>
+        <w:ind w:left="375"/>
+        <w:jc w:val="both"/>
+        <w:rPr>
+          <w:rFonts w:ascii="Times New Roman" w:hAnsi="Times New Roman" w:cs="Times New Roman"/>
+          <w:b/>
+          <w:color w:val="171719" w:themeColor="background1" w:themeShade="1A"/>
+          <w:sz w:val="28"/>
+        </w:rPr>
+      </w:pPr>
+    </w:p>
+    <w:p>
+      <w:pPr>
+        <w:pStyle w:val="a7"/>
+        <w:spacing w:after="0" w:line="300" w:lineRule="auto"/>
+        <w:ind w:left="0" w:firstLine="375"/>
+        <w:jc w:val="both"/>
+        <w:rPr>
+          <w:rFonts w:ascii="Times New Roman" w:hAnsi="Times New Roman" w:cs="Times New Roman"/>
+          <w:color w:val="171719" w:themeColor="background1" w:themeShade="1A"/>
+          <w:sz w:val="28"/>
+        </w:rPr>
+      </w:pPr>
+      <w:r>
+        <w:rPr>
+          <w:rFonts w:ascii="Times New Roman" w:hAnsi="Times New Roman" w:cs="Times New Roman"/>
+          <w:color w:val="171719" w:themeColor="background1" w:themeShade="1A"/>
+          <w:sz w:val="28"/>
+        </w:rPr>
+        <w:t xml:space="preserve">Есть десятки видов </w:t>
+      </w:r>
+      <w:proofErr w:type="spellStart"/>
+      <w:r>
+        <w:rPr>
+          <w:rFonts w:ascii="Times New Roman" w:hAnsi="Times New Roman" w:cs="Times New Roman"/>
+          <w:color w:val="171719" w:themeColor="background1" w:themeShade="1A"/>
+          <w:sz w:val="28"/>
+        </w:rPr>
+        <w:t>нейросетей</w:t>
+      </w:r>
+      <w:proofErr w:type="spellEnd"/>
+      <w:r>
+        <w:rPr>
+          <w:rFonts w:ascii="Times New Roman" w:hAnsi="Times New Roman" w:cs="Times New Roman"/>
+          <w:color w:val="171719" w:themeColor="background1" w:themeShade="1A"/>
+          <w:sz w:val="28"/>
+        </w:rPr>
+        <w:t>, которые отличаются архитектурой, особенностями функционирования и сферами применения. При этом чаще других встречаются сети трех видов.</w:t>
+      </w:r>
+    </w:p>
+    <w:p>
+      <w:pPr>
+        <w:pStyle w:val="a7"/>
+        <w:spacing w:after="0" w:line="300" w:lineRule="auto"/>
+        <w:ind w:left="0"/>
+        <w:jc w:val="both"/>
+        <w:rPr>
+          <w:rFonts w:ascii="Times New Roman" w:hAnsi="Times New Roman" w:cs="Times New Roman"/>
+          <w:color w:val="171719" w:themeColor="background1" w:themeShade="1A"/>
+          <w:sz w:val="28"/>
+        </w:rPr>
+      </w:pPr>
+    </w:p>
+    <w:p>
+      <w:pPr>
+        <w:pStyle w:val="a7"/>
+        <w:spacing w:after="0" w:line="300" w:lineRule="auto"/>
+        <w:ind w:left="0" w:firstLine="375"/>
+        <w:jc w:val="both"/>
+        <w:rPr>
+          <w:rFonts w:ascii="Times New Roman" w:hAnsi="Times New Roman" w:cs="Times New Roman"/>
+          <w:color w:val="171719" w:themeColor="background1" w:themeShade="1A"/>
+          <w:sz w:val="28"/>
+        </w:rPr>
+      </w:pPr>
+      <w:r>
+        <w:rPr>
+          <w:rFonts w:ascii="Times New Roman" w:hAnsi="Times New Roman" w:cs="Times New Roman"/>
+          <w:color w:val="171719" w:themeColor="background1" w:themeShade="1A"/>
+          <w:sz w:val="28"/>
+        </w:rPr>
+        <w:t>Нейронные сети прямого распространения (</w:t>
+      </w:r>
+      <w:proofErr w:type="spellStart"/>
+      <w:r>
+        <w:rPr>
+          <w:rFonts w:ascii="Times New Roman" w:hAnsi="Times New Roman" w:cs="Times New Roman"/>
+          <w:color w:val="171719" w:themeColor="background1" w:themeShade="1A"/>
+          <w:sz w:val="28"/>
+        </w:rPr>
+        <w:t>Feed</w:t>
+      </w:r>
+      <w:proofErr w:type="spellEnd"/>
+      <w:r>
+        <w:rPr>
+          <w:rFonts w:ascii="Times New Roman" w:hAnsi="Times New Roman" w:cs="Times New Roman"/>
+          <w:color w:val="171719" w:themeColor="background1" w:themeShade="1A"/>
+          <w:sz w:val="28"/>
+        </w:rPr>
+        <w:t xml:space="preserve"> </w:t>
+      </w:r>
+      <w:proofErr w:type="spellStart"/>
+      <w:r>
+        <w:rPr>
+          <w:rFonts w:ascii="Times New Roman" w:hAnsi="Times New Roman" w:cs="Times New Roman"/>
+          <w:color w:val="171719" w:themeColor="background1" w:themeShade="1A"/>
+          <w:sz w:val="28"/>
+        </w:rPr>
+        <w:t>forward</w:t>
+      </w:r>
+      <w:proofErr w:type="spellEnd"/>
+      <w:r>
+        <w:rPr>
+          <w:rFonts w:ascii="Times New Roman" w:hAnsi="Times New Roman" w:cs="Times New Roman"/>
+          <w:color w:val="171719" w:themeColor="background1" w:themeShade="1A"/>
+          <w:sz w:val="28"/>
+        </w:rPr>
+        <w:t xml:space="preserve"> </w:t>
+      </w:r>
+      <w:proofErr w:type="spellStart"/>
+      <w:r>
+        <w:rPr>
+          <w:rFonts w:ascii="Times New Roman" w:hAnsi="Times New Roman" w:cs="Times New Roman"/>
+          <w:color w:val="171719" w:themeColor="background1" w:themeShade="1A"/>
+          <w:sz w:val="28"/>
+        </w:rPr>
+        <w:t>neural</w:t>
+      </w:r>
+      <w:proofErr w:type="spellEnd"/>
+      <w:r>
+        <w:rPr>
+          <w:rFonts w:ascii="Times New Roman" w:hAnsi="Times New Roman" w:cs="Times New Roman"/>
+          <w:color w:val="171719" w:themeColor="background1" w:themeShade="1A"/>
+          <w:sz w:val="28"/>
+        </w:rPr>
+        <w:t xml:space="preserve"> </w:t>
+      </w:r>
+      <w:proofErr w:type="spellStart"/>
+      <w:r>
+        <w:rPr>
+          <w:rFonts w:ascii="Times New Roman" w:hAnsi="Times New Roman" w:cs="Times New Roman"/>
+          <w:color w:val="171719" w:themeColor="background1" w:themeShade="1A"/>
+          <w:sz w:val="28"/>
+        </w:rPr>
+        <w:t>networks</w:t>
+      </w:r>
+      <w:proofErr w:type="spellEnd"/>
+      <w:r>
+        <w:rPr>
+          <w:rFonts w:ascii="Times New Roman" w:hAnsi="Times New Roman" w:cs="Times New Roman"/>
+          <w:color w:val="171719" w:themeColor="background1" w:themeShade="1A"/>
+          <w:sz w:val="28"/>
+        </w:rPr>
+        <w:t xml:space="preserve">, FFNN). Прямолинейный вид </w:t>
+      </w:r>
+      <w:proofErr w:type="spellStart"/>
+      <w:r>
+        <w:rPr>
+          <w:rFonts w:ascii="Times New Roman" w:hAnsi="Times New Roman" w:cs="Times New Roman"/>
+          <w:color w:val="171719" w:themeColor="background1" w:themeShade="1A"/>
+          <w:sz w:val="28"/>
+        </w:rPr>
+        <w:t>нейросетей</w:t>
+      </w:r>
+      <w:proofErr w:type="spellEnd"/>
+      <w:r>
+        <w:rPr>
+          <w:rFonts w:ascii="Times New Roman" w:hAnsi="Times New Roman" w:cs="Times New Roman"/>
+          <w:color w:val="171719" w:themeColor="background1" w:themeShade="1A"/>
+          <w:sz w:val="28"/>
+        </w:rPr>
+        <w:t>, при котором соседние узлы слоя не связаны, а передача информации осуществляется напрямую от входного слоя к выходному. FFNN имеют малую функциональность, поэтому часто используются в комбинации с сетями других видов.</w:t>
+      </w:r>
+    </w:p>
+    <w:p>
+      <w:pPr>
+        <w:pStyle w:val="a7"/>
+        <w:spacing w:after="0" w:line="300" w:lineRule="auto"/>
+        <w:ind w:left="0"/>
+        <w:jc w:val="both"/>
+        <w:rPr>
+          <w:rFonts w:ascii="Times New Roman" w:hAnsi="Times New Roman" w:cs="Times New Roman"/>
+          <w:color w:val="171719" w:themeColor="background1" w:themeShade="1A"/>
+          <w:sz w:val="28"/>
+        </w:rPr>
+      </w:pPr>
+    </w:p>
+    <w:p>
+      <w:pPr>
+        <w:pStyle w:val="a7"/>
+        <w:spacing w:after="0" w:line="300" w:lineRule="auto"/>
+        <w:ind w:left="0" w:firstLine="360"/>
+        <w:jc w:val="both"/>
+        <w:rPr>
+          <w:rFonts w:ascii="Times New Roman" w:hAnsi="Times New Roman" w:cs="Times New Roman"/>
+          <w:color w:val="171719" w:themeColor="background1" w:themeShade="1A"/>
+          <w:sz w:val="28"/>
+        </w:rPr>
+      </w:pPr>
+      <w:proofErr w:type="spellStart"/>
+      <w:r>
+        <w:rPr>
+          <w:rFonts w:ascii="Times New Roman" w:hAnsi="Times New Roman" w:cs="Times New Roman"/>
+          <w:color w:val="171719" w:themeColor="background1" w:themeShade="1A"/>
+          <w:sz w:val="28"/>
+        </w:rPr>
+        <w:t>Сверточные</w:t>
+      </w:r>
+      <w:proofErr w:type="spellEnd"/>
+      <w:r>
+        <w:rPr>
+          <w:rFonts w:ascii="Times New Roman" w:hAnsi="Times New Roman" w:cs="Times New Roman"/>
+          <w:color w:val="171719" w:themeColor="background1" w:themeShade="1A"/>
+          <w:sz w:val="28"/>
+          <w:lang w:val="en-US"/>
+        </w:rPr>
+        <w:t xml:space="preserve"> </w:t>
+      </w:r>
+      <w:r>
+        <w:rPr>
+          <w:rFonts w:ascii="Times New Roman" w:hAnsi="Times New Roman" w:cs="Times New Roman"/>
+          <w:color w:val="171719" w:themeColor="background1" w:themeShade="1A"/>
+          <w:sz w:val="28"/>
+        </w:rPr>
+        <w:t>нейронные</w:t>
+      </w:r>
+      <w:r>
+        <w:rPr>
+          <w:rFonts w:ascii="Times New Roman" w:hAnsi="Times New Roman" w:cs="Times New Roman"/>
+          <w:color w:val="171719" w:themeColor="background1" w:themeShade="1A"/>
+          <w:sz w:val="28"/>
+          <w:lang w:val="en-US"/>
+        </w:rPr>
+        <w:t xml:space="preserve"> </w:t>
+      </w:r>
+      <w:r>
+        <w:rPr>
+          <w:rFonts w:ascii="Times New Roman" w:hAnsi="Times New Roman" w:cs="Times New Roman"/>
+          <w:color w:val="171719" w:themeColor="background1" w:themeShade="1A"/>
+          <w:sz w:val="28"/>
+        </w:rPr>
+        <w:t>сети</w:t>
+      </w:r>
+      <w:r>
+        <w:rPr>
+          <w:rFonts w:ascii="Times New Roman" w:hAnsi="Times New Roman" w:cs="Times New Roman"/>
+          <w:color w:val="171719" w:themeColor="background1" w:themeShade="1A"/>
+          <w:sz w:val="28"/>
+          <w:lang w:val="en-US"/>
+        </w:rPr>
+        <w:t xml:space="preserve"> (Convolutional neural network, CNN). </w:t>
+      </w:r>
+      <w:r>
+        <w:rPr>
+          <w:rFonts w:ascii="Times New Roman" w:hAnsi="Times New Roman" w:cs="Times New Roman"/>
+          <w:color w:val="171719" w:themeColor="background1" w:themeShade="1A"/>
+          <w:sz w:val="28"/>
+        </w:rPr>
+        <w:t>Состоят из слоев пяти типов:</w:t>
+      </w:r>
+    </w:p>
+    <w:p>
+      <w:pPr>
+        <w:pStyle w:val="a7"/>
+        <w:spacing w:after="0" w:line="300" w:lineRule="auto"/>
+        <w:ind w:left="0"/>
+        <w:jc w:val="both"/>
+        <w:rPr>
+          <w:rFonts w:ascii="Times New Roman" w:hAnsi="Times New Roman" w:cs="Times New Roman"/>
+          <w:color w:val="171719" w:themeColor="background1" w:themeShade="1A"/>
+          <w:sz w:val="28"/>
+        </w:rPr>
+      </w:pPr>
+    </w:p>
+    <w:p>
+      <w:pPr>
+        <w:pStyle w:val="a7"/>
+        <w:numPr>
+          <w:ilvl w:val="0"/>
+          <w:numId w:val="14"/>
+        </w:numPr>
+        <w:spacing w:after="0" w:line="300" w:lineRule="auto"/>
+        <w:ind w:left="720"/>
+        <w:jc w:val="both"/>
+        <w:rPr>
+          <w:rFonts w:ascii="Times New Roman" w:hAnsi="Times New Roman" w:cs="Times New Roman"/>
+          <w:color w:val="171719" w:themeColor="background1" w:themeShade="1A"/>
+          <w:sz w:val="28"/>
+        </w:rPr>
+      </w:pPr>
+      <w:r>
+        <w:rPr>
+          <w:rFonts w:ascii="Times New Roman" w:hAnsi="Times New Roman" w:cs="Times New Roman"/>
+          <w:color w:val="171719" w:themeColor="background1" w:themeShade="1A"/>
+          <w:sz w:val="28"/>
+        </w:rPr>
+        <w:t>входного;</w:t>
+      </w:r>
+    </w:p>
+    <w:p>
+      <w:pPr>
+        <w:pStyle w:val="a7"/>
+        <w:numPr>
+          <w:ilvl w:val="0"/>
+          <w:numId w:val="14"/>
+        </w:numPr>
+        <w:spacing w:after="0" w:line="300" w:lineRule="auto"/>
+        <w:ind w:left="720"/>
+        <w:jc w:val="both"/>
+        <w:rPr>
+          <w:rFonts w:ascii="Times New Roman" w:hAnsi="Times New Roman" w:cs="Times New Roman"/>
+          <w:color w:val="171719" w:themeColor="background1" w:themeShade="1A"/>
+          <w:sz w:val="28"/>
+        </w:rPr>
+      </w:pPr>
+      <w:r>
+        <w:rPr>
+          <w:rFonts w:ascii="Times New Roman" w:hAnsi="Times New Roman" w:cs="Times New Roman"/>
+          <w:color w:val="171719" w:themeColor="background1" w:themeShade="1A"/>
+          <w:sz w:val="28"/>
+        </w:rPr>
+        <w:t>свертывающего;</w:t>
+      </w:r>
+    </w:p>
+    <w:p>
+      <w:pPr>
+        <w:pStyle w:val="a7"/>
+        <w:numPr>
+          <w:ilvl w:val="0"/>
+          <w:numId w:val="14"/>
+        </w:numPr>
+        <w:spacing w:after="0" w:line="300" w:lineRule="auto"/>
+        <w:ind w:left="720"/>
+        <w:jc w:val="both"/>
+        <w:rPr>
+          <w:rFonts w:ascii="Times New Roman" w:hAnsi="Times New Roman" w:cs="Times New Roman"/>
+          <w:color w:val="171719" w:themeColor="background1" w:themeShade="1A"/>
+          <w:sz w:val="28"/>
+        </w:rPr>
+      </w:pPr>
+      <w:r>
+        <w:rPr>
+          <w:rFonts w:ascii="Times New Roman" w:hAnsi="Times New Roman" w:cs="Times New Roman"/>
+          <w:color w:val="171719" w:themeColor="background1" w:themeShade="1A"/>
+          <w:sz w:val="28"/>
+        </w:rPr>
+        <w:t>объединяющего;</w:t>
+      </w:r>
+    </w:p>
+    <w:p>
+      <w:pPr>
+        <w:pStyle w:val="a7"/>
+        <w:numPr>
+          <w:ilvl w:val="0"/>
+          <w:numId w:val="14"/>
+        </w:numPr>
+        <w:spacing w:after="0" w:line="300" w:lineRule="auto"/>
+        <w:ind w:left="720"/>
+        <w:jc w:val="both"/>
+        <w:rPr>
+          <w:rFonts w:ascii="Times New Roman" w:hAnsi="Times New Roman" w:cs="Times New Roman"/>
+          <w:color w:val="171719" w:themeColor="background1" w:themeShade="1A"/>
+          <w:sz w:val="28"/>
+        </w:rPr>
+      </w:pPr>
+      <w:r>
+        <w:rPr>
+          <w:rFonts w:ascii="Times New Roman" w:hAnsi="Times New Roman" w:cs="Times New Roman"/>
+          <w:color w:val="171719" w:themeColor="background1" w:themeShade="1A"/>
+          <w:sz w:val="28"/>
+        </w:rPr>
+        <w:t>подключенного;</w:t>
+      </w:r>
+    </w:p>
+    <w:p>
+      <w:pPr>
+        <w:pStyle w:val="a7"/>
+        <w:numPr>
+          <w:ilvl w:val="0"/>
+          <w:numId w:val="14"/>
+        </w:numPr>
+        <w:spacing w:after="0" w:line="300" w:lineRule="auto"/>
+        <w:ind w:left="720"/>
+        <w:jc w:val="both"/>
+        <w:rPr>
+          <w:rFonts w:ascii="Times New Roman" w:hAnsi="Times New Roman" w:cs="Times New Roman"/>
+          <w:color w:val="171719" w:themeColor="background1" w:themeShade="1A"/>
+          <w:sz w:val="28"/>
+        </w:rPr>
+      </w:pPr>
+      <w:r>
+        <w:rPr>
+          <w:rFonts w:ascii="Times New Roman" w:hAnsi="Times New Roman" w:cs="Times New Roman"/>
+          <w:color w:val="171719" w:themeColor="background1" w:themeShade="1A"/>
+          <w:sz w:val="28"/>
+        </w:rPr>
+        <w:t>выходного.</w:t>
+      </w:r>
+    </w:p>
+    <w:p>
+      <w:pPr>
+        <w:pStyle w:val="a7"/>
+        <w:spacing w:after="0" w:line="300" w:lineRule="auto"/>
+        <w:jc w:val="both"/>
+        <w:rPr>
+          <w:rFonts w:ascii="Times New Roman" w:hAnsi="Times New Roman" w:cs="Times New Roman"/>
+          <w:color w:val="171719" w:themeColor="background1" w:themeShade="1A"/>
+          <w:sz w:val="28"/>
+        </w:rPr>
+      </w:pPr>
+    </w:p>
+    <w:p>
+      <w:pPr>
+        <w:pStyle w:val="a7"/>
+        <w:spacing w:after="0" w:line="300" w:lineRule="auto"/>
+        <w:ind w:left="0" w:firstLine="360"/>
+        <w:jc w:val="both"/>
+        <w:rPr>
+          <w:rFonts w:ascii="Times New Roman" w:hAnsi="Times New Roman" w:cs="Times New Roman"/>
+          <w:color w:val="171719" w:themeColor="background1" w:themeShade="1A"/>
+          <w:sz w:val="28"/>
+        </w:rPr>
+      </w:pPr>
+      <w:r>
+        <w:rPr>
+          <w:rFonts w:ascii="Times New Roman" w:hAnsi="Times New Roman" w:cs="Times New Roman"/>
+          <w:color w:val="171719" w:themeColor="background1" w:themeShade="1A"/>
+          <w:sz w:val="28"/>
+        </w:rPr>
+        <w:t>Каждый слой выполняет определенную задачу: например, обобщает или соединяет данные.</w:t>
+      </w:r>
+    </w:p>
+    <w:p>
+      <w:pPr>
+        <w:pStyle w:val="a7"/>
+        <w:spacing w:after="0" w:line="300" w:lineRule="auto"/>
+        <w:ind w:left="0"/>
+        <w:jc w:val="both"/>
+        <w:rPr>
+          <w:rFonts w:ascii="Times New Roman" w:hAnsi="Times New Roman" w:cs="Times New Roman"/>
+          <w:color w:val="171719" w:themeColor="background1" w:themeShade="1A"/>
+          <w:sz w:val="28"/>
+        </w:rPr>
+      </w:pPr>
+    </w:p>
+    <w:p>
+      <w:pPr>
+        <w:pStyle w:val="a7"/>
+        <w:spacing w:after="0" w:line="300" w:lineRule="auto"/>
+        <w:ind w:left="0" w:firstLine="360"/>
+        <w:jc w:val="both"/>
+        <w:rPr>
+          <w:rFonts w:ascii="Times New Roman" w:hAnsi="Times New Roman" w:cs="Times New Roman"/>
+          <w:color w:val="171719" w:themeColor="background1" w:themeShade="1A"/>
+          <w:sz w:val="28"/>
+        </w:rPr>
+      </w:pPr>
+      <w:proofErr w:type="spellStart"/>
+      <w:r>
+        <w:rPr>
+          <w:rFonts w:ascii="Times New Roman" w:hAnsi="Times New Roman" w:cs="Times New Roman"/>
+          <w:color w:val="171719" w:themeColor="background1" w:themeShade="1A"/>
+          <w:sz w:val="28"/>
+        </w:rPr>
+        <w:t>Сверточные</w:t>
+      </w:r>
+      <w:proofErr w:type="spellEnd"/>
+      <w:r>
+        <w:rPr>
+          <w:rFonts w:ascii="Times New Roman" w:hAnsi="Times New Roman" w:cs="Times New Roman"/>
+          <w:color w:val="171719" w:themeColor="background1" w:themeShade="1A"/>
+          <w:sz w:val="28"/>
+        </w:rPr>
+        <w:t xml:space="preserve"> </w:t>
+      </w:r>
+      <w:proofErr w:type="spellStart"/>
+      <w:r>
+        <w:rPr>
+          <w:rFonts w:ascii="Times New Roman" w:hAnsi="Times New Roman" w:cs="Times New Roman"/>
+          <w:color w:val="171719" w:themeColor="background1" w:themeShade="1A"/>
+          <w:sz w:val="28"/>
+        </w:rPr>
+        <w:t>нейросети</w:t>
+      </w:r>
+      <w:proofErr w:type="spellEnd"/>
+      <w:r>
+        <w:rPr>
+          <w:rFonts w:ascii="Times New Roman" w:hAnsi="Times New Roman" w:cs="Times New Roman"/>
+          <w:color w:val="171719" w:themeColor="background1" w:themeShade="1A"/>
+          <w:sz w:val="28"/>
+        </w:rPr>
+        <w:t xml:space="preserve"> применяются для классификации изображений, распознавания объектов, прогнозирования, обработки естественного языка и других задач.</w:t>
+      </w:r>
+    </w:p>
+    <w:p>
+      <w:pPr>
+        <w:pStyle w:val="a7"/>
+        <w:spacing w:after="0" w:line="300" w:lineRule="auto"/>
+        <w:ind w:left="0"/>
+        <w:jc w:val="both"/>
+        <w:rPr>
+          <w:rFonts w:ascii="Times New Roman" w:hAnsi="Times New Roman" w:cs="Times New Roman"/>
+          <w:color w:val="171719" w:themeColor="background1" w:themeShade="1A"/>
+          <w:sz w:val="28"/>
+        </w:rPr>
+      </w:pPr>
+    </w:p>
+    <w:p>
+      <w:pPr>
+        <w:pStyle w:val="a7"/>
+        <w:spacing w:after="0" w:line="300" w:lineRule="auto"/>
+        <w:ind w:left="0" w:firstLine="360"/>
+        <w:jc w:val="both"/>
+        <w:rPr>
+          <w:rFonts w:ascii="Times New Roman" w:hAnsi="Times New Roman" w:cs="Times New Roman"/>
+          <w:color w:val="171719" w:themeColor="background1" w:themeShade="1A"/>
+          <w:sz w:val="28"/>
+        </w:rPr>
+      </w:pPr>
+      <w:r>
+        <w:rPr>
+          <w:rFonts w:ascii="Times New Roman" w:hAnsi="Times New Roman" w:cs="Times New Roman"/>
+          <w:color w:val="171719" w:themeColor="background1" w:themeShade="1A"/>
+          <w:sz w:val="28"/>
+        </w:rPr>
+        <w:t>Рекуррентные нейронные сети (</w:t>
+      </w:r>
+      <w:proofErr w:type="spellStart"/>
+      <w:r>
+        <w:rPr>
+          <w:rFonts w:ascii="Times New Roman" w:hAnsi="Times New Roman" w:cs="Times New Roman"/>
+          <w:color w:val="171719" w:themeColor="background1" w:themeShade="1A"/>
+          <w:sz w:val="28"/>
+        </w:rPr>
+        <w:t>Recurrent</w:t>
+      </w:r>
+      <w:proofErr w:type="spellEnd"/>
+      <w:r>
+        <w:rPr>
+          <w:rFonts w:ascii="Times New Roman" w:hAnsi="Times New Roman" w:cs="Times New Roman"/>
+          <w:color w:val="171719" w:themeColor="background1" w:themeShade="1A"/>
+          <w:sz w:val="28"/>
+        </w:rPr>
+        <w:t xml:space="preserve"> </w:t>
+      </w:r>
+      <w:proofErr w:type="spellStart"/>
+      <w:r>
+        <w:rPr>
+          <w:rFonts w:ascii="Times New Roman" w:hAnsi="Times New Roman" w:cs="Times New Roman"/>
+          <w:color w:val="171719" w:themeColor="background1" w:themeShade="1A"/>
+          <w:sz w:val="28"/>
+        </w:rPr>
+        <w:t>neural</w:t>
+      </w:r>
+      <w:proofErr w:type="spellEnd"/>
+      <w:r>
+        <w:rPr>
+          <w:rFonts w:ascii="Times New Roman" w:hAnsi="Times New Roman" w:cs="Times New Roman"/>
+          <w:color w:val="171719" w:themeColor="background1" w:themeShade="1A"/>
+          <w:sz w:val="28"/>
+        </w:rPr>
+        <w:t xml:space="preserve"> </w:t>
+      </w:r>
+      <w:proofErr w:type="spellStart"/>
+      <w:r>
+        <w:rPr>
+          <w:rFonts w:ascii="Times New Roman" w:hAnsi="Times New Roman" w:cs="Times New Roman"/>
+          <w:color w:val="171719" w:themeColor="background1" w:themeShade="1A"/>
+          <w:sz w:val="28"/>
+        </w:rPr>
+        <w:t>network</w:t>
+      </w:r>
+      <w:proofErr w:type="spellEnd"/>
+      <w:r>
+        <w:rPr>
+          <w:rFonts w:ascii="Times New Roman" w:hAnsi="Times New Roman" w:cs="Times New Roman"/>
+          <w:color w:val="171719" w:themeColor="background1" w:themeShade="1A"/>
+          <w:sz w:val="28"/>
+        </w:rPr>
+        <w:t>, RNN). Используют направленную последовательность связи между узлами. В RNN результат вычислений на каждом этапе используется в качестве исходных данных для следующего. Благодаря этому, рекуррентные нейронные сети могут обрабатывать серии событий во времени или последовательности для получения результата вычислений.</w:t>
+      </w:r>
+    </w:p>
+    <w:p>
+      <w:pPr>
+        <w:pStyle w:val="a7"/>
+        <w:spacing w:after="0" w:line="300" w:lineRule="auto"/>
+        <w:ind w:left="0"/>
+        <w:jc w:val="both"/>
+        <w:rPr>
+          <w:rFonts w:ascii="Times New Roman" w:hAnsi="Times New Roman" w:cs="Times New Roman"/>
+          <w:color w:val="171719" w:themeColor="background1" w:themeShade="1A"/>
+          <w:sz w:val="28"/>
+        </w:rPr>
+      </w:pPr>
+    </w:p>
+    <w:p>
+      <w:pPr>
+        <w:pStyle w:val="a7"/>
+        <w:spacing w:after="0" w:line="300" w:lineRule="auto"/>
+        <w:ind w:left="0" w:firstLine="360"/>
+        <w:jc w:val="both"/>
+        <w:rPr>
+          <w:rFonts w:ascii="Times New Roman" w:hAnsi="Times New Roman" w:cs="Times New Roman"/>
+          <w:color w:val="171719" w:themeColor="background1" w:themeShade="1A"/>
+          <w:sz w:val="28"/>
+        </w:rPr>
+      </w:pPr>
+      <w:r>
+        <w:rPr>
+          <w:rFonts w:ascii="Times New Roman" w:hAnsi="Times New Roman" w:cs="Times New Roman"/>
+          <w:color w:val="171719" w:themeColor="background1" w:themeShade="1A"/>
+          <w:sz w:val="28"/>
+        </w:rPr>
+        <w:t>RNN применяют для языкового моделирования и генерации текстов, машинного перевода, распознавания речи и других задач.</w:t>
+      </w:r>
+    </w:p>
+    <w:p>
+      <w:pPr>
+        <w:pStyle w:val="a7"/>
+        <w:spacing w:after="0"/>
+        <w:ind w:left="375"/>
+        <w:jc w:val="both"/>
+        <w:rPr>
+          <w:rFonts w:ascii="Times New Roman" w:hAnsi="Times New Roman" w:cs="Times New Roman"/>
+          <w:color w:val="171719" w:themeColor="background1" w:themeShade="1A"/>
+          <w:sz w:val="28"/>
+        </w:rPr>
+      </w:pPr>
+    </w:p>
+    <w:p>
+      <w:pPr>
+        <w:pStyle w:val="a7"/>
+        <w:spacing w:after="0"/>
+        <w:ind w:left="375"/>
+        <w:jc w:val="both"/>
+        <w:rPr>
+          <w:rFonts w:ascii="Times New Roman" w:hAnsi="Times New Roman" w:cs="Times New Roman"/>
+          <w:color w:val="171719" w:themeColor="background1" w:themeShade="1A"/>
+          <w:sz w:val="28"/>
+        </w:rPr>
+      </w:pPr>
+    </w:p>
+    <w:p>
+      <w:pPr>
+        <w:pStyle w:val="a7"/>
+        <w:numPr>
+          <w:ilvl w:val="1"/>
+          <w:numId w:val="12"/>
+        </w:numPr>
+        <w:spacing w:after="0"/>
+        <w:jc w:val="both"/>
+        <w:rPr>
+          <w:rFonts w:ascii="Times New Roman" w:hAnsi="Times New Roman" w:cs="Times New Roman"/>
+          <w:b/>
+          <w:color w:val="171719" w:themeColor="background1" w:themeShade="1A"/>
+          <w:sz w:val="28"/>
+        </w:rPr>
+      </w:pPr>
+      <w:r>
+        <w:rPr>
+          <w:rFonts w:ascii="Times New Roman" w:hAnsi="Times New Roman" w:cs="Times New Roman"/>
+          <w:b/>
+          <w:color w:val="171719" w:themeColor="background1" w:themeShade="1A"/>
+          <w:sz w:val="28"/>
+        </w:rPr>
+        <w:t xml:space="preserve"> </w:t>
+      </w:r>
+      <w:r>
+        <w:rPr>
+          <w:rFonts w:ascii="Times New Roman" w:hAnsi="Times New Roman" w:cs="Times New Roman"/>
+          <w:b/>
+          <w:color w:val="171719" w:themeColor="background1" w:themeShade="1A"/>
+          <w:sz w:val="28"/>
+        </w:rPr>
+        <w:t>Типы задач, которые решают нейронные сети</w:t>
+      </w:r>
+    </w:p>
+    <w:p>
+      <w:pPr>
+        <w:pStyle w:val="a7"/>
+        <w:spacing w:after="0"/>
+        <w:ind w:left="375"/>
+        <w:jc w:val="both"/>
+        <w:rPr>
+          <w:rFonts w:ascii="Times New Roman" w:hAnsi="Times New Roman" w:cs="Times New Roman"/>
+          <w:b/>
+          <w:color w:val="171719" w:themeColor="background1" w:themeShade="1A"/>
+          <w:sz w:val="28"/>
+        </w:rPr>
+      </w:pPr>
+    </w:p>
+    <w:p>
+      <w:pPr>
+        <w:pStyle w:val="a7"/>
+        <w:spacing w:after="0" w:line="300" w:lineRule="auto"/>
+        <w:ind w:left="0" w:firstLine="375"/>
+        <w:jc w:val="both"/>
+        <w:rPr>
+          <w:rFonts w:ascii="Times New Roman" w:hAnsi="Times New Roman" w:cs="Times New Roman"/>
+          <w:color w:val="171719" w:themeColor="background1" w:themeShade="1A"/>
+          <w:sz w:val="28"/>
+        </w:rPr>
+      </w:pPr>
+      <w:r>
+        <w:rPr>
+          <w:rFonts w:ascii="Times New Roman" w:hAnsi="Times New Roman" w:cs="Times New Roman"/>
+          <w:color w:val="171719" w:themeColor="background1" w:themeShade="1A"/>
+          <w:sz w:val="28"/>
+        </w:rPr>
+        <w:t xml:space="preserve">Выделяют несколько базовых типов задач, для решения которых могут использоваться </w:t>
+      </w:r>
+      <w:proofErr w:type="spellStart"/>
+      <w:r>
+        <w:rPr>
+          <w:rFonts w:ascii="Times New Roman" w:hAnsi="Times New Roman" w:cs="Times New Roman"/>
+          <w:color w:val="171719" w:themeColor="background1" w:themeShade="1A"/>
+          <w:sz w:val="28"/>
+        </w:rPr>
+        <w:t>нейросети</w:t>
+      </w:r>
+      <w:proofErr w:type="spellEnd"/>
+      <w:r>
+        <w:rPr>
+          <w:rFonts w:ascii="Times New Roman" w:hAnsi="Times New Roman" w:cs="Times New Roman"/>
+          <w:color w:val="171719" w:themeColor="background1" w:themeShade="1A"/>
+          <w:sz w:val="28"/>
+        </w:rPr>
+        <w:t>.</w:t>
+      </w:r>
+    </w:p>
+    <w:p>
+      <w:pPr>
+        <w:pStyle w:val="a7"/>
+        <w:numPr>
+          <w:ilvl w:val="0"/>
+          <w:numId w:val="15"/>
+        </w:numPr>
+        <w:spacing w:after="0" w:line="300" w:lineRule="auto"/>
+        <w:jc w:val="both"/>
+        <w:rPr>
+          <w:rFonts w:ascii="Times New Roman" w:hAnsi="Times New Roman" w:cs="Times New Roman"/>
+          <w:color w:val="171719" w:themeColor="background1" w:themeShade="1A"/>
+          <w:sz w:val="28"/>
+        </w:rPr>
+      </w:pPr>
+      <w:r>
+        <w:rPr>
+          <w:rFonts w:ascii="Times New Roman" w:hAnsi="Times New Roman" w:cs="Times New Roman"/>
+          <w:color w:val="171719" w:themeColor="background1" w:themeShade="1A"/>
+          <w:sz w:val="28"/>
+        </w:rPr>
+        <w:t>Классификация. Для распознавания лиц, эмоций, типов объектов: например, квадратов, кругов, треугольников. Также для распознавания образов, то есть выбора конкретного объекта из предложенного множества: например, выбор квадрата среди треугольников.</w:t>
+      </w:r>
+    </w:p>
+    <w:p>
+      <w:pPr>
+        <w:pStyle w:val="a7"/>
+        <w:numPr>
+          <w:ilvl w:val="0"/>
+          <w:numId w:val="15"/>
+        </w:numPr>
+        <w:spacing w:after="0" w:line="300" w:lineRule="auto"/>
+        <w:jc w:val="both"/>
+        <w:rPr>
+          <w:rFonts w:ascii="Times New Roman" w:hAnsi="Times New Roman" w:cs="Times New Roman"/>
+          <w:color w:val="171719" w:themeColor="background1" w:themeShade="1A"/>
+          <w:sz w:val="28"/>
+        </w:rPr>
+      </w:pPr>
+      <w:r>
+        <w:rPr>
+          <w:rFonts w:ascii="Times New Roman" w:hAnsi="Times New Roman" w:cs="Times New Roman"/>
+          <w:color w:val="171719" w:themeColor="background1" w:themeShade="1A"/>
+          <w:sz w:val="28"/>
+        </w:rPr>
+        <w:t>Регрессия. Для определения возраста по фотографии, составления прогноза биржевых курсов, оценки стоимости имущества и других задач, требующих получения в результате обработки конкретного числа.</w:t>
+      </w:r>
+    </w:p>
+    <w:p>
+      <w:pPr>
+        <w:pStyle w:val="a7"/>
+        <w:numPr>
+          <w:ilvl w:val="0"/>
+          <w:numId w:val="15"/>
+        </w:numPr>
+        <w:spacing w:after="0" w:line="300" w:lineRule="auto"/>
+        <w:jc w:val="both"/>
+        <w:rPr>
+          <w:rFonts w:ascii="Times New Roman" w:hAnsi="Times New Roman" w:cs="Times New Roman"/>
+          <w:color w:val="171719" w:themeColor="background1" w:themeShade="1A"/>
+          <w:sz w:val="28"/>
+        </w:rPr>
+      </w:pPr>
+      <w:r>
+        <w:rPr>
+          <w:rFonts w:ascii="Times New Roman" w:hAnsi="Times New Roman" w:cs="Times New Roman"/>
+          <w:color w:val="171719" w:themeColor="background1" w:themeShade="1A"/>
+          <w:sz w:val="28"/>
+        </w:rPr>
+        <w:t xml:space="preserve">Прогнозирования временных рядов. Для составления долгосрочных прогнозов на основе динамического временного ряда значений. Например, </w:t>
+      </w:r>
+      <w:proofErr w:type="spellStart"/>
+      <w:r>
+        <w:rPr>
+          <w:rFonts w:ascii="Times New Roman" w:hAnsi="Times New Roman" w:cs="Times New Roman"/>
+          <w:color w:val="171719" w:themeColor="background1" w:themeShade="1A"/>
+          <w:sz w:val="28"/>
+        </w:rPr>
+        <w:t>нейросети</w:t>
+      </w:r>
+      <w:proofErr w:type="spellEnd"/>
+      <w:r>
+        <w:rPr>
+          <w:rFonts w:ascii="Times New Roman" w:hAnsi="Times New Roman" w:cs="Times New Roman"/>
+          <w:color w:val="171719" w:themeColor="background1" w:themeShade="1A"/>
+          <w:sz w:val="28"/>
+        </w:rPr>
+        <w:t xml:space="preserve"> применяются для предсказания цен, физических явлений, объема потребления и других показателей. По сути, даже работу автопилота </w:t>
+      </w:r>
+      <w:proofErr w:type="spellStart"/>
+      <w:r>
+        <w:rPr>
+          <w:rFonts w:ascii="Times New Roman" w:hAnsi="Times New Roman" w:cs="Times New Roman"/>
+          <w:color w:val="171719" w:themeColor="background1" w:themeShade="1A"/>
+          <w:sz w:val="28"/>
+        </w:rPr>
+        <w:t>Tesla</w:t>
+      </w:r>
+      <w:proofErr w:type="spellEnd"/>
+      <w:r>
+        <w:rPr>
+          <w:rFonts w:ascii="Times New Roman" w:hAnsi="Times New Roman" w:cs="Times New Roman"/>
+          <w:color w:val="171719" w:themeColor="background1" w:themeShade="1A"/>
+          <w:sz w:val="28"/>
+        </w:rPr>
+        <w:t xml:space="preserve"> можно отнести к процессу прогнозирования временных рядов.</w:t>
+      </w:r>
+    </w:p>
+    <w:p>
+      <w:pPr>
+        <w:pStyle w:val="a7"/>
+        <w:numPr>
+          <w:ilvl w:val="0"/>
+          <w:numId w:val="15"/>
+        </w:numPr>
+        <w:spacing w:after="0" w:line="300" w:lineRule="auto"/>
+        <w:jc w:val="both"/>
+        <w:rPr>
+          <w:rFonts w:ascii="Times New Roman" w:hAnsi="Times New Roman" w:cs="Times New Roman"/>
+          <w:color w:val="171719" w:themeColor="background1" w:themeShade="1A"/>
+          <w:sz w:val="28"/>
+        </w:rPr>
+      </w:pPr>
+      <w:r>
+        <w:rPr>
+          <w:rFonts w:ascii="Times New Roman" w:hAnsi="Times New Roman" w:cs="Times New Roman"/>
+          <w:color w:val="171719" w:themeColor="background1" w:themeShade="1A"/>
+          <w:sz w:val="28"/>
+        </w:rPr>
+        <w:t>Кластеризация. Для изучения и сортировки большого объема неразмеченных данных в условиях, когда неизвестно количество классов на выходе, то есть для объединения данных по признакам. Например, кластеризация применяется для выявления классов картинок и сегментации клиентов.</w:t>
+      </w:r>
+    </w:p>
+    <w:p>
+      <w:pPr>
+        <w:pStyle w:val="a7"/>
+        <w:numPr>
+          <w:ilvl w:val="0"/>
+          <w:numId w:val="15"/>
+        </w:numPr>
+        <w:spacing w:after="0" w:line="300" w:lineRule="auto"/>
+        <w:jc w:val="both"/>
+        <w:rPr>
+          <w:rFonts w:ascii="Times New Roman" w:hAnsi="Times New Roman" w:cs="Times New Roman"/>
+          <w:color w:val="171719" w:themeColor="background1" w:themeShade="1A"/>
+          <w:sz w:val="28"/>
+        </w:rPr>
+      </w:pPr>
+      <w:r>
+        <w:rPr>
+          <w:rFonts w:ascii="Times New Roman" w:hAnsi="Times New Roman" w:cs="Times New Roman"/>
+          <w:color w:val="171719" w:themeColor="background1" w:themeShade="1A"/>
+          <w:sz w:val="28"/>
+        </w:rPr>
+        <w:t xml:space="preserve">Генерация. Для автоматизированного создания контента или его трансформации. Генерация с помощью </w:t>
+      </w:r>
+      <w:proofErr w:type="spellStart"/>
+      <w:r>
+        <w:rPr>
+          <w:rFonts w:ascii="Times New Roman" w:hAnsi="Times New Roman" w:cs="Times New Roman"/>
+          <w:color w:val="171719" w:themeColor="background1" w:themeShade="1A"/>
+          <w:sz w:val="28"/>
+        </w:rPr>
+        <w:t>нейросетей</w:t>
+      </w:r>
+      <w:proofErr w:type="spellEnd"/>
+      <w:r>
+        <w:rPr>
+          <w:rFonts w:ascii="Times New Roman" w:hAnsi="Times New Roman" w:cs="Times New Roman"/>
+          <w:color w:val="171719" w:themeColor="background1" w:themeShade="1A"/>
+          <w:sz w:val="28"/>
+        </w:rPr>
+        <w:t xml:space="preserve"> применяется для создания уникальных текстов, аудиофайлов, видео, раскрашивания черно-белых фильмов и даже изменения окружающей среды на фото.</w:t>
+      </w:r>
+    </w:p>
+    <w:p>
+      <w:pPr>
+        <w:pStyle w:val="a7"/>
+        <w:spacing w:after="0"/>
+        <w:ind w:left="375"/>
+        <w:jc w:val="both"/>
+        <w:rPr>
+          <w:rFonts w:ascii="Times New Roman" w:hAnsi="Times New Roman" w:cs="Times New Roman"/>
+          <w:color w:val="171719" w:themeColor="background1" w:themeShade="1A"/>
+          <w:sz w:val="28"/>
+        </w:rPr>
+      </w:pPr>
+    </w:p>
+    <w:p>
+      <w:pPr>
+        <w:pStyle w:val="a7"/>
+        <w:spacing w:after="0"/>
+        <w:ind w:left="375"/>
+        <w:jc w:val="both"/>
+        <w:rPr>
+          <w:rFonts w:ascii="Times New Roman" w:hAnsi="Times New Roman" w:cs="Times New Roman"/>
+          <w:color w:val="171719" w:themeColor="background1" w:themeShade="1A"/>
+          <w:sz w:val="28"/>
+        </w:rPr>
+      </w:pPr>
+    </w:p>
+    <w:p>
+      <w:pPr>
+        <w:pStyle w:val="a7"/>
+        <w:numPr>
+          <w:ilvl w:val="1"/>
+          <w:numId w:val="12"/>
+        </w:numPr>
+        <w:spacing w:after="0"/>
+        <w:jc w:val="both"/>
+        <w:rPr>
+          <w:rFonts w:ascii="Times New Roman" w:hAnsi="Times New Roman" w:cs="Times New Roman"/>
+          <w:b/>
+          <w:color w:val="171719" w:themeColor="background1" w:themeShade="1A"/>
+          <w:sz w:val="28"/>
+        </w:rPr>
+      </w:pPr>
+      <w:r>
+        <w:rPr>
+          <w:rFonts w:ascii="Times New Roman" w:hAnsi="Times New Roman" w:cs="Times New Roman"/>
+          <w:b/>
+          <w:color w:val="171719" w:themeColor="background1" w:themeShade="1A"/>
+          <w:sz w:val="28"/>
+        </w:rPr>
+        <w:lastRenderedPageBreak/>
+        <w:t xml:space="preserve"> Обучение нейронной сети</w:t>
+      </w:r>
+    </w:p>
+    <w:p>
+      <w:pPr>
+        <w:pStyle w:val="a7"/>
+        <w:spacing w:after="0"/>
+        <w:ind w:left="375"/>
+        <w:jc w:val="both"/>
+        <w:rPr>
+          <w:rFonts w:ascii="Times New Roman" w:hAnsi="Times New Roman" w:cs="Times New Roman"/>
+          <w:b/>
+          <w:color w:val="171719" w:themeColor="background1" w:themeShade="1A"/>
+          <w:sz w:val="28"/>
+        </w:rPr>
+      </w:pPr>
+    </w:p>
+    <w:p>
+      <w:pPr>
+        <w:pStyle w:val="a7"/>
+        <w:spacing w:after="0"/>
+        <w:ind w:left="0" w:firstLine="333"/>
+        <w:jc w:val="both"/>
+        <w:rPr>
+          <w:rFonts w:ascii="Times New Roman" w:hAnsi="Times New Roman" w:cs="Times New Roman"/>
+          <w:color w:val="171719" w:themeColor="background1" w:themeShade="1A"/>
+          <w:sz w:val="28"/>
+        </w:rPr>
+      </w:pPr>
+      <w:r>
+        <w:rPr>
+          <w:rFonts w:ascii="Times New Roman" w:hAnsi="Times New Roman" w:cs="Times New Roman"/>
+          <w:color w:val="171719" w:themeColor="background1" w:themeShade="1A"/>
+          <w:sz w:val="28"/>
+        </w:rPr>
+        <w:t>Обучение нейронной сети — это процесс обучения нейронной сети выполнению задачи. Нейронные сети обучаются путем первичной обработки нескольких больших наборов размеченных или неразмеченных данных. На основе этих примеров сети могут более точно обрабатывать неизвестные входные данные.</w:t>
+      </w:r>
+    </w:p>
+    <w:p>
+      <w:pPr>
+        <w:pStyle w:val="a7"/>
+        <w:spacing w:after="0"/>
+        <w:ind w:left="0" w:firstLine="333"/>
+        <w:jc w:val="both"/>
+        <w:rPr>
+          <w:rFonts w:ascii="Times New Roman" w:hAnsi="Times New Roman" w:cs="Times New Roman"/>
+          <w:color w:val="171719" w:themeColor="background1" w:themeShade="1A"/>
+          <w:sz w:val="28"/>
+        </w:rPr>
+      </w:pPr>
+      <w:r>
+        <w:rPr>
+          <w:rFonts w:ascii="Times New Roman" w:hAnsi="Times New Roman" w:cs="Times New Roman"/>
+          <w:color w:val="171719" w:themeColor="background1" w:themeShade="1A"/>
+          <w:sz w:val="28"/>
+        </w:rPr>
+        <w:t>При контролируемом обучении специалисты по работе с данными предлагают искусственным нейронным сетям помеченные наборы данных, которые заранее дают правильный ответ. Например, сеть глубокого обучения, обучающаяся распознаванию лиц, обрабатывает сотни тысяч изображений человеческих лиц с различными терминами, связанными с этническим происхождением, страной или эмоциями, описывающими каждое изображение.</w:t>
+      </w:r>
+    </w:p>
+    <w:p>
+      <w:pPr>
+        <w:pStyle w:val="a7"/>
+        <w:spacing w:after="0"/>
+        <w:ind w:left="0" w:firstLine="708"/>
+        <w:jc w:val="both"/>
+        <w:rPr>
+          <w:rFonts w:ascii="Times New Roman" w:hAnsi="Times New Roman" w:cs="Times New Roman"/>
+          <w:color w:val="171719" w:themeColor="background1" w:themeShade="1A"/>
+          <w:sz w:val="28"/>
+        </w:rPr>
+      </w:pPr>
+      <w:r>
+        <w:rPr>
+          <w:rFonts w:ascii="Times New Roman" w:hAnsi="Times New Roman" w:cs="Times New Roman"/>
+          <w:color w:val="171719" w:themeColor="background1" w:themeShade="1A"/>
+          <w:sz w:val="28"/>
+        </w:rPr>
+        <w:t>Нейронная сеть медленно накапливает знания из этих наборов данных, которые заранее дают правильный ответ. После обучения сеть начинает делать предположения об этническом происхождении или эмоциях нового изображения человеческого лица, которое она никогда раньше не обрабатывала.</w:t>
+      </w:r>
+    </w:p>
+    <w:p>
+      <w:pPr>
+        <w:pStyle w:val="a7"/>
+        <w:spacing w:after="0"/>
+        <w:ind w:left="0" w:firstLine="708"/>
+        <w:jc w:val="both"/>
+        <w:rPr>
+          <w:rFonts w:ascii="Times New Roman" w:hAnsi="Times New Roman" w:cs="Times New Roman"/>
+          <w:color w:val="171719" w:themeColor="background1" w:themeShade="1A"/>
+          <w:sz w:val="28"/>
+        </w:rPr>
+      </w:pPr>
+      <w:r>
+        <w:rPr>
+          <w:rFonts w:ascii="Times New Roman" w:hAnsi="Times New Roman" w:cs="Times New Roman"/>
+          <w:color w:val="171719" w:themeColor="background1" w:themeShade="1A"/>
+          <w:sz w:val="28"/>
+        </w:rPr>
+        <w:t>Искусственный интеллект — это область компьютерных наук, которая исследует методы предоставления машинам возможности выполнять задачи, требующие человеческого интеллекта. Машинное обучение — это метод искусственного интеллекта, который дает компьютерам доступ к очень большим наборам данных для дальнейшего обучения. Программное обеспечение для машинного обучения находит шаблоны в существующих данных и применяет эти шаблоны к новым данным для принятия разумных решений. Глубокое обучение — это разновидность машинного обучения, в котором для обработки данных используются сети глубокого обучения.</w:t>
+      </w:r>
+    </w:p>
+    <w:p>
+      <w:pPr>
+        <w:pStyle w:val="a7"/>
+        <w:spacing w:after="0"/>
+        <w:ind w:left="0" w:firstLine="708"/>
+        <w:jc w:val="both"/>
+        <w:rPr>
+          <w:rFonts w:ascii="Times New Roman" w:hAnsi="Times New Roman" w:cs="Times New Roman"/>
+          <w:color w:val="171719" w:themeColor="background1" w:themeShade="1A"/>
+          <w:sz w:val="28"/>
+        </w:rPr>
+      </w:pPr>
+      <w:r>
+        <w:rPr>
+          <w:rFonts w:ascii="Times New Roman" w:hAnsi="Times New Roman" w:cs="Times New Roman"/>
+          <w:color w:val="171719" w:themeColor="background1" w:themeShade="1A"/>
+          <w:sz w:val="28"/>
+        </w:rPr>
+        <w:t xml:space="preserve">Традиционные методы машинного обучения требуют участия человека, чтобы программное обеспечение работало должным образом. Специалист по работе с данными вручную определяет набор соответствующих функций, которые должно анализировать программное обеспечение. Это ограничение делает создание и управление программным обеспечением утомительным и </w:t>
+      </w:r>
+      <w:proofErr w:type="spellStart"/>
+      <w:r>
+        <w:rPr>
+          <w:rFonts w:ascii="Times New Roman" w:hAnsi="Times New Roman" w:cs="Times New Roman"/>
+          <w:color w:val="171719" w:themeColor="background1" w:themeShade="1A"/>
+          <w:sz w:val="28"/>
+        </w:rPr>
+        <w:t>трудозатратным</w:t>
+      </w:r>
+      <w:proofErr w:type="spellEnd"/>
+      <w:r>
+        <w:rPr>
+          <w:rFonts w:ascii="Times New Roman" w:hAnsi="Times New Roman" w:cs="Times New Roman"/>
+          <w:color w:val="171719" w:themeColor="background1" w:themeShade="1A"/>
+          <w:sz w:val="28"/>
+        </w:rPr>
+        <w:t xml:space="preserve"> процессом.</w:t>
+      </w:r>
+    </w:p>
+    <w:p>
+      <w:pPr>
+        <w:pStyle w:val="a7"/>
+        <w:spacing w:after="0"/>
+        <w:ind w:left="0" w:firstLine="708"/>
+        <w:jc w:val="both"/>
+        <w:rPr>
+          <w:rFonts w:ascii="Times New Roman" w:hAnsi="Times New Roman" w:cs="Times New Roman"/>
+          <w:color w:val="171719" w:themeColor="background1" w:themeShade="1A"/>
+          <w:sz w:val="28"/>
+        </w:rPr>
+      </w:pPr>
+      <w:r>
+        <w:rPr>
+          <w:rFonts w:ascii="Times New Roman" w:hAnsi="Times New Roman" w:cs="Times New Roman"/>
+          <w:color w:val="171719" w:themeColor="background1" w:themeShade="1A"/>
+          <w:sz w:val="28"/>
+        </w:rPr>
+        <w:t xml:space="preserve">С другой стороны, при глубоком обучении специалист по работе с данными предоставляет программному обеспечению только необработанные данные. Сеть глубокого обучения извлекает функции самостоятельно и обучается более независимо. Она может анализировать </w:t>
+      </w:r>
+      <w:r>
+        <w:rPr>
+          <w:rFonts w:ascii="Times New Roman" w:hAnsi="Times New Roman" w:cs="Times New Roman"/>
+          <w:color w:val="171719" w:themeColor="background1" w:themeShade="1A"/>
+          <w:sz w:val="28"/>
+        </w:rPr>
+        <w:lastRenderedPageBreak/>
+        <w:t xml:space="preserve">неструктурированные наборы данных (например, текстовые документы), определять приоритеты </w:t>
+      </w:r>
+      <w:r>
+        <w:rPr>
+          <w:rFonts w:ascii="Times New Roman" w:hAnsi="Times New Roman" w:cs="Times New Roman"/>
+          <w:color w:val="171719" w:themeColor="background1" w:themeShade="1A"/>
+          <w:sz w:val="28"/>
+        </w:rPr>
+        <w:t>атрибутов,</w:t>
+      </w:r>
+      <w:r>
+        <w:rPr>
+          <w:rFonts w:ascii="Times New Roman" w:hAnsi="Times New Roman" w:cs="Times New Roman"/>
+          <w:color w:val="171719" w:themeColor="background1" w:themeShade="1A"/>
+          <w:sz w:val="28"/>
+        </w:rPr>
+        <w:t xml:space="preserve"> данных и решать более сложные задачи.</w:t>
+      </w:r>
+    </w:p>
+    <w:p>
+      <w:pPr>
+        <w:pStyle w:val="a7"/>
+        <w:spacing w:after="0"/>
+        <w:ind w:left="0" w:firstLine="708"/>
+        <w:jc w:val="both"/>
+        <w:rPr>
+          <w:rFonts w:ascii="Times New Roman" w:hAnsi="Times New Roman" w:cs="Times New Roman"/>
+          <w:color w:val="171719" w:themeColor="background1" w:themeShade="1A"/>
+          <w:sz w:val="28"/>
+        </w:rPr>
+      </w:pPr>
+      <w:r>
+        <w:rPr>
+          <w:rFonts w:ascii="Times New Roman" w:hAnsi="Times New Roman" w:cs="Times New Roman"/>
+          <w:color w:val="171719" w:themeColor="background1" w:themeShade="1A"/>
+          <w:sz w:val="28"/>
+        </w:rPr>
+        <w:t>Например, при обучении программного обеспечения с алгоритмами машинного обучения правильно идентифицировать изображение домашнего животного вам потребуется выполнить следующие шаги:</w:t>
+      </w:r>
+    </w:p>
+    <w:p>
+      <w:pPr>
+        <w:pStyle w:val="a7"/>
+        <w:spacing w:after="0"/>
+        <w:ind w:left="0" w:firstLine="708"/>
+        <w:jc w:val="both"/>
+        <w:rPr>
+          <w:rFonts w:ascii="Times New Roman" w:hAnsi="Times New Roman" w:cs="Times New Roman"/>
+          <w:color w:val="171719" w:themeColor="background1" w:themeShade="1A"/>
+          <w:sz w:val="28"/>
+        </w:rPr>
+      </w:pPr>
+      <w:r>
+        <w:rPr>
+          <w:rFonts w:ascii="Times New Roman" w:hAnsi="Times New Roman" w:cs="Times New Roman"/>
+          <w:color w:val="171719" w:themeColor="background1" w:themeShade="1A"/>
+          <w:sz w:val="28"/>
+        </w:rPr>
+        <w:t>Найти и вручную отметить тысячи изображений домашних животных: кошек, собак, лошадей, хомяков, попугаев и т. д.</w:t>
+      </w:r>
+    </w:p>
+    <w:p>
+      <w:pPr>
+        <w:pStyle w:val="a7"/>
+        <w:spacing w:after="0"/>
+        <w:ind w:left="0" w:firstLine="708"/>
+        <w:jc w:val="both"/>
+        <w:rPr>
+          <w:rFonts w:ascii="Times New Roman" w:hAnsi="Times New Roman" w:cs="Times New Roman"/>
+          <w:color w:val="171719" w:themeColor="background1" w:themeShade="1A"/>
+          <w:sz w:val="28"/>
+        </w:rPr>
+      </w:pPr>
+      <w:r>
+        <w:rPr>
+          <w:rFonts w:ascii="Times New Roman" w:hAnsi="Times New Roman" w:cs="Times New Roman"/>
+          <w:color w:val="171719" w:themeColor="background1" w:themeShade="1A"/>
+          <w:sz w:val="28"/>
+        </w:rPr>
+        <w:t>Сообщить программному обеспечению с алгоритмами машинного обучения, какие функции необходимо найти, чтобы оно могло идентифицировать изображение методом исключения. Например, оно может подсчитать количество ног, а затем проверить форму глаз, ушей, хвоста, цвет меха и так далее.</w:t>
+      </w:r>
+    </w:p>
+    <w:p>
+      <w:pPr>
+        <w:pStyle w:val="a7"/>
+        <w:spacing w:after="0"/>
+        <w:ind w:left="0" w:firstLine="708"/>
+        <w:jc w:val="both"/>
+        <w:rPr>
+          <w:rFonts w:ascii="Times New Roman" w:hAnsi="Times New Roman" w:cs="Times New Roman"/>
+          <w:color w:val="171719" w:themeColor="background1" w:themeShade="1A"/>
+          <w:sz w:val="28"/>
+        </w:rPr>
+      </w:pPr>
+      <w:r>
+        <w:rPr>
+          <w:rFonts w:ascii="Times New Roman" w:hAnsi="Times New Roman" w:cs="Times New Roman"/>
+          <w:color w:val="171719" w:themeColor="background1" w:themeShade="1A"/>
+          <w:sz w:val="28"/>
+        </w:rPr>
+        <w:t>Вручную оценить и изменить помеченные наборы данных, чтобы повысить точность программного обеспечения. Например, если в вашем тренировочном наборе слишком много изображений черных кошек, программное обеспечение правильно определит черную кошку, но не белую.</w:t>
+      </w:r>
+    </w:p>
+    <w:p>
+      <w:pPr>
+        <w:pStyle w:val="a7"/>
+        <w:spacing w:after="0"/>
+        <w:ind w:left="0" w:firstLine="708"/>
+        <w:jc w:val="both"/>
+        <w:rPr>
+          <w:rFonts w:ascii="Times New Roman" w:hAnsi="Times New Roman" w:cs="Times New Roman"/>
+          <w:color w:val="171719" w:themeColor="background1" w:themeShade="1A"/>
+          <w:sz w:val="28"/>
+        </w:rPr>
+      </w:pPr>
+      <w:r>
+        <w:rPr>
+          <w:rFonts w:ascii="Times New Roman" w:hAnsi="Times New Roman" w:cs="Times New Roman"/>
+          <w:color w:val="171719" w:themeColor="background1" w:themeShade="1A"/>
+          <w:sz w:val="28"/>
+        </w:rPr>
+        <w:t>При глубоком обучении нейронные сети будут обрабатывать все изображения и автоматически определять, что сначала им требуется проанализировать количество ног и форму морды, а уже после посмотреть на хвосты, чтобы правильно идентифицировать животное на изображении.</w:t>
+      </w:r>
+    </w:p>
+    <w:p>
+      <w:pPr>
+        <w:pStyle w:val="a7"/>
+        <w:spacing w:after="0"/>
+        <w:ind w:left="375"/>
+        <w:jc w:val="both"/>
+        <w:rPr>
+          <w:rFonts w:ascii="Times New Roman" w:hAnsi="Times New Roman" w:cs="Times New Roman"/>
+          <w:b/>
+          <w:color w:val="171719" w:themeColor="background1" w:themeShade="1A"/>
+          <w:sz w:val="28"/>
+        </w:rPr>
+      </w:pPr>
+    </w:p>
+    <w:p>
+      <w:pPr>
+        <w:pStyle w:val="a7"/>
+        <w:spacing w:after="0"/>
+        <w:ind w:left="375"/>
+        <w:jc w:val="both"/>
+        <w:rPr>
+          <w:rFonts w:ascii="Times New Roman" w:hAnsi="Times New Roman" w:cs="Times New Roman"/>
+          <w:b/>
+          <w:color w:val="171719" w:themeColor="background1" w:themeShade="1A"/>
+          <w:sz w:val="28"/>
+        </w:rPr>
+      </w:pPr>
+    </w:p>
+    <w:p>
+      <w:pPr>
+        <w:pStyle w:val="a7"/>
+        <w:spacing w:after="0"/>
+        <w:ind w:left="375"/>
+        <w:jc w:val="both"/>
+        <w:rPr>
+          <w:rFonts w:ascii="Times New Roman" w:hAnsi="Times New Roman" w:cs="Times New Roman"/>
+          <w:b/>
+          <w:color w:val="171719" w:themeColor="background1" w:themeShade="1A"/>
+          <w:sz w:val="28"/>
+        </w:rPr>
+      </w:pPr>
+    </w:p>
+    <w:p>
+      <w:pPr>
+        <w:pStyle w:val="a7"/>
+        <w:spacing w:after="0"/>
+        <w:ind w:left="375"/>
+        <w:jc w:val="both"/>
+        <w:rPr>
+          <w:rFonts w:ascii="Times New Roman" w:hAnsi="Times New Roman" w:cs="Times New Roman"/>
+          <w:b/>
+          <w:color w:val="171719" w:themeColor="background1" w:themeShade="1A"/>
+          <w:sz w:val="28"/>
+        </w:rPr>
+      </w:pPr>
+    </w:p>
+    <w:p>
+      <w:pPr>
+        <w:pStyle w:val="a7"/>
+        <w:spacing w:after="0"/>
+        <w:ind w:left="375"/>
+        <w:jc w:val="both"/>
+        <w:rPr>
+          <w:rFonts w:ascii="Times New Roman" w:hAnsi="Times New Roman" w:cs="Times New Roman"/>
+          <w:b/>
+          <w:color w:val="171719" w:themeColor="background1" w:themeShade="1A"/>
+          <w:sz w:val="28"/>
+        </w:rPr>
+      </w:pPr>
+    </w:p>
+    <w:p>
+      <w:pPr>
+        <w:pStyle w:val="a7"/>
+        <w:spacing w:after="0"/>
+        <w:ind w:left="375"/>
+        <w:jc w:val="both"/>
+        <w:rPr>
+          <w:rFonts w:ascii="Times New Roman" w:hAnsi="Times New Roman" w:cs="Times New Roman"/>
+          <w:b/>
+          <w:color w:val="171719" w:themeColor="background1" w:themeShade="1A"/>
+          <w:sz w:val="28"/>
+        </w:rPr>
+      </w:pPr>
+    </w:p>
+    <w:p>
+      <w:pPr>
+        <w:pStyle w:val="a7"/>
+        <w:spacing w:after="0"/>
+        <w:ind w:left="375"/>
+        <w:jc w:val="both"/>
+        <w:rPr>
+          <w:rFonts w:ascii="Times New Roman" w:hAnsi="Times New Roman" w:cs="Times New Roman"/>
+          <w:b/>
+          <w:color w:val="171719" w:themeColor="background1" w:themeShade="1A"/>
+          <w:sz w:val="28"/>
+        </w:rPr>
+      </w:pPr>
+    </w:p>
+    <w:p>
+      <w:pPr>
+        <w:pStyle w:val="a7"/>
+        <w:spacing w:after="0"/>
+        <w:ind w:left="375"/>
+        <w:jc w:val="both"/>
+        <w:rPr>
+          <w:rFonts w:ascii="Times New Roman" w:hAnsi="Times New Roman" w:cs="Times New Roman"/>
+          <w:b/>
+          <w:color w:val="171719" w:themeColor="background1" w:themeShade="1A"/>
+          <w:sz w:val="28"/>
+        </w:rPr>
+      </w:pPr>
+    </w:p>
+    <w:p>
+      <w:pPr>
+        <w:pStyle w:val="a7"/>
+        <w:spacing w:after="0"/>
+        <w:ind w:left="375"/>
+        <w:jc w:val="both"/>
+        <w:rPr>
+          <w:rFonts w:ascii="Times New Roman" w:hAnsi="Times New Roman" w:cs="Times New Roman"/>
+          <w:b/>
+          <w:color w:val="171719" w:themeColor="background1" w:themeShade="1A"/>
+          <w:sz w:val="28"/>
+        </w:rPr>
+      </w:pPr>
+    </w:p>
+    <w:p>
+      <w:pPr>
+        <w:pStyle w:val="a7"/>
+        <w:spacing w:after="0"/>
+        <w:ind w:left="375"/>
+        <w:jc w:val="both"/>
+        <w:rPr>
+          <w:rFonts w:ascii="Times New Roman" w:hAnsi="Times New Roman" w:cs="Times New Roman"/>
+          <w:b/>
+          <w:color w:val="171719" w:themeColor="background1" w:themeShade="1A"/>
+          <w:sz w:val="28"/>
+        </w:rPr>
+      </w:pPr>
+    </w:p>
+    <w:p>
+      <w:pPr>
+        <w:pStyle w:val="a7"/>
+        <w:spacing w:after="0"/>
+        <w:ind w:left="375"/>
+        <w:jc w:val="both"/>
+        <w:rPr>
+          <w:rFonts w:ascii="Times New Roman" w:hAnsi="Times New Roman" w:cs="Times New Roman"/>
+          <w:b/>
+          <w:color w:val="171719" w:themeColor="background1" w:themeShade="1A"/>
+          <w:sz w:val="28"/>
+        </w:rPr>
+      </w:pPr>
+    </w:p>
+    <w:p>
+      <w:pPr>
+        <w:pStyle w:val="a7"/>
+        <w:spacing w:after="0"/>
+        <w:ind w:left="375"/>
+        <w:jc w:val="both"/>
+        <w:rPr>
+          <w:rFonts w:ascii="Times New Roman" w:hAnsi="Times New Roman" w:cs="Times New Roman"/>
+          <w:b/>
+          <w:color w:val="171719" w:themeColor="background1" w:themeShade="1A"/>
+          <w:sz w:val="28"/>
+        </w:rPr>
+      </w:pPr>
+    </w:p>
+    <w:p>
+      <w:pPr>
+        <w:pStyle w:val="a7"/>
+        <w:spacing w:after="0"/>
+        <w:ind w:left="375"/>
+        <w:jc w:val="both"/>
+        <w:rPr>
+          <w:rFonts w:ascii="Times New Roman" w:hAnsi="Times New Roman" w:cs="Times New Roman"/>
+          <w:b/>
+          <w:color w:val="171719" w:themeColor="background1" w:themeShade="1A"/>
+          <w:sz w:val="28"/>
+        </w:rPr>
+      </w:pPr>
+    </w:p>
+    <w:p>
+      <w:pPr>
+        <w:pStyle w:val="a7"/>
+        <w:spacing w:after="0"/>
+        <w:ind w:left="375"/>
+        <w:jc w:val="both"/>
+        <w:rPr>
+          <w:rFonts w:ascii="Times New Roman" w:hAnsi="Times New Roman" w:cs="Times New Roman"/>
+          <w:b/>
+          <w:color w:val="171719" w:themeColor="background1" w:themeShade="1A"/>
+          <w:sz w:val="28"/>
+        </w:rPr>
+      </w:pPr>
+    </w:p>
+    <w:p>
+      <w:pPr>
+        <w:pStyle w:val="a7"/>
+        <w:spacing w:after="0"/>
+        <w:ind w:left="375"/>
+        <w:jc w:val="both"/>
+        <w:rPr>
+          <w:rFonts w:ascii="Times New Roman" w:hAnsi="Times New Roman" w:cs="Times New Roman"/>
+          <w:b/>
+          <w:color w:val="171719" w:themeColor="background1" w:themeShade="1A"/>
+          <w:sz w:val="28"/>
+        </w:rPr>
+      </w:pPr>
+    </w:p>
+    <w:p>
+      <w:pPr>
+        <w:pStyle w:val="a7"/>
+        <w:spacing w:after="0"/>
+        <w:ind w:left="375"/>
+        <w:jc w:val="both"/>
+        <w:rPr>
+          <w:rFonts w:ascii="Times New Roman" w:hAnsi="Times New Roman" w:cs="Times New Roman"/>
+          <w:b/>
+          <w:color w:val="171719" w:themeColor="background1" w:themeShade="1A"/>
+          <w:sz w:val="28"/>
+        </w:rPr>
+      </w:pPr>
+    </w:p>
+    <w:p>
+      <w:pPr>
+        <w:pStyle w:val="a7"/>
+        <w:spacing w:after="0"/>
+        <w:ind w:left="375"/>
+        <w:jc w:val="both"/>
+        <w:rPr>
+          <w:rFonts w:ascii="Times New Roman" w:hAnsi="Times New Roman" w:cs="Times New Roman"/>
+          <w:b/>
+          <w:color w:val="171719" w:themeColor="background1" w:themeShade="1A"/>
+          <w:sz w:val="28"/>
+        </w:rPr>
+      </w:pPr>
+    </w:p>
+    <w:p>
+      <w:pPr>
+        <w:pStyle w:val="a7"/>
+        <w:spacing w:after="0"/>
+        <w:ind w:left="375"/>
+        <w:jc w:val="both"/>
+        <w:rPr>
+          <w:rFonts w:ascii="Times New Roman" w:hAnsi="Times New Roman" w:cs="Times New Roman"/>
+          <w:b/>
+          <w:color w:val="171719" w:themeColor="background1" w:themeShade="1A"/>
+          <w:sz w:val="28"/>
+        </w:rPr>
+      </w:pPr>
+    </w:p>
+    <w:p>
+      <w:pPr>
+        <w:pStyle w:val="a7"/>
+        <w:spacing w:after="0"/>
+        <w:ind w:left="375"/>
+        <w:jc w:val="both"/>
+        <w:rPr>
+          <w:rFonts w:ascii="Times New Roman" w:hAnsi="Times New Roman" w:cs="Times New Roman"/>
+          <w:b/>
+          <w:color w:val="171719" w:themeColor="background1" w:themeShade="1A"/>
+          <w:sz w:val="28"/>
+        </w:rPr>
+      </w:pPr>
+    </w:p>
+    <w:p>
+      <w:pPr>
+        <w:spacing w:after="0"/>
+        <w:jc w:val="both"/>
+        <w:rPr>
+          <w:rFonts w:ascii="Times New Roman" w:hAnsi="Times New Roman" w:cs="Times New Roman"/>
+          <w:b/>
+          <w:color w:val="171719" w:themeColor="background1" w:themeShade="1A"/>
+          <w:sz w:val="28"/>
+        </w:rPr>
+      </w:pPr>
+      <w:r>
+        <w:rPr>
+          <w:rFonts w:ascii="Times New Roman" w:hAnsi="Times New Roman" w:cs="Times New Roman"/>
+          <w:b/>
+          <w:color w:val="171719" w:themeColor="background1" w:themeShade="1A"/>
           <w:sz w:val="28"/>
         </w:rPr>
         <w:lastRenderedPageBreak/>
@@ -3984,7 +5022,7 @@
         <w:rPr>
           <w:rFonts w:ascii="Times New Roman" w:hAnsi="Times New Roman" w:cs="Times New Roman"/>
           <w:b/>
-          <w:color w:val="1A1A1A" w:themeColor="background1" w:themeShade="1A"/>
+          <w:color w:val="171719" w:themeColor="background1" w:themeShade="1A"/>
           <w:sz w:val="28"/>
         </w:rPr>
         <w:t xml:space="preserve"> </w:t>
@@ -3993,7 +5031,7 @@
         <w:rPr>
           <w:rFonts w:ascii="Times New Roman" w:hAnsi="Times New Roman" w:cs="Times New Roman"/>
           <w:b/>
-          <w:color w:val="1A1A1A" w:themeColor="background1" w:themeShade="1A"/>
+          <w:color w:val="171719" w:themeColor="background1" w:themeShade="1A"/>
           <w:sz w:val="28"/>
         </w:rPr>
         <w:t>Выбор активационной функции</w:t>
@@ -4019,22 +5057,244 @@
       <w:r>
         <w:rPr>
           <w:rFonts w:ascii="Times New Roman" w:hAnsi="Times New Roman" w:cs="Times New Roman"/>
+          <w:sz w:val="28"/>
+          <w:szCs w:val="28"/>
+        </w:rPr>
+        <w:t xml:space="preserve">Для реализации работы нейронной сети </w:t>
+      </w:r>
+      <w:r>
+        <w:rPr>
+          <w:rFonts w:ascii="Times New Roman" w:hAnsi="Times New Roman" w:cs="Times New Roman"/>
+          <w:sz w:val="28"/>
+          <w:szCs w:val="28"/>
+        </w:rPr>
+        <w:t xml:space="preserve">изначально было </w:t>
+      </w:r>
+      <w:r>
+        <w:rPr>
+          <w:rFonts w:ascii="Times New Roman" w:hAnsi="Times New Roman" w:cs="Times New Roman"/>
+          <w:sz w:val="28"/>
+          <w:szCs w:val="28"/>
+        </w:rPr>
+        <w:t>необходимо выбрать</w:t>
+      </w:r>
+      <w:r>
+        <w:rPr>
+          <w:rFonts w:ascii="Times New Roman" w:hAnsi="Times New Roman" w:cs="Times New Roman"/>
+          <w:sz w:val="28"/>
+          <w:szCs w:val="28"/>
+        </w:rPr>
+        <w:t xml:space="preserve"> одну из выше представленных</w:t>
+      </w:r>
+      <w:r>
+        <w:rPr>
+          <w:rFonts w:ascii="Times New Roman" w:hAnsi="Times New Roman" w:cs="Times New Roman"/>
+          <w:sz w:val="28"/>
+          <w:szCs w:val="28"/>
+        </w:rPr>
+        <w:t xml:space="preserve"> активационн</w:t>
+      </w:r>
+      <w:r>
+        <w:rPr>
+          <w:rFonts w:ascii="Times New Roman" w:hAnsi="Times New Roman" w:cs="Times New Roman"/>
+          <w:sz w:val="28"/>
+          <w:szCs w:val="28"/>
+        </w:rPr>
+        <w:t>ых</w:t>
+      </w:r>
+      <w:r>
+        <w:rPr>
+          <w:rFonts w:ascii="Times New Roman" w:hAnsi="Times New Roman" w:cs="Times New Roman"/>
+          <w:sz w:val="28"/>
+          <w:szCs w:val="28"/>
+        </w:rPr>
+        <w:t xml:space="preserve"> функци</w:t>
+      </w:r>
+      <w:r>
+        <w:rPr>
+          <w:rFonts w:ascii="Times New Roman" w:hAnsi="Times New Roman" w:cs="Times New Roman"/>
+          <w:sz w:val="28"/>
+          <w:szCs w:val="28"/>
+        </w:rPr>
+        <w:t>й</w:t>
+      </w:r>
+      <w:r>
+        <w:rPr>
+          <w:rFonts w:ascii="Times New Roman" w:hAnsi="Times New Roman" w:cs="Times New Roman"/>
+          <w:sz w:val="28"/>
+          <w:szCs w:val="28"/>
+        </w:rPr>
+        <w:t xml:space="preserve"> нейрона. </w:t>
+      </w:r>
+      <w:r>
+        <w:rPr>
+          <w:rFonts w:ascii="Times New Roman" w:hAnsi="Times New Roman" w:cs="Times New Roman"/>
+          <w:sz w:val="28"/>
+          <w:szCs w:val="28"/>
+        </w:rPr>
+        <w:t>Основным претендентом</w:t>
+      </w:r>
+      <w:r>
+        <w:rPr>
+          <w:rFonts w:ascii="Times New Roman" w:hAnsi="Times New Roman" w:cs="Times New Roman"/>
+          <w:sz w:val="28"/>
+          <w:szCs w:val="28"/>
+        </w:rPr>
+        <w:t xml:space="preserve"> стала </w:t>
+      </w:r>
+      <w:r>
+        <w:rPr>
+          <w:rFonts w:ascii="Times New Roman" w:hAnsi="Times New Roman" w:cs="Times New Roman"/>
+          <w:sz w:val="28"/>
+          <w:szCs w:val="28"/>
+        </w:rPr>
+        <w:t>функция, выраженная на основе «</w:t>
+      </w:r>
+      <w:r>
+        <w:rPr>
+          <w:rFonts w:ascii="Times New Roman" w:hAnsi="Times New Roman" w:cs="Times New Roman"/>
+          <w:sz w:val="28"/>
+          <w:szCs w:val="28"/>
+        </w:rPr>
+        <w:t>Rectified Linear Unit</w:t>
+      </w:r>
+      <w:r>
+        <w:rPr>
+          <w:rFonts w:ascii="Times New Roman" w:hAnsi="Times New Roman" w:cs="Times New Roman"/>
+          <w:sz w:val="28"/>
+          <w:szCs w:val="28"/>
+        </w:rPr>
+        <w:t>», или в сокращении «</w:t>
+      </w:r>
+      <w:r>
+        <w:rPr>
+          <w:rFonts w:ascii="Times New Roman" w:hAnsi="Times New Roman" w:cs="Times New Roman"/>
+          <w:sz w:val="28"/>
+          <w:szCs w:val="28"/>
+          <w:lang w:val="en-US"/>
+        </w:rPr>
+        <w:t>ReLU</w:t>
+      </w:r>
+      <w:r>
+        <w:rPr>
+          <w:rFonts w:ascii="Times New Roman" w:hAnsi="Times New Roman" w:cs="Times New Roman"/>
+          <w:sz w:val="28"/>
+          <w:szCs w:val="28"/>
+        </w:rPr>
+        <w:t xml:space="preserve">». </w:t>
+      </w:r>
+      <w:r>
+        <w:rPr>
+          <w:rFonts w:ascii="Times New Roman" w:hAnsi="Times New Roman" w:cs="Times New Roman"/>
+          <w:sz w:val="28"/>
+          <w:szCs w:val="28"/>
+        </w:rPr>
+        <w:t>Говоря про «родительскую» функцию, можно отметить то, что и</w:t>
+      </w:r>
+      <w:r>
+        <w:rPr>
+          <w:rFonts w:ascii="Times New Roman" w:hAnsi="Times New Roman" w:cs="Times New Roman"/>
+          <w:sz w:val="28"/>
+          <w:szCs w:val="28"/>
+        </w:rPr>
+        <w:t xml:space="preserve">менно </w:t>
+      </w:r>
+      <w:r>
+        <w:rPr>
+          <w:rFonts w:ascii="Times New Roman" w:hAnsi="Times New Roman" w:cs="Times New Roman"/>
+          <w:sz w:val="28"/>
+          <w:szCs w:val="28"/>
+        </w:rPr>
+        <w:t>она наиболее</w:t>
+      </w:r>
+      <w:r>
+        <w:rPr>
+          <w:rFonts w:ascii="Times New Roman" w:hAnsi="Times New Roman" w:cs="Times New Roman"/>
+          <w:sz w:val="28"/>
+          <w:szCs w:val="28"/>
+        </w:rPr>
+        <w:t xml:space="preserve"> часто используе</w:t>
+      </w:r>
+      <w:r>
+        <w:rPr>
+          <w:rFonts w:ascii="Times New Roman" w:hAnsi="Times New Roman" w:cs="Times New Roman"/>
+          <w:sz w:val="28"/>
+          <w:szCs w:val="28"/>
+        </w:rPr>
+        <w:t>тся</w:t>
+      </w:r>
+      <w:r>
+        <w:rPr>
+          <w:rFonts w:ascii="Times New Roman" w:hAnsi="Times New Roman" w:cs="Times New Roman"/>
+          <w:sz w:val="28"/>
+          <w:szCs w:val="28"/>
+        </w:rPr>
+        <w:t xml:space="preserve"> </w:t>
+      </w:r>
+      <w:r>
+        <w:rPr>
+          <w:rFonts w:ascii="Times New Roman" w:hAnsi="Times New Roman" w:cs="Times New Roman"/>
+          <w:sz w:val="28"/>
+          <w:szCs w:val="28"/>
+        </w:rPr>
+        <w:t xml:space="preserve">для </w:t>
+      </w:r>
+      <w:r>
+        <w:rPr>
+          <w:rFonts w:ascii="Times New Roman" w:hAnsi="Times New Roman" w:cs="Times New Roman"/>
+          <w:sz w:val="28"/>
+          <w:szCs w:val="28"/>
+        </w:rPr>
+        <w:t>активации при глубоком обучении</w:t>
+      </w:r>
+      <w:r>
+        <w:rPr>
+          <w:rFonts w:ascii="Times New Roman" w:hAnsi="Times New Roman" w:cs="Times New Roman"/>
+          <w:sz w:val="28"/>
+          <w:szCs w:val="28"/>
+        </w:rPr>
+        <w:t>.</w:t>
+      </w:r>
+      <w:r>
+        <w:rPr>
           <w:noProof/>
-          <w:sz w:val="28"/>
-          <w:szCs w:val="28"/>
           <w:lang w:eastAsia="ru-RU"/>
         </w:rPr>
+        <w:t xml:space="preserve"> </w:t>
+      </w:r>
+    </w:p>
+    <w:p>
+      <w:pPr>
+        <w:spacing w:after="0" w:line="300" w:lineRule="auto"/>
+        <w:contextualSpacing/>
+        <w:jc w:val="center"/>
+        <w:rPr>
+          <w:rFonts w:ascii="Times New Roman" w:hAnsi="Times New Roman" w:cs="Times New Roman"/>
+          <w:noProof/>
+          <w:sz w:val="28"/>
+          <w:szCs w:val="28"/>
+          <w:lang w:eastAsia="ru-RU"/>
+        </w:rPr>
+      </w:pPr>
+      <w:r>
+        <w:rPr>
+          <w:rFonts w:ascii="Times New Roman" w:hAnsi="Times New Roman" w:cs="Times New Roman"/>
+          <w:noProof/>
+          <w:sz w:val="28"/>
+          <w:szCs w:val="28"/>
+          <w:lang w:eastAsia="ru-RU"/>
+        </w:rPr>
         <w:drawing>
-          <wp:anchor distT="0" distB="0" distL="114300" distR="114300" simplePos="0" relativeHeight="251658240" behindDoc="1" locked="0" layoutInCell="1" allowOverlap="1" wp14:anchorId="1C5FB278" wp14:editId="1E4E782B">
+          <wp:anchor distT="0" distB="0" distL="114300" distR="114300" simplePos="0" relativeHeight="251658240" behindDoc="1" locked="0" layoutInCell="1" allowOverlap="1" wp14:anchorId="13B87DAB" wp14:editId="27B9C836">
             <wp:simplePos x="0" y="0"/>
             <wp:positionH relativeFrom="margin">
-              <wp:posOffset>932526</wp:posOffset>
+              <wp:posOffset>1438275</wp:posOffset>
             </wp:positionH>
             <wp:positionV relativeFrom="paragraph">
-              <wp:posOffset>1486477</wp:posOffset>
+              <wp:posOffset>46355</wp:posOffset>
             </wp:positionV>
-            <wp:extent cx="3880485" cy="2168525"/>
-            <wp:effectExtent l="0" t="0" r="5715" b="3175"/>
+            <wp:extent cx="2771775" cy="1548765"/>
+            <wp:effectExtent l="0" t="0" r="9525" b="0"/>
             <wp:wrapTopAndBottom/>
             <wp:docPr id="1" name="Рисунок 1"/>
             <wp:cNvGraphicFramePr>
@@ -4062,7 +5322,7 @@
                   <pic:spPr>
                     <a:xfrm>
                       <a:off x="0" y="0"/>
-                      <a:ext cx="3880485" cy="2168525"/>
+                      <a:ext cx="2771775" cy="1548765"/>
                     </a:xfrm>
                     <a:prstGeom prst="rect">
                       <a:avLst/>
@@ -4080,228 +5340,6 @@
           </wp:anchor>
         </w:drawing>
       </w:r>
-      <w:r>
-        <w:rPr>
-          <w:rFonts w:ascii="Times New Roman" w:hAnsi="Times New Roman" w:cs="Times New Roman"/>
-          <w:sz w:val="28"/>
-          <w:szCs w:val="28"/>
-        </w:rPr>
-        <w:t xml:space="preserve">Для реализации работы нейронной сети </w:t>
-      </w:r>
-      <w:r>
-        <w:rPr>
-          <w:rFonts w:ascii="Times New Roman" w:hAnsi="Times New Roman" w:cs="Times New Roman"/>
-          <w:sz w:val="28"/>
-          <w:szCs w:val="28"/>
-        </w:rPr>
-        <w:t xml:space="preserve">изначально было </w:t>
-      </w:r>
-      <w:r>
-        <w:rPr>
-          <w:rFonts w:ascii="Times New Roman" w:hAnsi="Times New Roman" w:cs="Times New Roman"/>
-          <w:sz w:val="28"/>
-          <w:szCs w:val="28"/>
-        </w:rPr>
-        <w:t>необходимо выбрать</w:t>
-      </w:r>
-      <w:r>
-        <w:rPr>
-          <w:rFonts w:ascii="Times New Roman" w:hAnsi="Times New Roman" w:cs="Times New Roman"/>
-          <w:sz w:val="28"/>
-          <w:szCs w:val="28"/>
-        </w:rPr>
-        <w:t xml:space="preserve"> одну из выше представленных</w:t>
-      </w:r>
-      <w:r>
-        <w:rPr>
-          <w:rFonts w:ascii="Times New Roman" w:hAnsi="Times New Roman" w:cs="Times New Roman"/>
-          <w:sz w:val="28"/>
-          <w:szCs w:val="28"/>
-        </w:rPr>
-        <w:t xml:space="preserve"> активационн</w:t>
-      </w:r>
-      <w:r>
-        <w:rPr>
-          <w:rFonts w:ascii="Times New Roman" w:hAnsi="Times New Roman" w:cs="Times New Roman"/>
-          <w:sz w:val="28"/>
-          <w:szCs w:val="28"/>
-        </w:rPr>
-        <w:t>ых</w:t>
-      </w:r>
-      <w:r>
-        <w:rPr>
-          <w:rFonts w:ascii="Times New Roman" w:hAnsi="Times New Roman" w:cs="Times New Roman"/>
-          <w:sz w:val="28"/>
-          <w:szCs w:val="28"/>
-        </w:rPr>
-        <w:t xml:space="preserve"> функци</w:t>
-      </w:r>
-      <w:r>
-        <w:rPr>
-          <w:rFonts w:ascii="Times New Roman" w:hAnsi="Times New Roman" w:cs="Times New Roman"/>
-          <w:sz w:val="28"/>
-          <w:szCs w:val="28"/>
-        </w:rPr>
-        <w:t>й</w:t>
-      </w:r>
-      <w:r>
-        <w:rPr>
-          <w:rFonts w:ascii="Times New Roman" w:hAnsi="Times New Roman" w:cs="Times New Roman"/>
-          <w:sz w:val="28"/>
-          <w:szCs w:val="28"/>
-        </w:rPr>
-        <w:t xml:space="preserve"> нейрона. </w:t>
-      </w:r>
-      <w:r>
-        <w:rPr>
-          <w:rFonts w:ascii="Times New Roman" w:hAnsi="Times New Roman" w:cs="Times New Roman"/>
-          <w:sz w:val="28"/>
-          <w:szCs w:val="28"/>
-        </w:rPr>
-        <w:t>Основным претендентом</w:t>
-      </w:r>
-      <w:r>
-        <w:rPr>
-          <w:rFonts w:ascii="Times New Roman" w:hAnsi="Times New Roman" w:cs="Times New Roman"/>
-          <w:sz w:val="28"/>
-          <w:szCs w:val="28"/>
-        </w:rPr>
-        <w:t xml:space="preserve"> стала </w:t>
-      </w:r>
-      <w:r>
-        <w:rPr>
-          <w:rFonts w:ascii="Times New Roman" w:hAnsi="Times New Roman" w:cs="Times New Roman"/>
-          <w:sz w:val="28"/>
-          <w:szCs w:val="28"/>
-        </w:rPr>
-        <w:t>функция, выраженная на основе «</w:t>
-      </w:r>
-      <w:r>
-        <w:rPr>
-          <w:rFonts w:ascii="Times New Roman" w:hAnsi="Times New Roman" w:cs="Times New Roman"/>
-          <w:sz w:val="28"/>
-          <w:szCs w:val="28"/>
-        </w:rPr>
-        <w:t>Rectified Linear Unit</w:t>
-      </w:r>
-      <w:r>
-        <w:rPr>
-          <w:rFonts w:ascii="Times New Roman" w:hAnsi="Times New Roman" w:cs="Times New Roman"/>
-          <w:sz w:val="28"/>
-          <w:szCs w:val="28"/>
-        </w:rPr>
-        <w:t>», или в сокращении «</w:t>
-      </w:r>
-      <w:r>
-        <w:rPr>
-          <w:rFonts w:ascii="Times New Roman" w:hAnsi="Times New Roman" w:cs="Times New Roman"/>
-          <w:sz w:val="28"/>
-          <w:szCs w:val="28"/>
-          <w:lang w:val="en-US"/>
-        </w:rPr>
-        <w:t>ReLU</w:t>
-      </w:r>
-      <w:r>
-        <w:rPr>
-          <w:rFonts w:ascii="Times New Roman" w:hAnsi="Times New Roman" w:cs="Times New Roman"/>
-          <w:sz w:val="28"/>
-          <w:szCs w:val="28"/>
-        </w:rPr>
-        <w:t xml:space="preserve">». </w:t>
-      </w:r>
-      <w:r>
-        <w:rPr>
-          <w:rFonts w:ascii="Times New Roman" w:hAnsi="Times New Roman" w:cs="Times New Roman"/>
-          <w:sz w:val="28"/>
-          <w:szCs w:val="28"/>
-        </w:rPr>
-        <w:t>Говоря про «родительскую» функцию, можно отметить то, что и</w:t>
-      </w:r>
-      <w:r>
-        <w:rPr>
-          <w:rFonts w:ascii="Times New Roman" w:hAnsi="Times New Roman" w:cs="Times New Roman"/>
-          <w:sz w:val="28"/>
-          <w:szCs w:val="28"/>
-        </w:rPr>
-        <w:t xml:space="preserve">менно </w:t>
-      </w:r>
-      <w:r>
-        <w:rPr>
-          <w:rFonts w:ascii="Times New Roman" w:hAnsi="Times New Roman" w:cs="Times New Roman"/>
-          <w:sz w:val="28"/>
-          <w:szCs w:val="28"/>
-        </w:rPr>
-        <w:t>она наиболее</w:t>
-      </w:r>
-      <w:r>
-        <w:rPr>
-          <w:rFonts w:ascii="Times New Roman" w:hAnsi="Times New Roman" w:cs="Times New Roman"/>
-          <w:sz w:val="28"/>
-          <w:szCs w:val="28"/>
-        </w:rPr>
-        <w:t xml:space="preserve"> часто используе</w:t>
-      </w:r>
-      <w:r>
-        <w:rPr>
-          <w:rFonts w:ascii="Times New Roman" w:hAnsi="Times New Roman" w:cs="Times New Roman"/>
-          <w:sz w:val="28"/>
-          <w:szCs w:val="28"/>
-        </w:rPr>
-        <w:t>тся</w:t>
-      </w:r>
-      <w:r>
-        <w:rPr>
-          <w:rFonts w:ascii="Times New Roman" w:hAnsi="Times New Roman" w:cs="Times New Roman"/>
-          <w:sz w:val="28"/>
-          <w:szCs w:val="28"/>
-        </w:rPr>
-        <w:t xml:space="preserve"> </w:t>
-      </w:r>
-      <w:r>
-        <w:rPr>
-          <w:rFonts w:ascii="Times New Roman" w:hAnsi="Times New Roman" w:cs="Times New Roman"/>
-          <w:sz w:val="28"/>
-          <w:szCs w:val="28"/>
-        </w:rPr>
-        <w:t xml:space="preserve">для </w:t>
-      </w:r>
-      <w:r>
-        <w:rPr>
-          <w:rFonts w:ascii="Times New Roman" w:hAnsi="Times New Roman" w:cs="Times New Roman"/>
-          <w:sz w:val="28"/>
-          <w:szCs w:val="28"/>
-        </w:rPr>
-        <w:t>активации при глубоком обучении</w:t>
-      </w:r>
-      <w:r>
-        <w:rPr>
-          <w:rFonts w:ascii="Times New Roman" w:hAnsi="Times New Roman" w:cs="Times New Roman"/>
-          <w:sz w:val="28"/>
-          <w:szCs w:val="28"/>
-        </w:rPr>
-        <w:t>.</w:t>
-      </w:r>
-      <w:r>
-        <w:rPr>
-          <w:noProof/>
-          <w:lang w:eastAsia="ru-RU"/>
-        </w:rPr>
-        <w:t xml:space="preserve"> </w:t>
-      </w:r>
-    </w:p>
-    <w:p>
-      <w:pPr>
-        <w:spacing w:after="0" w:line="300" w:lineRule="auto"/>
-        <w:contextualSpacing/>
-        <w:jc w:val="center"/>
-        <w:rPr>
-          <w:rFonts w:ascii="Times New Roman" w:hAnsi="Times New Roman" w:cs="Times New Roman"/>
-          <w:noProof/>
-          <w:sz w:val="28"/>
-          <w:szCs w:val="28"/>
-          <w:lang w:eastAsia="ru-RU"/>
-        </w:rPr>
-      </w:pPr>
       <w:r>
         <w:rPr>
           <w:rFonts w:ascii="Times New Roman" w:hAnsi="Times New Roman" w:cs="Times New Roman"/>
@@ -4710,7 +5748,15 @@
           <w:sz w:val="28"/>
           <w:szCs w:val="28"/>
         </w:rPr>
-        <w:t xml:space="preserve">Разреженность активации. В сетях с очень большим количеством нейронов использование сигмоидной функции или гиперболического тангенса в качестве активационный </w:t>
+        <w:t xml:space="preserve">Разреженность активации. В сетях с очень большим количеством нейронов использование сигмоидной функции или гиперболического тангенса в качестве активационный функции </w:t>
+      </w:r>
+      <w:r>
+        <w:rPr>
+          <w:rFonts w:ascii="Times New Roman" w:hAnsi="Times New Roman" w:cs="Times New Roman"/>
+          <w:sz w:val="28"/>
+          <w:szCs w:val="28"/>
+        </w:rPr>
+        <w:t xml:space="preserve">влечет активацию почти всех нейронов, что может сказаться на производительности обучения модели. Если же </w:t>
       </w:r>
       <w:r>
         <w:rPr>
@@ -4719,15 +5765,7 @@
           <w:szCs w:val="28"/>
         </w:rPr>
         <w:lastRenderedPageBreak/>
-        <w:t xml:space="preserve">функции </w:t>
-      </w:r>
-      <w:r>
-        <w:rPr>
-          <w:rFonts w:ascii="Times New Roman" w:hAnsi="Times New Roman" w:cs="Times New Roman"/>
-          <w:sz w:val="28"/>
-          <w:szCs w:val="28"/>
-        </w:rPr>
-        <w:t>влечет активацию почти всех нейронов, что может сказаться на производительности обучения модели. Если же использовать ReLU, то количество включаемых нейронов станет меньше, в силу характеристик функции, и сама сеть станет легче.</w:t>
+        <w:t>использовать ReLU, то количество включаемых нейронов станет меньше, в силу характеристик функции, и сама сеть станет легче.</w:t>
       </w:r>
     </w:p>
     <w:p>
@@ -4744,22 +5782,108 @@
       <w:r>
         <w:rPr>
           <w:rFonts w:ascii="Times New Roman" w:hAnsi="Times New Roman" w:cs="Times New Roman"/>
+          <w:sz w:val="28"/>
+          <w:szCs w:val="28"/>
+        </w:rPr>
+        <w:t>Используемая в данной курсовой работе функция</w:t>
+      </w:r>
+      <w:r>
+        <w:rPr>
+          <w:rFonts w:ascii="Times New Roman" w:hAnsi="Times New Roman" w:cs="Times New Roman"/>
+          <w:sz w:val="28"/>
+          <w:szCs w:val="28"/>
+        </w:rPr>
+        <w:t xml:space="preserve"> является модифицированной функцией</w:t>
+      </w:r>
+      <w:r>
+        <w:rPr>
+          <w:rFonts w:ascii="Times New Roman" w:hAnsi="Times New Roman" w:cs="Times New Roman"/>
+          <w:sz w:val="28"/>
+          <w:szCs w:val="28"/>
+        </w:rPr>
+        <w:t xml:space="preserve"> «</w:t>
+      </w:r>
+      <w:r>
+        <w:rPr>
+          <w:rFonts w:ascii="Times New Roman" w:hAnsi="Times New Roman" w:cs="Times New Roman"/>
+          <w:sz w:val="28"/>
+          <w:szCs w:val="28"/>
+          <w:lang w:val="en-US"/>
+        </w:rPr>
+        <w:t>Leaky</w:t>
+      </w:r>
+      <w:r>
+        <w:rPr>
+          <w:rFonts w:ascii="Times New Roman" w:hAnsi="Times New Roman" w:cs="Times New Roman"/>
+          <w:sz w:val="28"/>
+          <w:szCs w:val="28"/>
+        </w:rPr>
+        <w:t xml:space="preserve"> </w:t>
+      </w:r>
+      <w:r>
+        <w:rPr>
+          <w:rFonts w:ascii="Times New Roman" w:hAnsi="Times New Roman" w:cs="Times New Roman"/>
+          <w:sz w:val="28"/>
+          <w:szCs w:val="28"/>
+          <w:lang w:val="en-US"/>
+        </w:rPr>
+        <w:t>ReLU</w:t>
+      </w:r>
+      <w:r>
+        <w:rPr>
+          <w:rFonts w:ascii="Times New Roman" w:hAnsi="Times New Roman" w:cs="Times New Roman"/>
+          <w:sz w:val="28"/>
+          <w:szCs w:val="28"/>
+        </w:rPr>
+        <w:t>»</w:t>
+      </w:r>
+      <w:r>
+        <w:rPr>
+          <w:rFonts w:ascii="Times New Roman" w:hAnsi="Times New Roman" w:cs="Times New Roman"/>
+          <w:sz w:val="28"/>
+          <w:szCs w:val="28"/>
+        </w:rPr>
+        <w:t>, которая в свою очередь имеет такой вид</w:t>
+      </w:r>
+      <w:r>
+        <w:rPr>
+          <w:rFonts w:ascii="Times New Roman" w:hAnsi="Times New Roman" w:cs="Times New Roman"/>
+          <w:sz w:val="28"/>
+          <w:szCs w:val="28"/>
+        </w:rPr>
+        <w:t>:</w:t>
+      </w:r>
+    </w:p>
+    <w:p>
+      <w:pPr>
+        <w:spacing w:after="0" w:line="300" w:lineRule="auto"/>
+        <w:contextualSpacing/>
+        <w:jc w:val="center"/>
+        <w:rPr>
+          <w:rFonts w:ascii="Times New Roman" w:hAnsi="Times New Roman" w:cs="Times New Roman"/>
+          <w:sz w:val="28"/>
+          <w:szCs w:val="18"/>
+        </w:rPr>
+      </w:pPr>
+      <w:r>
+        <w:rPr>
+          <w:rFonts w:ascii="Times New Roman" w:hAnsi="Times New Roman" w:cs="Times New Roman"/>
           <w:noProof/>
           <w:sz w:val="28"/>
           <w:szCs w:val="28"/>
           <w:lang w:eastAsia="ru-RU"/>
         </w:rPr>
         <w:drawing>
-          <wp:anchor distT="0" distB="0" distL="114300" distR="114300" simplePos="0" relativeHeight="251659264" behindDoc="0" locked="0" layoutInCell="1" allowOverlap="1" wp14:anchorId="1BB65F86" wp14:editId="3E7B55F2">
+          <wp:anchor distT="0" distB="0" distL="114300" distR="114300" simplePos="0" relativeHeight="251659264" behindDoc="0" locked="0" layoutInCell="1" allowOverlap="1" wp14:anchorId="40618D8B" wp14:editId="797FE708">
             <wp:simplePos x="0" y="0"/>
             <wp:positionH relativeFrom="margin">
-              <wp:posOffset>1506105</wp:posOffset>
+              <wp:posOffset>1504950</wp:posOffset>
             </wp:positionH>
             <wp:positionV relativeFrom="paragraph">
-              <wp:posOffset>783590</wp:posOffset>
+              <wp:posOffset>18415</wp:posOffset>
             </wp:positionV>
             <wp:extent cx="2732405" cy="1543050"/>
-            <wp:effectExtent l="0" t="0" r="0" b="6350"/>
+            <wp:effectExtent l="0" t="0" r="0" b="0"/>
             <wp:wrapTopAndBottom/>
             <wp:docPr id="2" name="Рисунок 2"/>
             <wp:cNvGraphicFramePr>
@@ -4805,92 +5929,6 @@
           </wp:anchor>
         </w:drawing>
       </w:r>
-      <w:r>
-        <w:rPr>
-          <w:rFonts w:ascii="Times New Roman" w:hAnsi="Times New Roman" w:cs="Times New Roman"/>
-          <w:sz w:val="28"/>
-          <w:szCs w:val="28"/>
-        </w:rPr>
-        <w:t>Используемая в данной курсовой работе функция</w:t>
-      </w:r>
-      <w:r>
-        <w:rPr>
-          <w:rFonts w:ascii="Times New Roman" w:hAnsi="Times New Roman" w:cs="Times New Roman"/>
-          <w:sz w:val="28"/>
-          <w:szCs w:val="28"/>
-        </w:rPr>
-        <w:t xml:space="preserve"> является модифицированной функцией</w:t>
-      </w:r>
-      <w:r>
-        <w:rPr>
-          <w:rFonts w:ascii="Times New Roman" w:hAnsi="Times New Roman" w:cs="Times New Roman"/>
-          <w:sz w:val="28"/>
-          <w:szCs w:val="28"/>
-        </w:rPr>
-        <w:t xml:space="preserve"> «</w:t>
-      </w:r>
-      <w:r>
-        <w:rPr>
-          <w:rFonts w:ascii="Times New Roman" w:hAnsi="Times New Roman" w:cs="Times New Roman"/>
-          <w:sz w:val="28"/>
-          <w:szCs w:val="28"/>
-          <w:lang w:val="en-US"/>
-        </w:rPr>
-        <w:t>Leaky</w:t>
-      </w:r>
-      <w:r>
-        <w:rPr>
-          <w:rFonts w:ascii="Times New Roman" w:hAnsi="Times New Roman" w:cs="Times New Roman"/>
-          <w:sz w:val="28"/>
-          <w:szCs w:val="28"/>
-        </w:rPr>
-        <w:t xml:space="preserve"> </w:t>
-      </w:r>
-      <w:r>
-        <w:rPr>
-          <w:rFonts w:ascii="Times New Roman" w:hAnsi="Times New Roman" w:cs="Times New Roman"/>
-          <w:sz w:val="28"/>
-          <w:szCs w:val="28"/>
-          <w:lang w:val="en-US"/>
-        </w:rPr>
-        <w:t>ReLU</w:t>
-      </w:r>
-      <w:r>
-        <w:rPr>
-          <w:rFonts w:ascii="Times New Roman" w:hAnsi="Times New Roman" w:cs="Times New Roman"/>
-          <w:sz w:val="28"/>
-          <w:szCs w:val="28"/>
-        </w:rPr>
-        <w:t>»</w:t>
-      </w:r>
-      <w:r>
-        <w:rPr>
-          <w:rFonts w:ascii="Times New Roman" w:hAnsi="Times New Roman" w:cs="Times New Roman"/>
-          <w:sz w:val="28"/>
-          <w:szCs w:val="28"/>
-        </w:rPr>
-        <w:t>, которая в свою очередь имеет такой вид</w:t>
-      </w:r>
-      <w:r>
-        <w:rPr>
-          <w:rFonts w:ascii="Times New Roman" w:hAnsi="Times New Roman" w:cs="Times New Roman"/>
-          <w:sz w:val="28"/>
-          <w:szCs w:val="28"/>
-        </w:rPr>
-        <w:t>:</w:t>
-      </w:r>
-    </w:p>
-    <w:p>
-      <w:pPr>
-        <w:spacing w:after="0" w:line="300" w:lineRule="auto"/>
-        <w:contextualSpacing/>
-        <w:jc w:val="center"/>
-        <w:rPr>
-          <w:rFonts w:ascii="Times New Roman" w:hAnsi="Times New Roman" w:cs="Times New Roman"/>
-          <w:sz w:val="28"/>
-          <w:szCs w:val="18"/>
-        </w:rPr>
-      </w:pPr>
       <w:r>
         <w:rPr>
           <w:rFonts w:ascii="Times New Roman" w:hAnsi="Times New Roman" w:cs="Times New Roman"/>
@@ -5078,17 +6116,167 @@
       </w:pPr>
       <w:r>
         <w:rPr>
+          <w:rFonts w:ascii="Times New Roman" w:hAnsi="Times New Roman" w:cs="Times New Roman"/>
+          <w:sz w:val="28"/>
+          <w:szCs w:val="28"/>
+        </w:rPr>
+        <w:t>Причиной использования именно модифицированной активационной функции можно назвать специфику поставленной задачи. Алгоритм, при считывании пикселей,</w:t>
+      </w:r>
+      <w:r>
+        <w:rPr>
+          <w:rFonts w:ascii="Times New Roman" w:hAnsi="Times New Roman" w:cs="Times New Roman"/>
+          <w:sz w:val="28"/>
+          <w:szCs w:val="28"/>
+        </w:rPr>
+        <w:t xml:space="preserve"> будет получать на вход его цвет</w:t>
+      </w:r>
+      <w:r>
+        <w:rPr>
+          <w:rFonts w:ascii="Times New Roman" w:hAnsi="Times New Roman" w:cs="Times New Roman"/>
+          <w:sz w:val="28"/>
+          <w:szCs w:val="28"/>
+        </w:rPr>
+        <w:t xml:space="preserve">, и </w:t>
+      </w:r>
+      <w:r>
+        <w:rPr>
+          <w:rFonts w:ascii="Times New Roman" w:hAnsi="Times New Roman" w:cs="Times New Roman"/>
+          <w:sz w:val="28"/>
+          <w:szCs w:val="28"/>
+        </w:rPr>
+        <w:t>так как</w:t>
+      </w:r>
+      <w:r>
+        <w:rPr>
+          <w:rFonts w:ascii="Times New Roman" w:hAnsi="Times New Roman" w:cs="Times New Roman"/>
+          <w:sz w:val="28"/>
+          <w:szCs w:val="28"/>
+        </w:rPr>
+        <w:t xml:space="preserve"> </w:t>
+      </w:r>
+      <w:r>
+        <w:rPr>
+          <w:rFonts w:ascii="Times New Roman" w:hAnsi="Times New Roman" w:cs="Times New Roman"/>
+          <w:sz w:val="28"/>
+          <w:szCs w:val="28"/>
+        </w:rPr>
+        <w:t xml:space="preserve">это значение имеет верхний </w:t>
+      </w:r>
+      <w:r>
+        <w:rPr>
+          <w:rFonts w:ascii="Times New Roman" w:hAnsi="Times New Roman" w:cs="Times New Roman"/>
+          <w:sz w:val="28"/>
+          <w:szCs w:val="28"/>
+        </w:rPr>
+        <w:t xml:space="preserve">и нижние </w:t>
+      </w:r>
+      <w:r>
+        <w:rPr>
+          <w:rFonts w:ascii="Times New Roman" w:hAnsi="Times New Roman" w:cs="Times New Roman"/>
+          <w:sz w:val="28"/>
+          <w:szCs w:val="28"/>
+        </w:rPr>
+        <w:t>предел</w:t>
+      </w:r>
+      <w:r>
+        <w:rPr>
+          <w:rFonts w:ascii="Times New Roman" w:hAnsi="Times New Roman" w:cs="Times New Roman"/>
+          <w:sz w:val="28"/>
+          <w:szCs w:val="28"/>
+        </w:rPr>
+        <w:t>ы</w:t>
+      </w:r>
+      <w:r>
+        <w:rPr>
+          <w:rFonts w:ascii="Times New Roman" w:hAnsi="Times New Roman" w:cs="Times New Roman"/>
+          <w:sz w:val="28"/>
+          <w:szCs w:val="28"/>
+        </w:rPr>
+        <w:t>, а именно 255</w:t>
+      </w:r>
+      <w:r>
+        <w:rPr>
+          <w:rFonts w:ascii="Times New Roman" w:hAnsi="Times New Roman" w:cs="Times New Roman"/>
+          <w:sz w:val="28"/>
+          <w:szCs w:val="28"/>
+        </w:rPr>
+        <w:t xml:space="preserve"> и 1 соответственно</w:t>
+      </w:r>
+      <w:r>
+        <w:rPr>
+          <w:rFonts w:ascii="Times New Roman" w:hAnsi="Times New Roman" w:cs="Times New Roman"/>
+          <w:sz w:val="28"/>
+          <w:szCs w:val="28"/>
+        </w:rPr>
+        <w:t>, «</w:t>
+      </w:r>
+      <w:r>
+        <w:rPr>
+          <w:rFonts w:ascii="Times New Roman" w:hAnsi="Times New Roman" w:cs="Times New Roman"/>
+          <w:sz w:val="28"/>
+          <w:szCs w:val="28"/>
+          <w:lang w:val="en-US"/>
+        </w:rPr>
+        <w:t>Leaky</w:t>
+      </w:r>
+      <w:r>
+        <w:rPr>
+          <w:rFonts w:ascii="Times New Roman" w:hAnsi="Times New Roman" w:cs="Times New Roman"/>
+          <w:sz w:val="28"/>
+          <w:szCs w:val="28"/>
+        </w:rPr>
+        <w:t xml:space="preserve"> </w:t>
+      </w:r>
+      <w:r>
+        <w:rPr>
+          <w:rFonts w:ascii="Times New Roman" w:hAnsi="Times New Roman" w:cs="Times New Roman"/>
+          <w:sz w:val="28"/>
+          <w:szCs w:val="28"/>
+          <w:lang w:val="en-US"/>
+        </w:rPr>
+        <w:t>ReLU</w:t>
+      </w:r>
+      <w:r>
+        <w:rPr>
+          <w:rFonts w:ascii="Times New Roman" w:hAnsi="Times New Roman" w:cs="Times New Roman"/>
+          <w:sz w:val="28"/>
+          <w:szCs w:val="28"/>
+        </w:rPr>
+        <w:t>» нуждается в доработке</w:t>
+      </w:r>
+      <w:r>
+        <w:rPr>
+          <w:rFonts w:ascii="Times New Roman" w:hAnsi="Times New Roman" w:cs="Times New Roman"/>
+          <w:sz w:val="28"/>
+          <w:szCs w:val="28"/>
+        </w:rPr>
+        <w:t>:</w:t>
+      </w:r>
+    </w:p>
+    <w:p>
+      <w:pPr>
+        <w:spacing w:after="0" w:line="300" w:lineRule="auto"/>
+        <w:contextualSpacing/>
+        <w:jc w:val="center"/>
+        <w:rPr>
+          <w:rFonts w:ascii="Times New Roman" w:hAnsi="Times New Roman" w:cs="Times New Roman"/>
+          <w:sz w:val="18"/>
+          <w:szCs w:val="18"/>
+        </w:rPr>
+      </w:pPr>
+      <w:r>
+        <w:rPr>
           <w:noProof/>
           <w:lang w:eastAsia="ru-RU"/>
         </w:rPr>
         <w:drawing>
-          <wp:anchor distT="0" distB="0" distL="114300" distR="114300" simplePos="0" relativeHeight="251660288" behindDoc="0" locked="0" layoutInCell="1" allowOverlap="1" wp14:anchorId="72C2D304" wp14:editId="37263771">
+          <wp:anchor distT="0" distB="0" distL="114300" distR="114300" simplePos="0" relativeHeight="251660288" behindDoc="0" locked="0" layoutInCell="1" allowOverlap="1" wp14:anchorId="30321113" wp14:editId="0BC5C49F">
             <wp:simplePos x="0" y="0"/>
             <wp:positionH relativeFrom="margin">
-              <wp:posOffset>1329055</wp:posOffset>
+              <wp:posOffset>1333500</wp:posOffset>
             </wp:positionH>
             <wp:positionV relativeFrom="paragraph">
-              <wp:posOffset>1312660</wp:posOffset>
+              <wp:posOffset>36830</wp:posOffset>
             </wp:positionV>
             <wp:extent cx="2934970" cy="1755775"/>
             <wp:effectExtent l="0" t="0" r="0" b="0"/>
@@ -5137,156 +6325,6 @@
           </wp:anchor>
         </w:drawing>
       </w:r>
-      <w:r>
-        <w:rPr>
-          <w:rFonts w:ascii="Times New Roman" w:hAnsi="Times New Roman" w:cs="Times New Roman"/>
-          <w:sz w:val="28"/>
-          <w:szCs w:val="28"/>
-        </w:rPr>
-        <w:t>Причиной использования именно модифицированной активационной функции можно назвать специфику поставленной задачи. Алгоритм, при считывании пикселей,</w:t>
-      </w:r>
-      <w:r>
-        <w:rPr>
-          <w:rFonts w:ascii="Times New Roman" w:hAnsi="Times New Roman" w:cs="Times New Roman"/>
-          <w:sz w:val="28"/>
-          <w:szCs w:val="28"/>
-        </w:rPr>
-        <w:t xml:space="preserve"> будет получать на вход его цвет</w:t>
-      </w:r>
-      <w:r>
-        <w:rPr>
-          <w:rFonts w:ascii="Times New Roman" w:hAnsi="Times New Roman" w:cs="Times New Roman"/>
-          <w:sz w:val="28"/>
-          <w:szCs w:val="28"/>
-        </w:rPr>
-        <w:t xml:space="preserve">, и </w:t>
-      </w:r>
-      <w:r>
-        <w:rPr>
-          <w:rFonts w:ascii="Times New Roman" w:hAnsi="Times New Roman" w:cs="Times New Roman"/>
-          <w:sz w:val="28"/>
-          <w:szCs w:val="28"/>
-        </w:rPr>
-        <w:t>так как</w:t>
-      </w:r>
-      <w:r>
-        <w:rPr>
-          <w:rFonts w:ascii="Times New Roman" w:hAnsi="Times New Roman" w:cs="Times New Roman"/>
-          <w:sz w:val="28"/>
-          <w:szCs w:val="28"/>
-        </w:rPr>
-        <w:t xml:space="preserve"> </w:t>
-      </w:r>
-      <w:r>
-        <w:rPr>
-          <w:rFonts w:ascii="Times New Roman" w:hAnsi="Times New Roman" w:cs="Times New Roman"/>
-          <w:sz w:val="28"/>
-          <w:szCs w:val="28"/>
-        </w:rPr>
-        <w:t xml:space="preserve">это значение имеет верхний </w:t>
-      </w:r>
-      <w:r>
-        <w:rPr>
-          <w:rFonts w:ascii="Times New Roman" w:hAnsi="Times New Roman" w:cs="Times New Roman"/>
-          <w:sz w:val="28"/>
-          <w:szCs w:val="28"/>
-        </w:rPr>
-        <w:t xml:space="preserve">и нижние </w:t>
-      </w:r>
-      <w:r>
-        <w:rPr>
-          <w:rFonts w:ascii="Times New Roman" w:hAnsi="Times New Roman" w:cs="Times New Roman"/>
-          <w:sz w:val="28"/>
-          <w:szCs w:val="28"/>
-        </w:rPr>
-        <w:t>предел</w:t>
-      </w:r>
-      <w:r>
-        <w:rPr>
-          <w:rFonts w:ascii="Times New Roman" w:hAnsi="Times New Roman" w:cs="Times New Roman"/>
-          <w:sz w:val="28"/>
-          <w:szCs w:val="28"/>
-        </w:rPr>
-        <w:t>ы</w:t>
-      </w:r>
-      <w:r>
-        <w:rPr>
-          <w:rFonts w:ascii="Times New Roman" w:hAnsi="Times New Roman" w:cs="Times New Roman"/>
-          <w:sz w:val="28"/>
-          <w:szCs w:val="28"/>
-        </w:rPr>
-        <w:t>, а именно 255</w:t>
-      </w:r>
-      <w:r>
-        <w:rPr>
-          <w:rFonts w:ascii="Times New Roman" w:hAnsi="Times New Roman" w:cs="Times New Roman"/>
-          <w:sz w:val="28"/>
-          <w:szCs w:val="28"/>
-        </w:rPr>
-        <w:t xml:space="preserve"> и 1 соответственно</w:t>
-      </w:r>
-      <w:r>
-        <w:rPr>
-          <w:rFonts w:ascii="Times New Roman" w:hAnsi="Times New Roman" w:cs="Times New Roman"/>
-          <w:sz w:val="28"/>
-          <w:szCs w:val="28"/>
-        </w:rPr>
-        <w:t>, «</w:t>
-      </w:r>
-      <w:r>
-        <w:rPr>
-          <w:rFonts w:ascii="Times New Roman" w:hAnsi="Times New Roman" w:cs="Times New Roman"/>
-          <w:sz w:val="28"/>
-          <w:szCs w:val="28"/>
-          <w:lang w:val="en-US"/>
-        </w:rPr>
-        <w:t>Leaky</w:t>
-      </w:r>
-      <w:r>
-        <w:rPr>
-          <w:rFonts w:ascii="Times New Roman" w:hAnsi="Times New Roman" w:cs="Times New Roman"/>
-          <w:sz w:val="28"/>
-          <w:szCs w:val="28"/>
-        </w:rPr>
-        <w:t xml:space="preserve"> </w:t>
-      </w:r>
-      <w:r>
-        <w:rPr>
-          <w:rFonts w:ascii="Times New Roman" w:hAnsi="Times New Roman" w:cs="Times New Roman"/>
-          <w:sz w:val="28"/>
-          <w:szCs w:val="28"/>
-          <w:lang w:val="en-US"/>
-        </w:rPr>
-        <w:t>ReLU</w:t>
-      </w:r>
-      <w:r>
-        <w:rPr>
-          <w:rFonts w:ascii="Times New Roman" w:hAnsi="Times New Roman" w:cs="Times New Roman"/>
-          <w:sz w:val="28"/>
-          <w:szCs w:val="28"/>
-        </w:rPr>
-        <w:t>» нуждается в доработке</w:t>
-      </w:r>
-      <w:r>
-        <w:rPr>
-          <w:rFonts w:ascii="Times New Roman" w:hAnsi="Times New Roman" w:cs="Times New Roman"/>
-          <w:sz w:val="28"/>
-          <w:szCs w:val="28"/>
-        </w:rPr>
-        <w:t>:</w:t>
-      </w:r>
-    </w:p>
-    <w:p>
-      <w:pPr>
-        <w:spacing w:after="0" w:line="300" w:lineRule="auto"/>
-        <w:contextualSpacing/>
-        <w:jc w:val="center"/>
-        <w:rPr>
-          <w:rFonts w:ascii="Times New Roman" w:hAnsi="Times New Roman" w:cs="Times New Roman"/>
-          <w:sz w:val="18"/>
-          <w:szCs w:val="18"/>
-        </w:rPr>
-      </w:pPr>
       <w:r>
         <w:rPr>
           <w:rFonts w:ascii="Times New Roman" w:hAnsi="Times New Roman" w:cs="Times New Roman"/>
@@ -5535,6 +6573,7 @@
           <w:rFonts w:ascii="Times New Roman" w:hAnsi="Times New Roman" w:cs="Times New Roman"/>
           <w:sz w:val="18"/>
           <w:szCs w:val="18"/>
+          <w:lang w:val="en-US"/>
         </w:rPr>
       </w:pPr>
       <w:r>
@@ -5566,20 +6605,58 @@
     </w:p>
     <w:p>
       <w:pPr>
-        <w:spacing w:after="0"/>
-        <w:jc w:val="both"/>
-        <w:rPr>
-          <w:rFonts w:ascii="Times New Roman" w:hAnsi="Times New Roman" w:cs="Times New Roman"/>
-          <w:b/>
-          <w:color w:val="1A1A1A" w:themeColor="background1" w:themeShade="1A"/>
-          <w:sz w:val="28"/>
-        </w:rPr>
-      </w:pPr>
-      <w:r>
-        <w:rPr>
-          <w:rFonts w:ascii="Times New Roman" w:hAnsi="Times New Roman" w:cs="Times New Roman"/>
-          <w:b/>
-          <w:color w:val="1A1A1A" w:themeColor="background1" w:themeShade="1A"/>
+        <w:spacing w:after="0" w:line="300" w:lineRule="auto"/>
+        <w:contextualSpacing/>
+        <w:jc w:val="center"/>
+        <w:rPr>
+          <w:rFonts w:ascii="Times New Roman" w:hAnsi="Times New Roman" w:cs="Times New Roman"/>
+          <w:sz w:val="18"/>
+          <w:szCs w:val="18"/>
+          <w:lang w:val="en-US"/>
+        </w:rPr>
+      </w:pPr>
+    </w:p>
+    <w:p>
+      <w:pPr>
+        <w:spacing w:after="0" w:line="300" w:lineRule="auto"/>
+        <w:contextualSpacing/>
+        <w:jc w:val="center"/>
+        <w:rPr>
+          <w:rFonts w:ascii="Times New Roman" w:hAnsi="Times New Roman" w:cs="Times New Roman"/>
+          <w:sz w:val="18"/>
+          <w:szCs w:val="18"/>
+          <w:lang w:val="en-US"/>
+        </w:rPr>
+      </w:pPr>
+    </w:p>
+    <w:p>
+      <w:pPr>
+        <w:spacing w:after="0" w:line="300" w:lineRule="auto"/>
+        <w:contextualSpacing/>
+        <w:jc w:val="center"/>
+        <w:rPr>
+          <w:rFonts w:ascii="Times New Roman" w:hAnsi="Times New Roman" w:cs="Times New Roman"/>
+          <w:sz w:val="18"/>
+          <w:szCs w:val="18"/>
+        </w:rPr>
+      </w:pPr>
+    </w:p>
+    <w:p>
+      <w:pPr>
+        <w:spacing w:after="0"/>
+        <w:jc w:val="both"/>
+        <w:rPr>
+          <w:rFonts w:ascii="Times New Roman" w:hAnsi="Times New Roman" w:cs="Times New Roman"/>
+          <w:b/>
+          <w:color w:val="171719" w:themeColor="background1" w:themeShade="1A"/>
+          <w:sz w:val="28"/>
+        </w:rPr>
+      </w:pPr>
+      <w:r>
+        <w:rPr>
+          <w:rFonts w:ascii="Times New Roman" w:hAnsi="Times New Roman" w:cs="Times New Roman"/>
+          <w:b/>
+          <w:color w:val="171719" w:themeColor="background1" w:themeShade="1A"/>
           <w:sz w:val="28"/>
         </w:rPr>
         <w:lastRenderedPageBreak/>
@@ -5589,7 +6666,7 @@
         <w:rPr>
           <w:rFonts w:ascii="Times New Roman" w:hAnsi="Times New Roman" w:cs="Times New Roman"/>
           <w:b/>
-          <w:color w:val="1A1A1A" w:themeColor="background1" w:themeShade="1A"/>
+          <w:color w:val="171719" w:themeColor="background1" w:themeShade="1A"/>
           <w:sz w:val="28"/>
         </w:rPr>
         <w:t>Алгоритм работы нейронной сети</w:t>
@@ -5604,7 +6681,7 @@
         <w:rPr>
           <w:rFonts w:ascii="Times New Roman" w:hAnsi="Times New Roman" w:cs="Times New Roman"/>
           <w:b/>
-          <w:color w:val="1A1A1A" w:themeColor="background1" w:themeShade="1A"/>
+          <w:color w:val="171719" w:themeColor="background1" w:themeShade="1A"/>
           <w:sz w:val="28"/>
         </w:rPr>
       </w:pPr>
@@ -7736,8 +8813,6 @@
         </w:rPr>
         <w:t>Смещение – это дополнительный вход для нейрона, который всегда равен 1 и, следовательно, имеет собственный вес соединения. Это гарантирует, что даже когда все входы будут равны нулю, нейрон будет активен.</w:t>
       </w:r>
-      <w:bookmarkStart w:id="3" w:name="_GoBack"/>
-      <w:bookmarkEnd w:id="3"/>
     </w:p>
     <w:sectPr>
       <w:footerReference w:type="default" r:id="rId15"/>
@@ -7806,7 +8881,7 @@
           <w:rPr>
             <w:noProof/>
           </w:rPr>
-          <w:t>10</w:t>
+          <w:t>2</w:t>
         </w:r>
         <w:r>
           <w:fldChar w:fldCharType="end"/>
@@ -7850,6 +8925,119 @@
 <file path=word/numbering.xml><?xml version="1.0" encoding="utf-8"?>
 <w:numbering xmlns:wpc="http://schemas.microsoft.com/office/word/2010/wordprocessingCanvas" xmlns:mc="http://schemas.openxmlformats.org/markup-compatibility/2006" xmlns:o="urn:schemas-microsoft-com:office:office" xmlns:r="http://schemas.openxmlformats.org/officeDocument/2006/relationships" xmlns:m="http://schemas.openxmlformats.org/officeDocument/2006/math" xmlns:v="urn:schemas-microsoft-com:vml" xmlns:wp14="http://schemas.microsoft.com/office/word/2010/wordprocessingDrawing" xmlns:wp="http://schemas.openxmlformats.org/drawingml/2006/wordprocessingDrawing" xmlns:w10="urn:schemas-microsoft-com:office:word" xmlns:w="http://schemas.openxmlformats.org/wordprocessingml/2006/main" xmlns:w14="http://schemas.microsoft.com/office/word/2010/wordml" xmlns:w15="http://schemas.microsoft.com/office/word/2012/wordml" xmlns:wpg="http://schemas.microsoft.com/office/word/2010/wordprocessingGroup" xmlns:wpi="http://schemas.microsoft.com/office/word/2010/wordprocessingInk" xmlns:wne="http://schemas.microsoft.com/office/word/2006/wordml" xmlns:wps="http://schemas.microsoft.com/office/word/2010/wordprocessingShape" mc:Ignorable="w14 w15 wp14">
   <w:abstractNum w:abstractNumId="0">
+    <w:nsid w:val="00B00A3D"/>
+    <w:multiLevelType w:val="hybridMultilevel"/>
+    <w:tmpl w:val="FAB0C30C"/>
+    <w:lvl w:ilvl="0" w:tplc="04190001">
+      <w:start w:val="1"/>
+      <w:numFmt w:val="bullet"/>
+      <w:lvlText w:val=""/>
+      <w:lvlJc w:val="left"/>
+      <w:pPr>
+        <w:ind w:left="1095" w:hanging="360"/>
+      </w:pPr>
+      <w:rPr>
+        <w:rFonts w:ascii="Symbol" w:hAnsi="Symbol" w:hint="default"/>
+      </w:rPr>
+    </w:lvl>
+    <w:lvl w:ilvl="1" w:tplc="04190003" w:tentative="1">
+      <w:start w:val="1"/>
+      <w:numFmt w:val="bullet"/>
+      <w:lvlText w:val="o"/>
+      <w:lvlJc w:val="left"/>
+      <w:pPr>
+        <w:ind w:left="1815" w:hanging="360"/>
+      </w:pPr>
+      <w:rPr>
+        <w:rFonts w:ascii="Courier New" w:hAnsi="Courier New" w:cs="Courier New" w:hint="default"/>
+      </w:rPr>
+    </w:lvl>
+    <w:lvl w:ilvl="2" w:tplc="04190005" w:tentative="1">
+      <w:start w:val="1"/>
+      <w:numFmt w:val="bullet"/>
+      <w:lvlText w:val=""/>
+      <w:lvlJc w:val="left"/>
+      <w:pPr>
+        <w:ind w:left="2535" w:hanging="360"/>
+      </w:pPr>
+      <w:rPr>
+        <w:rFonts w:ascii="Wingdings" w:hAnsi="Wingdings" w:hint="default"/>
+      </w:rPr>
+    </w:lvl>
+    <w:lvl w:ilvl="3" w:tplc="04190001" w:tentative="1">
+      <w:start w:val="1"/>
+      <w:numFmt w:val="bullet"/>
+      <w:lvlText w:val=""/>
+      <w:lvlJc w:val="left"/>
+      <w:pPr>
+        <w:ind w:left="3255" w:hanging="360"/>
+      </w:pPr>
+      <w:rPr>
+        <w:rFonts w:ascii="Symbol" w:hAnsi="Symbol" w:hint="default"/>
+      </w:rPr>
+    </w:lvl>
+    <w:lvl w:ilvl="4" w:tplc="04190003" w:tentative="1">
+      <w:start w:val="1"/>
+      <w:numFmt w:val="bullet"/>
+      <w:lvlText w:val="o"/>
+      <w:lvlJc w:val="left"/>
+      <w:pPr>
+        <w:ind w:left="3975" w:hanging="360"/>
+      </w:pPr>
+      <w:rPr>
+        <w:rFonts w:ascii="Courier New" w:hAnsi="Courier New" w:cs="Courier New" w:hint="default"/>
+      </w:rPr>
+    </w:lvl>
+    <w:lvl w:ilvl="5" w:tplc="04190005" w:tentative="1">
+      <w:start w:val="1"/>
+      <w:numFmt w:val="bullet"/>
+      <w:lvlText w:val=""/>
+      <w:lvlJc w:val="left"/>
+      <w:pPr>
+        <w:ind w:left="4695" w:hanging="360"/>
+      </w:pPr>
+      <w:rPr>
+        <w:rFonts w:ascii="Wingdings" w:hAnsi="Wingdings" w:hint="default"/>
+      </w:rPr>
+    </w:lvl>
+    <w:lvl w:ilvl="6" w:tplc="04190001" w:tentative="1">
+      <w:start w:val="1"/>
+      <w:numFmt w:val="bullet"/>
+      <w:lvlText w:val=""/>
+      <w:lvlJc w:val="left"/>
+      <w:pPr>
+        <w:ind w:left="5415" w:hanging="360"/>
+      </w:pPr>
+      <w:rPr>
+        <w:rFonts w:ascii="Symbol" w:hAnsi="Symbol" w:hint="default"/>
+      </w:rPr>
+    </w:lvl>
+    <w:lvl w:ilvl="7" w:tplc="04190003" w:tentative="1">
+      <w:start w:val="1"/>
+      <w:numFmt w:val="bullet"/>
+      <w:lvlText w:val="o"/>
+      <w:lvlJc w:val="left"/>
+      <w:pPr>
+        <w:ind w:left="6135" w:hanging="360"/>
+      </w:pPr>
+      <w:rPr>
+        <w:rFonts w:ascii="Courier New" w:hAnsi="Courier New" w:cs="Courier New" w:hint="default"/>
+      </w:rPr>
+    </w:lvl>
+    <w:lvl w:ilvl="8" w:tplc="04190005" w:tentative="1">
+      <w:start w:val="1"/>
+      <w:numFmt w:val="bullet"/>
+      <w:lvlText w:val=""/>
+      <w:lvlJc w:val="left"/>
+      <w:pPr>
+        <w:ind w:left="6855" w:hanging="360"/>
+      </w:pPr>
+      <w:rPr>
+        <w:rFonts w:ascii="Wingdings" w:hAnsi="Wingdings" w:hint="default"/>
+      </w:rPr>
+    </w:lvl>
+  </w:abstractNum>
+  <w:abstractNum w:abstractNumId="1">
     <w:nsid w:val="043814C7"/>
     <w:multiLevelType w:val="hybridMultilevel"/>
     <w:tmpl w:val="BB181584"/>
@@ -7962,7 +9150,7 @@
       </w:rPr>
     </w:lvl>
   </w:abstractNum>
-  <w:abstractNum w:abstractNumId="1">
+  <w:abstractNum w:abstractNumId="2">
     <w:nsid w:val="09523362"/>
     <w:multiLevelType w:val="hybridMultilevel"/>
     <w:tmpl w:val="0C2C725C"/>
@@ -8075,7 +9263,7 @@
       </w:rPr>
     </w:lvl>
   </w:abstractNum>
-  <w:abstractNum w:abstractNumId="2">
+  <w:abstractNum w:abstractNumId="3">
     <w:nsid w:val="19B03DDD"/>
     <w:multiLevelType w:val="hybridMultilevel"/>
     <w:tmpl w:val="E5908A6C"/>
@@ -8164,7 +9352,7 @@
       </w:pPr>
     </w:lvl>
   </w:abstractNum>
-  <w:abstractNum w:abstractNumId="3">
+  <w:abstractNum w:abstractNumId="4">
     <w:nsid w:val="28754DF4"/>
     <w:multiLevelType w:val="multilevel"/>
     <w:tmpl w:val="B1B031CC"/>
@@ -8277,7 +9465,7 @@
       </w:rPr>
     </w:lvl>
   </w:abstractNum>
-  <w:abstractNum w:abstractNumId="4">
+  <w:abstractNum w:abstractNumId="5">
     <w:nsid w:val="38264A56"/>
     <w:multiLevelType w:val="hybridMultilevel"/>
     <w:tmpl w:val="28BE77EC"/>
@@ -8390,7 +9578,7 @@
       </w:rPr>
     </w:lvl>
   </w:abstractNum>
-  <w:abstractNum w:abstractNumId="5">
+  <w:abstractNum w:abstractNumId="6">
     <w:nsid w:val="39984571"/>
     <w:multiLevelType w:val="hybridMultilevel"/>
     <w:tmpl w:val="A5703A46"/>
@@ -8476,7 +9664,7 @@
       </w:pPr>
     </w:lvl>
   </w:abstractNum>
-  <w:abstractNum w:abstractNumId="6">
+  <w:abstractNum w:abstractNumId="7">
     <w:nsid w:val="42F03D9E"/>
     <w:multiLevelType w:val="multilevel"/>
     <w:tmpl w:val="33C6B4B8"/>
@@ -8589,7 +9777,7 @@
       </w:rPr>
     </w:lvl>
   </w:abstractNum>
-  <w:abstractNum w:abstractNumId="7">
+  <w:abstractNum w:abstractNumId="8">
     <w:nsid w:val="4ACE7793"/>
     <w:multiLevelType w:val="multilevel"/>
     <w:tmpl w:val="1C58C59A"/>
@@ -8710,7 +9898,7 @@
       </w:rPr>
     </w:lvl>
   </w:abstractNum>
-  <w:abstractNum w:abstractNumId="8">
+  <w:abstractNum w:abstractNumId="9">
     <w:nsid w:val="5139308F"/>
     <w:multiLevelType w:val="hybridMultilevel"/>
     <w:tmpl w:val="BE705FDE"/>
@@ -8799,7 +9987,120 @@
       </w:pPr>
     </w:lvl>
   </w:abstractNum>
-  <w:abstractNum w:abstractNumId="9">
+  <w:abstractNum w:abstractNumId="10">
+    <w:nsid w:val="5BC449E3"/>
+    <w:multiLevelType w:val="hybridMultilevel"/>
+    <w:tmpl w:val="A002E316"/>
+    <w:lvl w:ilvl="0" w:tplc="04190001">
+      <w:start w:val="1"/>
+      <w:numFmt w:val="bullet"/>
+      <w:lvlText w:val=""/>
+      <w:lvlJc w:val="left"/>
+      <w:pPr>
+        <w:ind w:left="720" w:hanging="360"/>
+      </w:pPr>
+      <w:rPr>
+        <w:rFonts w:ascii="Symbol" w:hAnsi="Symbol" w:hint="default"/>
+      </w:rPr>
+    </w:lvl>
+    <w:lvl w:ilvl="1" w:tplc="04190003" w:tentative="1">
+      <w:start w:val="1"/>
+      <w:numFmt w:val="bullet"/>
+      <w:lvlText w:val="o"/>
+      <w:lvlJc w:val="left"/>
+      <w:pPr>
+        <w:ind w:left="1440" w:hanging="360"/>
+      </w:pPr>
+      <w:rPr>
+        <w:rFonts w:ascii="Courier New" w:hAnsi="Courier New" w:cs="Courier New" w:hint="default"/>
+      </w:rPr>
+    </w:lvl>
+    <w:lvl w:ilvl="2" w:tplc="04190005" w:tentative="1">
+      <w:start w:val="1"/>
+      <w:numFmt w:val="bullet"/>
+      <w:lvlText w:val=""/>
+      <w:lvlJc w:val="left"/>
+      <w:pPr>
+        <w:ind w:left="2160" w:hanging="360"/>
+      </w:pPr>
+      <w:rPr>
+        <w:rFonts w:ascii="Wingdings" w:hAnsi="Wingdings" w:hint="default"/>
+      </w:rPr>
+    </w:lvl>
+    <w:lvl w:ilvl="3" w:tplc="04190001" w:tentative="1">
+      <w:start w:val="1"/>
+      <w:numFmt w:val="bullet"/>
+      <w:lvlText w:val=""/>
+      <w:lvlJc w:val="left"/>
+      <w:pPr>
+        <w:ind w:left="2880" w:hanging="360"/>
+      </w:pPr>
+      <w:rPr>
+        <w:rFonts w:ascii="Symbol" w:hAnsi="Symbol" w:hint="default"/>
+      </w:rPr>
+    </w:lvl>
+    <w:lvl w:ilvl="4" w:tplc="04190003" w:tentative="1">
+      <w:start w:val="1"/>
+      <w:numFmt w:val="bullet"/>
+      <w:lvlText w:val="o"/>
+      <w:lvlJc w:val="left"/>
+      <w:pPr>
+        <w:ind w:left="3600" w:hanging="360"/>
+      </w:pPr>
+      <w:rPr>
+        <w:rFonts w:ascii="Courier New" w:hAnsi="Courier New" w:cs="Courier New" w:hint="default"/>
+      </w:rPr>
+    </w:lvl>
+    <w:lvl w:ilvl="5" w:tplc="04190005" w:tentative="1">
+      <w:start w:val="1"/>
+      <w:numFmt w:val="bullet"/>
+      <w:lvlText w:val=""/>
+      <w:lvlJc w:val="left"/>
+      <w:pPr>
+        <w:ind w:left="4320" w:hanging="360"/>
+      </w:pPr>
+      <w:rPr>
+        <w:rFonts w:ascii="Wingdings" w:hAnsi="Wingdings" w:hint="default"/>
+      </w:rPr>
+    </w:lvl>
+    <w:lvl w:ilvl="6" w:tplc="04190001" w:tentative="1">
+      <w:start w:val="1"/>
+      <w:numFmt w:val="bullet"/>
+      <w:lvlText w:val=""/>
+      <w:lvlJc w:val="left"/>
+      <w:pPr>
+        <w:ind w:left="5040" w:hanging="360"/>
+      </w:pPr>
+      <w:rPr>
+        <w:rFonts w:ascii="Symbol" w:hAnsi="Symbol" w:hint="default"/>
+      </w:rPr>
+    </w:lvl>
+    <w:lvl w:ilvl="7" w:tplc="04190003" w:tentative="1">
+      <w:start w:val="1"/>
+      <w:numFmt w:val="bullet"/>
+      <w:lvlText w:val="o"/>
+      <w:lvlJc w:val="left"/>
+      <w:pPr>
+        <w:ind w:left="5760" w:hanging="360"/>
+      </w:pPr>
+      <w:rPr>
+        <w:rFonts w:ascii="Courier New" w:hAnsi="Courier New" w:cs="Courier New" w:hint="default"/>
+      </w:rPr>
+    </w:lvl>
+    <w:lvl w:ilvl="8" w:tplc="04190005" w:tentative="1">
+      <w:start w:val="1"/>
+      <w:numFmt w:val="bullet"/>
+      <w:lvlText w:val=""/>
+      <w:lvlJc w:val="left"/>
+      <w:pPr>
+        <w:ind w:left="6480" w:hanging="360"/>
+      </w:pPr>
+      <w:rPr>
+        <w:rFonts w:ascii="Wingdings" w:hAnsi="Wingdings" w:hint="default"/>
+      </w:rPr>
+    </w:lvl>
+  </w:abstractNum>
+  <w:abstractNum w:abstractNumId="11">
     <w:nsid w:val="61DA3710"/>
     <w:multiLevelType w:val="multilevel"/>
     <w:tmpl w:val="74E88560"/>
@@ -8920,7 +10221,7 @@
       </w:rPr>
     </w:lvl>
   </w:abstractNum>
-  <w:abstractNum w:abstractNumId="10">
+  <w:abstractNum w:abstractNumId="12">
     <w:nsid w:val="711A5288"/>
     <w:multiLevelType w:val="hybridMultilevel"/>
     <w:tmpl w:val="F48AD63C"/>
@@ -9033,7 +10334,7 @@
       </w:rPr>
     </w:lvl>
   </w:abstractNum>
-  <w:abstractNum w:abstractNumId="11">
+  <w:abstractNum w:abstractNumId="13">
     <w:nsid w:val="7D822E5A"/>
     <w:multiLevelType w:val="multilevel"/>
     <w:tmpl w:val="DD64DE1C"/>
@@ -9146,7 +10447,7 @@
       </w:rPr>
     </w:lvl>
   </w:abstractNum>
-  <w:abstractNum w:abstractNumId="12">
+  <w:abstractNum w:abstractNumId="14">
     <w:nsid w:val="7DE92BC9"/>
     <w:multiLevelType w:val="multilevel"/>
     <w:tmpl w:val="FCC6D516"/>
@@ -9259,44 +10560,166 @@
       </w:rPr>
     </w:lvl>
   </w:abstractNum>
+  <w:abstractNum w:abstractNumId="15">
+    <w:nsid w:val="7F6C2DFF"/>
+    <w:multiLevelType w:val="hybridMultilevel"/>
+    <w:tmpl w:val="AF3E9080"/>
+    <w:lvl w:ilvl="0" w:tplc="04190001">
+      <w:start w:val="1"/>
+      <w:numFmt w:val="bullet"/>
+      <w:lvlText w:val=""/>
+      <w:lvlJc w:val="left"/>
+      <w:pPr>
+        <w:ind w:left="1095" w:hanging="360"/>
+      </w:pPr>
+      <w:rPr>
+        <w:rFonts w:ascii="Symbol" w:hAnsi="Symbol" w:hint="default"/>
+      </w:rPr>
+    </w:lvl>
+    <w:lvl w:ilvl="1" w:tplc="04190003" w:tentative="1">
+      <w:start w:val="1"/>
+      <w:numFmt w:val="bullet"/>
+      <w:lvlText w:val="o"/>
+      <w:lvlJc w:val="left"/>
+      <w:pPr>
+        <w:ind w:left="1815" w:hanging="360"/>
+      </w:pPr>
+      <w:rPr>
+        <w:rFonts w:ascii="Courier New" w:hAnsi="Courier New" w:cs="Courier New" w:hint="default"/>
+      </w:rPr>
+    </w:lvl>
+    <w:lvl w:ilvl="2" w:tplc="04190005" w:tentative="1">
+      <w:start w:val="1"/>
+      <w:numFmt w:val="bullet"/>
+      <w:lvlText w:val=""/>
+      <w:lvlJc w:val="left"/>
+      <w:pPr>
+        <w:ind w:left="2535" w:hanging="360"/>
+      </w:pPr>
+      <w:rPr>
+        <w:rFonts w:ascii="Wingdings" w:hAnsi="Wingdings" w:hint="default"/>
+      </w:rPr>
+    </w:lvl>
+    <w:lvl w:ilvl="3" w:tplc="04190001" w:tentative="1">
+      <w:start w:val="1"/>
+      <w:numFmt w:val="bullet"/>
+      <w:lvlText w:val=""/>
+      <w:lvlJc w:val="left"/>
+      <w:pPr>
+        <w:ind w:left="3255" w:hanging="360"/>
+      </w:pPr>
+      <w:rPr>
+        <w:rFonts w:ascii="Symbol" w:hAnsi="Symbol" w:hint="default"/>
+      </w:rPr>
+    </w:lvl>
+    <w:lvl w:ilvl="4" w:tplc="04190003" w:tentative="1">
+      <w:start w:val="1"/>
+      <w:numFmt w:val="bullet"/>
+      <w:lvlText w:val="o"/>
+      <w:lvlJc w:val="left"/>
+      <w:pPr>
+        <w:ind w:left="3975" w:hanging="360"/>
+      </w:pPr>
+      <w:rPr>
+        <w:rFonts w:ascii="Courier New" w:hAnsi="Courier New" w:cs="Courier New" w:hint="default"/>
+      </w:rPr>
+    </w:lvl>
+    <w:lvl w:ilvl="5" w:tplc="04190005" w:tentative="1">
+      <w:start w:val="1"/>
+      <w:numFmt w:val="bullet"/>
+      <w:lvlText w:val=""/>
+      <w:lvlJc w:val="left"/>
+      <w:pPr>
+        <w:ind w:left="4695" w:hanging="360"/>
+      </w:pPr>
+      <w:rPr>
+        <w:rFonts w:ascii="Wingdings" w:hAnsi="Wingdings" w:hint="default"/>
+      </w:rPr>
+    </w:lvl>
+    <w:lvl w:ilvl="6" w:tplc="04190001" w:tentative="1">
+      <w:start w:val="1"/>
+      <w:numFmt w:val="bullet"/>
+      <w:lvlText w:val=""/>
+      <w:lvlJc w:val="left"/>
+      <w:pPr>
+        <w:ind w:left="5415" w:hanging="360"/>
+      </w:pPr>
+      <w:rPr>
+        <w:rFonts w:ascii="Symbol" w:hAnsi="Symbol" w:hint="default"/>
+      </w:rPr>
+    </w:lvl>
+    <w:lvl w:ilvl="7" w:tplc="04190003" w:tentative="1">
+      <w:start w:val="1"/>
+      <w:numFmt w:val="bullet"/>
+      <w:lvlText w:val="o"/>
+      <w:lvlJc w:val="left"/>
+      <w:pPr>
+        <w:ind w:left="6135" w:hanging="360"/>
+      </w:pPr>
+      <w:rPr>
+        <w:rFonts w:ascii="Courier New" w:hAnsi="Courier New" w:cs="Courier New" w:hint="default"/>
+      </w:rPr>
+    </w:lvl>
+    <w:lvl w:ilvl="8" w:tplc="04190005" w:tentative="1">
+      <w:start w:val="1"/>
+      <w:numFmt w:val="bullet"/>
+      <w:lvlText w:val=""/>
+      <w:lvlJc w:val="left"/>
+      <w:pPr>
+        <w:ind w:left="6855" w:hanging="360"/>
+      </w:pPr>
+      <w:rPr>
+        <w:rFonts w:ascii="Wingdings" w:hAnsi="Wingdings" w:hint="default"/>
+      </w:rPr>
+    </w:lvl>
+  </w:abstractNum>
   <w:num w:numId="1">
+    <w:abstractNumId w:val="5"/>
+  </w:num>
+  <w:num w:numId="2">
+    <w:abstractNumId w:val="3"/>
+  </w:num>
+  <w:num w:numId="3">
+    <w:abstractNumId w:val="12"/>
+  </w:num>
+  <w:num w:numId="4">
+    <w:abstractNumId w:val="1"/>
+  </w:num>
+  <w:num w:numId="5">
+    <w:abstractNumId w:val="6"/>
+  </w:num>
+  <w:num w:numId="6">
+    <w:abstractNumId w:val="11"/>
+  </w:num>
+  <w:num w:numId="7">
+    <w:abstractNumId w:val="7"/>
+  </w:num>
+  <w:num w:numId="8">
+    <w:abstractNumId w:val="9"/>
+  </w:num>
+  <w:num w:numId="9">
+    <w:abstractNumId w:val="8"/>
+  </w:num>
+  <w:num w:numId="10">
+    <w:abstractNumId w:val="14"/>
+  </w:num>
+  <w:num w:numId="11">
+    <w:abstractNumId w:val="13"/>
+  </w:num>
+  <w:num w:numId="12">
     <w:abstractNumId w:val="4"/>
   </w:num>
-  <w:num w:numId="2">
+  <w:num w:numId="13">
     <w:abstractNumId w:val="2"/>
   </w:num>
-  <w:num w:numId="3">
+  <w:num w:numId="14">
+    <w:abstractNumId w:val="15"/>
+  </w:num>
+  <w:num w:numId="15">
     <w:abstractNumId w:val="10"/>
   </w:num>
-  <w:num w:numId="4">
+  <w:num w:numId="16">
     <w:abstractNumId w:val="0"/>
-  </w:num>
-  <w:num w:numId="5">
-    <w:abstractNumId w:val="5"/>
-  </w:num>
-  <w:num w:numId="6">
-    <w:abstractNumId w:val="9"/>
-  </w:num>
-  <w:num w:numId="7">
-    <w:abstractNumId w:val="6"/>
-  </w:num>
-  <w:num w:numId="8">
-    <w:abstractNumId w:val="8"/>
-  </w:num>
-  <w:num w:numId="9">
-    <w:abstractNumId w:val="7"/>
-  </w:num>
-  <w:num w:numId="10">
-    <w:abstractNumId w:val="12"/>
-  </w:num>
-  <w:num w:numId="11">
-    <w:abstractNumId w:val="11"/>
-  </w:num>
-  <w:num w:numId="12">
-    <w:abstractNumId w:val="3"/>
-  </w:num>
-  <w:num w:numId="13">
-    <w:abstractNumId w:val="1"/>
   </w:num>
 </w:numbering>
 </file>
@@ -9716,6 +11139,29 @@
       <w:szCs w:val="32"/>
     </w:rPr>
   </w:style>
+  <w:style w:type="paragraph" w:styleId="2">
+    <w:name w:val="heading 2"/>
+    <w:basedOn w:val="a"/>
+    <w:next w:val="a"/>
+    <w:link w:val="20"/>
+    <w:uiPriority w:val="9"/>
+    <w:semiHidden/>
+    <w:unhideWhenUsed/>
+    <w:qFormat/>
+    <w:rsid w:val="000F4304"/>
+    <w:pPr>
+      <w:keepNext/>
+      <w:keepLines/>
+      <w:spacing w:before="40" w:after="0"/>
+      <w:outlineLvl w:val="1"/>
+    </w:pPr>
+    <w:rPr>
+      <w:rFonts w:asciiTheme="majorHAnsi" w:eastAsiaTheme="majorEastAsia" w:hAnsiTheme="majorHAnsi" w:cstheme="majorBidi"/>
+      <w:color w:val="2E74B5" w:themeColor="accent1" w:themeShade="BF"/>
+      <w:sz w:val="26"/>
+      <w:szCs w:val="26"/>
+    </w:rPr>
+  </w:style>
   <w:style w:type="paragraph" w:styleId="3">
     <w:name w:val="heading 3"/>
     <w:basedOn w:val="a"/>
@@ -9966,7 +11412,7 @@
     <w:basedOn w:val="a0"/>
     <w:rsid w:val="00E42B39"/>
   </w:style>
-  <w:style w:type="paragraph" w:styleId="2">
+  <w:style w:type="paragraph" w:styleId="21">
     <w:name w:val="toc 2"/>
     <w:basedOn w:val="a"/>
     <w:next w:val="a"/>
@@ -10116,6 +11562,20 @@
       <w:szCs w:val="20"/>
     </w:rPr>
   </w:style>
+  <w:style w:type="character" w:customStyle="1" w:styleId="20">
+    <w:name w:val="Заголовок 2 Знак"/>
+    <w:basedOn w:val="a0"/>
+    <w:link w:val="2"/>
+    <w:uiPriority w:val="9"/>
+    <w:semiHidden/>
+    <w:rsid w:val="000F4304"/>
+    <w:rPr>
+      <w:rFonts w:asciiTheme="majorHAnsi" w:eastAsiaTheme="majorEastAsia" w:hAnsiTheme="majorHAnsi" w:cstheme="majorBidi"/>
+      <w:color w:val="2E74B5" w:themeColor="accent1" w:themeShade="BF"/>
+      <w:sz w:val="26"/>
+      <w:szCs w:val="26"/>
+    </w:rPr>
+  </w:style>
 </w:styles>
 </file>
 
@@ -10124,10 +11584,10 @@
   <a:themeElements>
     <a:clrScheme name="Стандартная">
       <a:dk1>
-        <a:sysClr val="windowText" lastClr="000000"/>
+        <a:sysClr val="windowText" lastClr="494949"/>
       </a:dk1>
       <a:lt1>
-        <a:sysClr val="window" lastClr="FFFFFF"/>
+        <a:sysClr val="window" lastClr="F2F2F3"/>
       </a:lt1>
       <a:dk2>
         <a:srgbClr val="44546A"/>
@@ -10385,7 +11845,7 @@
 </file>
 
 <file path=customXml/itemProps1.xml><?xml version="1.0" encoding="utf-8"?>
-<ds:datastoreItem xmlns:ds="http://schemas.openxmlformats.org/officeDocument/2006/customXml" ds:itemID="{112EB624-0863-4543-89C5-0AC640E02E61}">
+<ds:datastoreItem xmlns:ds="http://schemas.openxmlformats.org/officeDocument/2006/customXml" ds:itemID="{DD6790E0-EF2E-4954-9DC7-856EAF5D7DD5}">
   <ds:schemaRefs>
     <ds:schemaRef ds:uri="http://schemas.openxmlformats.org/officeDocument/2006/bibliography"/>
   </ds:schemaRefs>

</xml_diff>